<commit_message>
Publish INT1433 from source 59b7cec
</commit_message>
<xml_diff>
--- a/docs/INT1433_Khung-noi-dung.docx
+++ b/docs/INT1433_Khung-noi-dung.docx
@@ -15,7 +15,7 @@
         <w:rPr>
           <w:color w:val="BC2626"/>
         </w:rPr>
-        <w:t>Bản nội bộ để duyệt · sinh từ plan.yaml và glossary.yaml · 13/10/2026. Nhận xét bằng comment Word trực tiếp lên đoạn cần sửa.</w:t>
+        <w:t>Bản nội bộ để duyệt · sinh từ plan.yaml và glossary.yaml · 20/10/2026. Nhận xét bằng comment Word trực tiếp lên đoạn cần sửa.</w:t>
       </w:r>
     </w:p>
     <w:p>
@@ -39,7 +39,7 @@
         <w:pStyle w:val="ListBullet"/>
       </w:pPr>
       <w:r>
-        <w:t>Tên phần theo dạng “&lt;chặng&gt;: &lt;chi tiết&gt;” — chặng là nhóm phần trong chương, cũng là cột của slide lộ trình (ví dụ “TCP: kết nối giữa client và server”); phần áp dụng tổng hợp đặt tên “Bài toán ứng dụng: …”.</w:t>
+        <w:t>Tên phần theo dạng “&lt;nhóm&gt;: &lt;chi tiết&gt;” — nhóm là nhóm phần trong chương, cũng là cột của slide lộ trình (ví dụ “TCP: kết nối giữa client và server”); phần áp dụng tổng hợp đặt tên “Bài toán ứng dụng: …”.</w:t>
       </w:r>
     </w:p>
     <w:p>
@@ -771,7 +771,7 @@
                 <w:b/>
                 <w:sz w:val="19"/>
               </w:rPr>
-              <w:t>Chặng (số phần)</w:t>
+              <w:t>Nhóm (số phần)</w:t>
             </w:r>
           </w:p>
         </w:tc>
@@ -28900,7 +28900,7 @@
               <w:rPr>
                 <w:sz w:val="19"/>
               </w:rPr>
-              <w:t>trong phần này, tóm lại, điều quan trọng, không chỉ, hãy cùng, cùng tìm hiểu, cùng khám phá, khám phá, chắc chắn rằng, có thể nói rằng, cần lưu ý rằng, đóng vai</w:t>
+              <w:t>tóm lại, điều quan trọng, không chỉ, hãy cùng, nội dung trọng tâm, khám phá, chắc chắn rằng, có thể nói rằng, cần lưu ý rằng, đóng vai trò quan trọng, then chốt</w:t>
             </w:r>
           </w:p>
         </w:tc>
@@ -28914,6 +28914,60 @@
                 <w:sz w:val="19"/>
               </w:rPr>
               <w:t>Bỏ câu đệm; nói thẳng nội dung.</w:t>
+            </w:r>
+          </w:p>
+        </w:tc>
+      </w:tr>
+      <w:tr>
+        <w:tc>
+          <w:tcPr>
+            <w:tcW w:type="dxa" w:w="2160"/>
+          </w:tcPr>
+          <w:p>
+            <w:r>
+              <w:rPr>
+                <w:sz w:val="19"/>
+              </w:rPr>
+              <w:t>Gắn thời điểm, ngữ cảnh lớp học trực tiếp</w:t>
+            </w:r>
+          </w:p>
+        </w:tc>
+        <w:tc>
+          <w:tcPr>
+            <w:tcW w:type="dxa" w:w="2160"/>
+          </w:tcPr>
+          <w:p>
+            <w:r>
+              <w:rPr>
+                <w:sz w:val="19"/>
+              </w:rPr>
+              <w:t>cảnh báo</w:t>
+            </w:r>
+          </w:p>
+        </w:tc>
+        <w:tc>
+          <w:tcPr>
+            <w:tcW w:type="dxa" w:w="2160"/>
+          </w:tcPr>
+          <w:p>
+            <w:r>
+              <w:rPr>
+                <w:sz w:val="19"/>
+              </w:rPr>
+              <w:t>hôm nay, buổi học, tiết học, tiết này, tuần này, tuần sau</w:t>
+            </w:r>
+          </w:p>
+        </w:tc>
+        <w:tc>
+          <w:tcPr>
+            <w:tcW w:type="dxa" w:w="2160"/>
+          </w:tcPr>
+          <w:p>
+            <w:r>
+              <w:rPr>
+                <w:sz w:val="19"/>
+              </w:rPr>
+              <w:t>Bài giảng số xem lúc nào cũng được: nêu nội dung, không nêu thời điểm (Chương 2 bắt đầu…).</w:t>
             </w:r>
           </w:p>
         </w:tc>

</xml_diff>

<commit_message>
Publish INT1433 from source 244e809
</commit_message>
<xml_diff>
--- a/docs/INT1433_Khung-noi-dung.docx
+++ b/docs/INT1433_Khung-noi-dung.docx
@@ -15,7 +15,7 @@
         <w:rPr>
           <w:color w:val="BC2626"/>
         </w:rPr>
-        <w:t>Bản nội bộ để duyệt · sinh từ plan.yaml và glossary.yaml · 20/10/2026. Nhận xét bằng comment Word trực tiếp lên đoạn cần sửa.</w:t>
+        <w:t>Bản nội bộ để duyệt · sinh từ plan.yaml và glossary.yaml · 22/10/2026. Nhận xét bằng comment Word trực tiếp lên đoạn cần sửa.</w:t>
       </w:r>
     </w:p>
     <w:p>
@@ -5128,7 +5128,7 @@
         <w:t xml:space="preserve">Vấn đề: </w:t>
       </w:r>
       <w:r>
-        <w:t>Dữ liệu nhận qua mạng đến chương trình Java dưới dạng byte stream. Đọc sai contract của read() là nguồn lỗi phổ biến của chương trình mạng: mất dữ liệu, lặp dữ liệu hoặc chờ không kết thúc.</w:t>
+        <w:t>Dữ liệu nhận qua mạng đến chương trình Java dưới dạng byte stream. Đọc sai contract của read() hoặc ghi mà quên flush() là nguồn lỗi phổ biến của chương trình mạng: mất dữ liệu, lặp dữ liệu hoặc chờ không kết thúc.</w:t>
       </w:r>
     </w:p>
     <w:p>
@@ -5514,7 +5514,7 @@
         <w:t xml:space="preserve">Mở rộng — bài tập: </w:t>
       </w:r>
       <w:r>
-        <w:t>Thiết kế bản tin nhị phân cho yêu cầu tra cứu (mã lệnh 1 byte, độ dài 2 byte, khóa UTF-8) bằng DataOutputStream; viết hàm đọc tương ứng và kiểm thử ghi rồi đọc lại.</w:t>
+        <w:t>Thiết kế message nhị phân cho yêu cầu tra cứu (mã lệnh 1 byte, độ dài 2 byte, khóa UTF-8) bằng DataOutputStream; viết hàm đọc tương ứng và kiểm thử ghi rồi đọc lại.</w:t>
       </w:r>
     </w:p>
     <w:p>
@@ -5718,7 +5718,7 @@
         <w:t xml:space="preserve">Mở rộng — nâng cao: </w:t>
       </w:r>
       <w:r>
-        <w:t>Escape ký tự phân cách trong dữ liệu (như HTTP chunked, CSV); Định dạng TLV (type–length–value)</w:t>
+        <w:t>Escape ký tự phân cách trong dữ liệu (như trường có dấu phẩy trong CSV); Định dạng TLV (type–length–value)</w:t>
       </w:r>
     </w:p>
     <w:p>
@@ -13791,7 +13791,7 @@
               <w:rPr>
                 <w:sz w:val="19"/>
               </w:rPr>
-              <w:t>read(buf) trả từ 1 đến buf.length byte, hoặc −1 khi hết dữ liệu; một lần gọi không bảo đảm đọc đủ.</w:t>
+              <w:t>read(buf) chờ đến khi có dữ liệu, rồi trả từ 1 đến buf.length byte, hoặc −1 khi hết dữ liệu; một lần gọi không bảo đảm đọc đủ.</w:t>
             </w:r>
           </w:p>
         </w:tc>

</xml_diff>

<commit_message>
Publish INT1433 from source c5e8e05
</commit_message>
<xml_diff>
--- a/docs/INT1433_Khung-noi-dung.docx
+++ b/docs/INT1433_Khung-noi-dung.docx
@@ -15,7 +15,7 @@
         <w:rPr>
           <w:color w:val="BC2626"/>
         </w:rPr>
-        <w:t>Bản nội bộ để duyệt · sinh từ plan.yaml và glossary.yaml · 22/10/2026. Nhận xét bằng comment Word trực tiếp lên đoạn cần sửa.</w:t>
+        <w:t>Bản nội bộ để duyệt · sinh từ plan.yaml và glossary.yaml · 24/10/2026. Nhận xét bằng comment Word trực tiếp lên đoạn cần sửa.</w:t>
       </w:r>
     </w:p>
     <w:p>
@@ -6268,7 +6268,7 @@
         <w:t xml:space="preserve">Thuật ngữ: </w:t>
       </w:r>
       <w:r>
-        <w:t>SocketTimeoutException, setSoTimeout, shutdownOutput, connection reset</w:t>
+        <w:t>SocketTimeoutException, setSoTimeout, shutdownOutput, FIN, connection reset</w:t>
       </w:r>
     </w:p>
     <w:p>
@@ -6528,7 +6528,7 @@
         <w:t xml:space="preserve">Cơ chế: </w:t>
       </w:r>
       <w:r>
-        <w:t>Sơ đồ vòng lặp server tuần tự: accept → đọc một dòng → tra cứu → trả một dòng → đóng kết nối → accept tiếp. Hình một listening socket, nhiều connected socket lần lượt: mọi kết nối cùng local port 9199, phân biệt bằng 4-tuple (địa chỉ và port hai đầu). Hình integration test: test mở server ở 127.0.0.1 port 0, hệ điều hành cấp ephemeral port, test đọc lại số port rồi kết nối.</w:t>
+        <w:t>Sơ đồ vòng lặp server tuần tự: accept → (đọc một dòng → tra cứu → trả một dòng) lặp đến khi client đóng chiều gửi hoặc hết read timeout → đóng kết nối → accept tiếp; kết nối sau chờ trong backlog. Hình một listening socket, nhiều connected socket lần lượt: mọi kết nối cùng local port 9199, phân biệt bằng 4-tuple (địa chỉ và port hai đầu). Integration test (trên slide mã): test mở server ở 127.0.0.1 port 0, hệ điều hành cấp ephemeral port, test đọc lại số port rồi kết nối.</w:t>
       </w:r>
     </w:p>
     <w:p>
@@ -6598,7 +6598,7 @@
         <w:t xml:space="preserve">Mở rộng — nâng cao: </w:t>
       </w:r>
       <w:r>
-        <w:t>Giới hạn độ dài dòng và mã lỗi trong giao thức; Ghi log kèm endpoint hai đầu</w:t>
+        <w:t>Đọc dòng có giới hạn: dừng ở byte thứ 257 thay vì giữ cả dòng trong bộ nhớ; Integration test cho lỗi mạng: client đóng giữa chừng, kết nối bị reset</w:t>
       </w:r>
     </w:p>
     <w:p>
@@ -6922,7 +6922,7 @@
         <w:t xml:space="preserve">Thuật ngữ: </w:t>
       </w:r>
       <w:r>
-        <w:t>monitor, notifyAll, volatile, ConcurrentHashMap</w:t>
+        <w:t>monitor, notifyAll, volatile, ConcurrentHashMap, spurious wakeup</w:t>
       </w:r>
     </w:p>
     <w:p>
@@ -7140,7 +7140,7 @@
         <w:t xml:space="preserve">Thuật ngữ: </w:t>
       </w:r>
       <w:r>
-        <w:t>ExecutorService, ThreadPoolExecutor, Future, carrier thread</w:t>
+        <w:t>ExecutorService, ThreadPoolExecutor, Future, carrier thread, platform thread, AbortPolicy, CallerRunsPolicy</w:t>
       </w:r>
     </w:p>
     <w:p>
@@ -7358,7 +7358,7 @@
         <w:t xml:space="preserve">Thuật ngữ: </w:t>
       </w:r>
       <w:r>
-        <w:t>SocketException, awaitTermination</w:t>
+        <w:t>SocketException, awaitTermination, Semaphore</w:t>
       </w:r>
     </w:p>
     <w:p>
@@ -12384,7 +12384,7 @@
         <w:pStyle w:val="Heading1"/>
       </w:pPr>
       <w:r>
-        <w:t>5. Thuật ngữ chung (243 mục)</w:t>
+        <w:t>5. Thuật ngữ chung (246 mục)</w:t>
       </w:r>
     </w:p>
     <w:tbl>
@@ -16806,33 +16806,33 @@
               <w:rPr>
                 <w:sz w:val="19"/>
               </w:rPr>
-              <w:t>connection reset</w:t>
-            </w:r>
-          </w:p>
-        </w:tc>
-        <w:tc>
-          <w:tcPr>
-            <w:tcW w:type="dxa" w:w="1728"/>
-          </w:tcPr>
-          <w:p>
-            <w:r>
-              <w:rPr>
-                <w:sz w:val="19"/>
-              </w:rPr>
-              <w:t>kết nối bị hủy giữa chừng</w:t>
-            </w:r>
-          </w:p>
-        </w:tc>
-        <w:tc>
-          <w:tcPr>
-            <w:tcW w:type="dxa" w:w="1728"/>
-          </w:tcPr>
-          <w:p>
-            <w:r>
-              <w:rPr>
-                <w:sz w:val="19"/>
-              </w:rPr>
-              <w:t>Lỗi khi đầu kia gửi RST trên kết nối đang dùng; Java ném SocketException: Connection reset.</w:t>
+              <w:t>FIN</w:t>
+            </w:r>
+          </w:p>
+        </w:tc>
+        <w:tc>
+          <w:tcPr>
+            <w:tcW w:type="dxa" w:w="1728"/>
+          </w:tcPr>
+          <w:p>
+            <w:r>
+              <w:rPr>
+                <w:sz w:val="19"/>
+              </w:rPr>
+              <w:t>cờ kết thúc (finish)</w:t>
+            </w:r>
+          </w:p>
+        </w:tc>
+        <w:tc>
+          <w:tcPr>
+            <w:tcW w:type="dxa" w:w="1728"/>
+          </w:tcPr>
+          <w:p>
+            <w:r>
+              <w:rPr>
+                <w:sz w:val="19"/>
+              </w:rPr>
+              <w:t>Cờ trong header TCP báo bên gửi đã hết dữ liệu; gửi khi gọi shutdownOutput() hoặc close().</w:t>
             </w:r>
           </w:p>
         </w:tc>
@@ -16872,46 +16872,46 @@
               <w:rPr>
                 <w:sz w:val="19"/>
               </w:rPr>
-              <w:t>port 0</w:t>
-            </w:r>
-          </w:p>
-        </w:tc>
-        <w:tc>
-          <w:tcPr>
-            <w:tcW w:type="dxa" w:w="1728"/>
-          </w:tcPr>
-          <w:p>
-            <w:r>
-              <w:rPr>
-                <w:sz w:val="19"/>
-              </w:rPr>
-              <w:t>yêu cầu hệ điều hành cấp port trống</w:t>
-            </w:r>
-          </w:p>
-        </w:tc>
-        <w:tc>
-          <w:tcPr>
-            <w:tcW w:type="dxa" w:w="1728"/>
-          </w:tcPr>
-          <w:p>
-            <w:r>
-              <w:rPr>
-                <w:sz w:val="19"/>
-              </w:rPr>
-              <w:t>Giá trị port khi bind để hệ điều hành tự cấp một ephemeral port còn trống.</w:t>
-            </w:r>
-          </w:p>
-        </w:tc>
-        <w:tc>
-          <w:tcPr>
-            <w:tcW w:type="dxa" w:w="1728"/>
-          </w:tcPr>
-          <w:p>
-            <w:r>
-              <w:rPr>
-                <w:sz w:val="19"/>
-              </w:rPr>
-              <w:t>V10</w:t>
+              <w:t>connection reset</w:t>
+            </w:r>
+          </w:p>
+        </w:tc>
+        <w:tc>
+          <w:tcPr>
+            <w:tcW w:type="dxa" w:w="1728"/>
+          </w:tcPr>
+          <w:p>
+            <w:r>
+              <w:rPr>
+                <w:sz w:val="19"/>
+              </w:rPr>
+              <w:t>kết nối bị hủy giữa chừng</w:t>
+            </w:r>
+          </w:p>
+        </w:tc>
+        <w:tc>
+          <w:tcPr>
+            <w:tcW w:type="dxa" w:w="1728"/>
+          </w:tcPr>
+          <w:p>
+            <w:r>
+              <w:rPr>
+                <w:sz w:val="19"/>
+              </w:rPr>
+              <w:t>Lỗi khi đầu kia gửi RST trên kết nối đang dùng; Java ném SocketException: Connection reset.</w:t>
+            </w:r>
+          </w:p>
+        </w:tc>
+        <w:tc>
+          <w:tcPr>
+            <w:tcW w:type="dxa" w:w="1728"/>
+          </w:tcPr>
+          <w:p>
+            <w:r>
+              <w:rPr>
+                <w:sz w:val="19"/>
+              </w:rPr>
+              <w:t>V09</w:t>
             </w:r>
           </w:p>
         </w:tc>
@@ -16938,33 +16938,33 @@
               <w:rPr>
                 <w:sz w:val="19"/>
               </w:rPr>
-              <w:t>ephemeral port</w:t>
-            </w:r>
-          </w:p>
-        </w:tc>
-        <w:tc>
-          <w:tcPr>
-            <w:tcW w:type="dxa" w:w="1728"/>
-          </w:tcPr>
-          <w:p>
-            <w:r>
-              <w:rPr>
-                <w:sz w:val="19"/>
-              </w:rPr>
-              <w:t>port tạm do hệ điều hành cấp</w:t>
-            </w:r>
-          </w:p>
-        </w:tc>
-        <w:tc>
-          <w:tcPr>
-            <w:tcW w:type="dxa" w:w="1728"/>
-          </w:tcPr>
-          <w:p>
-            <w:r>
-              <w:rPr>
-                <w:sz w:val="19"/>
-              </w:rPr>
-              <w:t>Port tạm hệ điều hành cấp cho client hoặc khi bind port 0.</w:t>
+              <w:t>port 0</w:t>
+            </w:r>
+          </w:p>
+        </w:tc>
+        <w:tc>
+          <w:tcPr>
+            <w:tcW w:type="dxa" w:w="1728"/>
+          </w:tcPr>
+          <w:p>
+            <w:r>
+              <w:rPr>
+                <w:sz w:val="19"/>
+              </w:rPr>
+              <w:t>yêu cầu hệ điều hành cấp port trống</w:t>
+            </w:r>
+          </w:p>
+        </w:tc>
+        <w:tc>
+          <w:tcPr>
+            <w:tcW w:type="dxa" w:w="1728"/>
+          </w:tcPr>
+          <w:p>
+            <w:r>
+              <w:rPr>
+                <w:sz w:val="19"/>
+              </w:rPr>
+              <w:t>Giá trị port khi bind để hệ điều hành tự cấp một ephemeral port còn trống.</w:t>
             </w:r>
           </w:p>
         </w:tc>
@@ -17004,33 +17004,33 @@
               <w:rPr>
                 <w:sz w:val="19"/>
               </w:rPr>
-              <w:t>integration test</w:t>
-            </w:r>
-          </w:p>
-        </w:tc>
-        <w:tc>
-          <w:tcPr>
-            <w:tcW w:type="dxa" w:w="1728"/>
-          </w:tcPr>
-          <w:p>
-            <w:r>
-              <w:rPr>
-                <w:sz w:val="19"/>
-              </w:rPr>
-              <w:t>kiểm thử tích hợp</w:t>
-            </w:r>
-          </w:p>
-        </w:tc>
-        <w:tc>
-          <w:tcPr>
-            <w:tcW w:type="dxa" w:w="1728"/>
-          </w:tcPr>
-          <w:p>
-            <w:r>
-              <w:rPr>
-                <w:sz w:val="19"/>
-              </w:rPr>
-              <w:t>Kiểm thử chạy các thành phần thật cùng nhau (server và client qua kết nối thật).</w:t>
+              <w:t>ephemeral port</w:t>
+            </w:r>
+          </w:p>
+        </w:tc>
+        <w:tc>
+          <w:tcPr>
+            <w:tcW w:type="dxa" w:w="1728"/>
+          </w:tcPr>
+          <w:p>
+            <w:r>
+              <w:rPr>
+                <w:sz w:val="19"/>
+              </w:rPr>
+              <w:t>port tạm do hệ điều hành cấp</w:t>
+            </w:r>
+          </w:p>
+        </w:tc>
+        <w:tc>
+          <w:tcPr>
+            <w:tcW w:type="dxa" w:w="1728"/>
+          </w:tcPr>
+          <w:p>
+            <w:r>
+              <w:rPr>
+                <w:sz w:val="19"/>
+              </w:rPr>
+              <w:t>Port tạm hệ điều hành cấp cho client hoặc khi bind port 0.</w:t>
             </w:r>
           </w:p>
         </w:tc>
@@ -17070,33 +17070,33 @@
               <w:rPr>
                 <w:sz w:val="19"/>
               </w:rPr>
-              <w:t>JUnit</w:t>
-            </w:r>
-          </w:p>
-        </w:tc>
-        <w:tc>
-          <w:tcPr>
-            <w:tcW w:type="dxa" w:w="1728"/>
-          </w:tcPr>
-          <w:p>
-            <w:r>
-              <w:rPr>
-                <w:sz w:val="19"/>
-              </w:rPr>
-              <w:t>framework kiểm thử cho Java</w:t>
-            </w:r>
-          </w:p>
-        </w:tc>
-        <w:tc>
-          <w:tcPr>
-            <w:tcW w:type="dxa" w:w="1728"/>
-          </w:tcPr>
-          <w:p>
-            <w:r>
-              <w:rPr>
-                <w:sz w:val="19"/>
-              </w:rPr>
-              <w:t>Framework viết và chạy test tự động cho Java; dùng cho cả unit test và integration test.</w:t>
+              <w:t>integration test</w:t>
+            </w:r>
+          </w:p>
+        </w:tc>
+        <w:tc>
+          <w:tcPr>
+            <w:tcW w:type="dxa" w:w="1728"/>
+          </w:tcPr>
+          <w:p>
+            <w:r>
+              <w:rPr>
+                <w:sz w:val="19"/>
+              </w:rPr>
+              <w:t>kiểm thử tích hợp</w:t>
+            </w:r>
+          </w:p>
+        </w:tc>
+        <w:tc>
+          <w:tcPr>
+            <w:tcW w:type="dxa" w:w="1728"/>
+          </w:tcPr>
+          <w:p>
+            <w:r>
+              <w:rPr>
+                <w:sz w:val="19"/>
+              </w:rPr>
+              <w:t>Kiểm thử chạy các thành phần thật cùng nhau (server và client qua kết nối thật).</w:t>
             </w:r>
           </w:p>
         </w:tc>
@@ -17136,33 +17136,33 @@
               <w:rPr>
                 <w:sz w:val="19"/>
               </w:rPr>
-              <w:t>server tuần tự</w:t>
-            </w:r>
-          </w:p>
-        </w:tc>
-        <w:tc>
-          <w:tcPr>
-            <w:tcW w:type="dxa" w:w="1728"/>
-          </w:tcPr>
-          <w:p>
-            <w:r>
-              <w:rPr>
-                <w:sz w:val="19"/>
-              </w:rPr>
-              <w:t>iterative server</w:t>
-            </w:r>
-          </w:p>
-        </w:tc>
-        <w:tc>
-          <w:tcPr>
-            <w:tcW w:type="dxa" w:w="1728"/>
-          </w:tcPr>
-          <w:p>
-            <w:r>
-              <w:rPr>
-                <w:sz w:val="19"/>
-              </w:rPr>
-              <w:t>Server xử lý lần lượt từng kết nối, kết nối sau chờ đến khi kết nối trước xong.</w:t>
+              <w:t>JUnit</w:t>
+            </w:r>
+          </w:p>
+        </w:tc>
+        <w:tc>
+          <w:tcPr>
+            <w:tcW w:type="dxa" w:w="1728"/>
+          </w:tcPr>
+          <w:p>
+            <w:r>
+              <w:rPr>
+                <w:sz w:val="19"/>
+              </w:rPr>
+              <w:t>framework kiểm thử cho Java</w:t>
+            </w:r>
+          </w:p>
+        </w:tc>
+        <w:tc>
+          <w:tcPr>
+            <w:tcW w:type="dxa" w:w="1728"/>
+          </w:tcPr>
+          <w:p>
+            <w:r>
+              <w:rPr>
+                <w:sz w:val="19"/>
+              </w:rPr>
+              <w:t>Framework viết và chạy test tự động cho Java; dùng cho cả unit test và integration test.</w:t>
             </w:r>
           </w:p>
         </w:tc>
@@ -17202,33 +17202,33 @@
               <w:rPr>
                 <w:sz w:val="19"/>
               </w:rPr>
-              <w:t>4-tuple</w:t>
-            </w:r>
-          </w:p>
-        </w:tc>
-        <w:tc>
-          <w:tcPr>
-            <w:tcW w:type="dxa" w:w="1728"/>
-          </w:tcPr>
-          <w:p>
-            <w:r>
-              <w:rPr>
-                <w:sz w:val="19"/>
-              </w:rPr>
-              <w:t>bộ bốn giá trị định danh kết nối TCP</w:t>
-            </w:r>
-          </w:p>
-        </w:tc>
-        <w:tc>
-          <w:tcPr>
-            <w:tcW w:type="dxa" w:w="1728"/>
-          </w:tcPr>
-          <w:p>
-            <w:r>
-              <w:rPr>
-                <w:sz w:val="19"/>
-              </w:rPr>
-              <w:t>Địa chỉ và port của hai đầu; hai kết nối không thể trùng cả bốn giá trị.</w:t>
+              <w:t>server tuần tự</w:t>
+            </w:r>
+          </w:p>
+        </w:tc>
+        <w:tc>
+          <w:tcPr>
+            <w:tcW w:type="dxa" w:w="1728"/>
+          </w:tcPr>
+          <w:p>
+            <w:r>
+              <w:rPr>
+                <w:sz w:val="19"/>
+              </w:rPr>
+              <w:t>iterative server</w:t>
+            </w:r>
+          </w:p>
+        </w:tc>
+        <w:tc>
+          <w:tcPr>
+            <w:tcW w:type="dxa" w:w="1728"/>
+          </w:tcPr>
+          <w:p>
+            <w:r>
+              <w:rPr>
+                <w:sz w:val="19"/>
+              </w:rPr>
+              <w:t>Server xử lý lần lượt từng kết nối, kết nối sau chờ đến khi kết nối trước xong.</w:t>
             </w:r>
           </w:p>
         </w:tc>
@@ -17268,46 +17268,46 @@
               <w:rPr>
                 <w:sz w:val="19"/>
               </w:rPr>
-              <w:t>thread</w:t>
-            </w:r>
-          </w:p>
-        </w:tc>
-        <w:tc>
-          <w:tcPr>
-            <w:tcW w:type="dxa" w:w="1728"/>
-          </w:tcPr>
-          <w:p>
-            <w:r>
-              <w:rPr>
-                <w:sz w:val="19"/>
-              </w:rPr>
-              <w:t>luồng thực thi trong một tiến trình</w:t>
-            </w:r>
-          </w:p>
-        </w:tc>
-        <w:tc>
-          <w:tcPr>
-            <w:tcW w:type="dxa" w:w="1728"/>
-          </w:tcPr>
-          <w:p>
-            <w:r>
-              <w:rPr>
-                <w:sz w:val="19"/>
-              </w:rPr>
-              <w:t>Đơn vị thực thi trong tiến trình, có stack riêng và dùng chung heap với các thread khác.</w:t>
-            </w:r>
-          </w:p>
-        </w:tc>
-        <w:tc>
-          <w:tcPr>
-            <w:tcW w:type="dxa" w:w="1728"/>
-          </w:tcPr>
-          <w:p>
-            <w:r>
-              <w:rPr>
-                <w:sz w:val="19"/>
-              </w:rPr>
-              <w:t>V11</w:t>
+              <w:t>4-tuple</w:t>
+            </w:r>
+          </w:p>
+        </w:tc>
+        <w:tc>
+          <w:tcPr>
+            <w:tcW w:type="dxa" w:w="1728"/>
+          </w:tcPr>
+          <w:p>
+            <w:r>
+              <w:rPr>
+                <w:sz w:val="19"/>
+              </w:rPr>
+              <w:t>bộ bốn giá trị định danh kết nối TCP</w:t>
+            </w:r>
+          </w:p>
+        </w:tc>
+        <w:tc>
+          <w:tcPr>
+            <w:tcW w:type="dxa" w:w="1728"/>
+          </w:tcPr>
+          <w:p>
+            <w:r>
+              <w:rPr>
+                <w:sz w:val="19"/>
+              </w:rPr>
+              <w:t>Địa chỉ và port của hai đầu; hai kết nối không thể trùng cả bốn giá trị.</w:t>
+            </w:r>
+          </w:p>
+        </w:tc>
+        <w:tc>
+          <w:tcPr>
+            <w:tcW w:type="dxa" w:w="1728"/>
+          </w:tcPr>
+          <w:p>
+            <w:r>
+              <w:rPr>
+                <w:sz w:val="19"/>
+              </w:rPr>
+              <w:t>V10</w:t>
             </w:r>
           </w:p>
         </w:tc>
@@ -17334,33 +17334,33 @@
               <w:rPr>
                 <w:sz w:val="19"/>
               </w:rPr>
-              <w:t>tác vụ</w:t>
-            </w:r>
-          </w:p>
-        </w:tc>
-        <w:tc>
-          <w:tcPr>
-            <w:tcW w:type="dxa" w:w="1728"/>
-          </w:tcPr>
-          <w:p>
-            <w:r>
-              <w:rPr>
-                <w:sz w:val="19"/>
-              </w:rPr>
-              <w:t>task</w:t>
-            </w:r>
-          </w:p>
-        </w:tc>
-        <w:tc>
-          <w:tcPr>
-            <w:tcW w:type="dxa" w:w="1728"/>
-          </w:tcPr>
-          <w:p>
-            <w:r>
-              <w:rPr>
-                <w:sz w:val="19"/>
-              </w:rPr>
-              <w:t>Một đơn vị công việc (Runnable, Callable) được giao cho thread hoặc executor chạy.</w:t>
+              <w:t>thread</w:t>
+            </w:r>
+          </w:p>
+        </w:tc>
+        <w:tc>
+          <w:tcPr>
+            <w:tcW w:type="dxa" w:w="1728"/>
+          </w:tcPr>
+          <w:p>
+            <w:r>
+              <w:rPr>
+                <w:sz w:val="19"/>
+              </w:rPr>
+              <w:t>luồng thực thi trong một tiến trình</w:t>
+            </w:r>
+          </w:p>
+        </w:tc>
+        <w:tc>
+          <w:tcPr>
+            <w:tcW w:type="dxa" w:w="1728"/>
+          </w:tcPr>
+          <w:p>
+            <w:r>
+              <w:rPr>
+                <w:sz w:val="19"/>
+              </w:rPr>
+              <w:t>Đơn vị thực thi trong tiến trình, có stack riêng và dùng chung heap với các thread khác.</w:t>
             </w:r>
           </w:p>
         </w:tc>
@@ -17400,33 +17400,33 @@
               <w:rPr>
                 <w:sz w:val="19"/>
               </w:rPr>
-              <w:t>Runnable</w:t>
-            </w:r>
-          </w:p>
-        </w:tc>
-        <w:tc>
-          <w:tcPr>
-            <w:tcW w:type="dxa" w:w="1728"/>
-          </w:tcPr>
-          <w:p>
-            <w:r>
-              <w:rPr>
-                <w:sz w:val="19"/>
-              </w:rPr>
-              <w:t>interface của một tác vụ không trả kết quả</w:t>
-            </w:r>
-          </w:p>
-        </w:tc>
-        <w:tc>
-          <w:tcPr>
-            <w:tcW w:type="dxa" w:w="1728"/>
-          </w:tcPr>
-          <w:p>
-            <w:r>
-              <w:rPr>
-                <w:sz w:val="19"/>
-              </w:rPr>
-              <w:t>Interface có phương thức run(); dùng để mô tả tác vụ cho thread hoặc executor.</w:t>
+              <w:t>tác vụ</w:t>
+            </w:r>
+          </w:p>
+        </w:tc>
+        <w:tc>
+          <w:tcPr>
+            <w:tcW w:type="dxa" w:w="1728"/>
+          </w:tcPr>
+          <w:p>
+            <w:r>
+              <w:rPr>
+                <w:sz w:val="19"/>
+              </w:rPr>
+              <w:t>task</w:t>
+            </w:r>
+          </w:p>
+        </w:tc>
+        <w:tc>
+          <w:tcPr>
+            <w:tcW w:type="dxa" w:w="1728"/>
+          </w:tcPr>
+          <w:p>
+            <w:r>
+              <w:rPr>
+                <w:sz w:val="19"/>
+              </w:rPr>
+              <w:t>Một đơn vị công việc (Runnable, Callable) được giao cho thread hoặc executor chạy.</w:t>
             </w:r>
           </w:p>
         </w:tc>
@@ -17466,33 +17466,33 @@
               <w:rPr>
                 <w:sz w:val="19"/>
               </w:rPr>
-              <w:t>interrupt</w:t>
-            </w:r>
-          </w:p>
-        </w:tc>
-        <w:tc>
-          <w:tcPr>
-            <w:tcW w:type="dxa" w:w="1728"/>
-          </w:tcPr>
-          <w:p>
-            <w:r>
-              <w:rPr>
-                <w:sz w:val="19"/>
-              </w:rPr>
-              <w:t>yêu cầu thread dừng</w:t>
-            </w:r>
-          </w:p>
-        </w:tc>
-        <w:tc>
-          <w:tcPr>
-            <w:tcW w:type="dxa" w:w="1728"/>
-          </w:tcPr>
-          <w:p>
-            <w:r>
-              <w:rPr>
-                <w:sz w:val="19"/>
-              </w:rPr>
-              <w:t>Cơ chế báo cho thread biết cần dừng; thread đang chờ nhận InterruptedException.</w:t>
+              <w:t>Runnable</w:t>
+            </w:r>
+          </w:p>
+        </w:tc>
+        <w:tc>
+          <w:tcPr>
+            <w:tcW w:type="dxa" w:w="1728"/>
+          </w:tcPr>
+          <w:p>
+            <w:r>
+              <w:rPr>
+                <w:sz w:val="19"/>
+              </w:rPr>
+              <w:t>interface của một tác vụ không trả kết quả</w:t>
+            </w:r>
+          </w:p>
+        </w:tc>
+        <w:tc>
+          <w:tcPr>
+            <w:tcW w:type="dxa" w:w="1728"/>
+          </w:tcPr>
+          <w:p>
+            <w:r>
+              <w:rPr>
+                <w:sz w:val="19"/>
+              </w:rPr>
+              <w:t>Interface có phương thức run(); dùng để mô tả tác vụ cho thread hoặc executor.</w:t>
             </w:r>
           </w:p>
         </w:tc>
@@ -17532,33 +17532,33 @@
               <w:rPr>
                 <w:sz w:val="19"/>
               </w:rPr>
-              <w:t>race condition</w:t>
-            </w:r>
-          </w:p>
-        </w:tc>
-        <w:tc>
-          <w:tcPr>
-            <w:tcW w:type="dxa" w:w="1728"/>
-          </w:tcPr>
-          <w:p>
-            <w:r>
-              <w:rPr>
-                <w:sz w:val="19"/>
-              </w:rPr>
-              <w:t>kết quả phụ thuộc thứ tự chạy của các thread</w:t>
-            </w:r>
-          </w:p>
-        </w:tc>
-        <w:tc>
-          <w:tcPr>
-            <w:tcW w:type="dxa" w:w="1728"/>
-          </w:tcPr>
-          <w:p>
-            <w:r>
-              <w:rPr>
-                <w:sz w:val="19"/>
-              </w:rPr>
-              <w:t>Lỗi khi nhiều thread truy cập dữ liệu dùng chung không đồng bộ và kết quả phụ thuộc thứ tự chạy.</w:t>
+              <w:t>interrupt</w:t>
+            </w:r>
+          </w:p>
+        </w:tc>
+        <w:tc>
+          <w:tcPr>
+            <w:tcW w:type="dxa" w:w="1728"/>
+          </w:tcPr>
+          <w:p>
+            <w:r>
+              <w:rPr>
+                <w:sz w:val="19"/>
+              </w:rPr>
+              <w:t>yêu cầu thread dừng</w:t>
+            </w:r>
+          </w:p>
+        </w:tc>
+        <w:tc>
+          <w:tcPr>
+            <w:tcW w:type="dxa" w:w="1728"/>
+          </w:tcPr>
+          <w:p>
+            <w:r>
+              <w:rPr>
+                <w:sz w:val="19"/>
+              </w:rPr>
+              <w:t>Cơ chế báo cho thread biết cần dừng; thread đang chờ nhận InterruptedException.</w:t>
             </w:r>
           </w:p>
         </w:tc>
@@ -17598,59 +17598,58 @@
               <w:rPr>
                 <w:sz w:val="19"/>
               </w:rPr>
-              <w:t>critical section</w:t>
-            </w:r>
-          </w:p>
-        </w:tc>
-        <w:tc>
-          <w:tcPr>
-            <w:tcW w:type="dxa" w:w="1728"/>
-          </w:tcPr>
-          <w:p>
-            <w:r>
-              <w:rPr>
-                <w:sz w:val="19"/>
-              </w:rPr>
-              <w:t>đoạn mã chỉ một thread được chạy tại một thời điểm</w:t>
-            </w:r>
-          </w:p>
-        </w:tc>
-        <w:tc>
-          <w:tcPr>
-            <w:tcW w:type="dxa" w:w="1728"/>
-          </w:tcPr>
-          <w:p>
-            <w:r>
-              <w:rPr>
-                <w:sz w:val="19"/>
-              </w:rPr>
-              <w:t>Đoạn mã truy cập dữ liệu dùng chung, chỉ được một thread thực hiện tại một thời điểm.</w:t>
-            </w:r>
-          </w:p>
-        </w:tc>
-        <w:tc>
-          <w:tcPr>
-            <w:tcW w:type="dxa" w:w="1728"/>
-          </w:tcPr>
-          <w:p>
-            <w:r>
-              <w:rPr>
-                <w:sz w:val="19"/>
-              </w:rPr>
-              <w:t>V12</w:t>
-            </w:r>
-          </w:p>
-        </w:tc>
-        <w:tc>
-          <w:tcPr>
-            <w:tcW w:type="dxa" w:w="1728"/>
-          </w:tcPr>
-          <w:p>
-            <w:r>
-              <w:rPr>
-                <w:sz w:val="19"/>
-              </w:rPr>
-              <w:t>đoạn găng, vùng găng, miền găng</w:t>
+              <w:t>race condition</w:t>
+            </w:r>
+          </w:p>
+        </w:tc>
+        <w:tc>
+          <w:tcPr>
+            <w:tcW w:type="dxa" w:w="1728"/>
+          </w:tcPr>
+          <w:p>
+            <w:r>
+              <w:rPr>
+                <w:sz w:val="19"/>
+              </w:rPr>
+              <w:t>kết quả phụ thuộc thứ tự chạy của các thread</w:t>
+            </w:r>
+          </w:p>
+        </w:tc>
+        <w:tc>
+          <w:tcPr>
+            <w:tcW w:type="dxa" w:w="1728"/>
+          </w:tcPr>
+          <w:p>
+            <w:r>
+              <w:rPr>
+                <w:sz w:val="19"/>
+              </w:rPr>
+              <w:t>Lỗi khi nhiều thread truy cập dữ liệu dùng chung không đồng bộ và kết quả phụ thuộc thứ tự chạy.</w:t>
+            </w:r>
+          </w:p>
+        </w:tc>
+        <w:tc>
+          <w:tcPr>
+            <w:tcW w:type="dxa" w:w="1728"/>
+          </w:tcPr>
+          <w:p>
+            <w:r>
+              <w:rPr>
+                <w:sz w:val="19"/>
+              </w:rPr>
+              <w:t>V11</w:t>
+            </w:r>
+          </w:p>
+        </w:tc>
+        <w:tc>
+          <w:tcPr>
+            <w:tcW w:type="dxa" w:w="1728"/>
+          </w:tcPr>
+          <w:p>
+            <w:r>
+              <w:rPr>
+                <w:sz w:val="19"/>
+              </w:rPr>
             </w:r>
           </w:p>
         </w:tc>
@@ -17665,33 +17664,33 @@
               <w:rPr>
                 <w:sz w:val="19"/>
               </w:rPr>
-              <w:t>synchronized</w:t>
-            </w:r>
-          </w:p>
-        </w:tc>
-        <w:tc>
-          <w:tcPr>
-            <w:tcW w:type="dxa" w:w="1728"/>
-          </w:tcPr>
-          <w:p>
-            <w:r>
-              <w:rPr>
-                <w:sz w:val="19"/>
-              </w:rPr>
-              <w:t>từ khóa khóa monitor</w:t>
-            </w:r>
-          </w:p>
-        </w:tc>
-        <w:tc>
-          <w:tcPr>
-            <w:tcW w:type="dxa" w:w="1728"/>
-          </w:tcPr>
-          <w:p>
-            <w:r>
-              <w:rPr>
-                <w:sz w:val="19"/>
-              </w:rPr>
-              <w:t>Từ khóa Java giữ khóa monitor của đối tượng khi chạy khối hoặc phương thức.</w:t>
+              <w:t>critical section</w:t>
+            </w:r>
+          </w:p>
+        </w:tc>
+        <w:tc>
+          <w:tcPr>
+            <w:tcW w:type="dxa" w:w="1728"/>
+          </w:tcPr>
+          <w:p>
+            <w:r>
+              <w:rPr>
+                <w:sz w:val="19"/>
+              </w:rPr>
+              <w:t>đoạn mã chỉ một thread được chạy tại một thời điểm</w:t>
+            </w:r>
+          </w:p>
+        </w:tc>
+        <w:tc>
+          <w:tcPr>
+            <w:tcW w:type="dxa" w:w="1728"/>
+          </w:tcPr>
+          <w:p>
+            <w:r>
+              <w:rPr>
+                <w:sz w:val="19"/>
+              </w:rPr>
+              <w:t>Đoạn mã truy cập dữ liệu dùng chung, chỉ được một thread thực hiện tại một thời điểm.</w:t>
             </w:r>
           </w:p>
         </w:tc>
@@ -17717,6 +17716,7 @@
               <w:rPr>
                 <w:sz w:val="19"/>
               </w:rPr>
+              <w:t>đoạn găng, vùng găng, miền găng</w:t>
             </w:r>
           </w:p>
         </w:tc>
@@ -17731,33 +17731,33 @@
               <w:rPr>
                 <w:sz w:val="19"/>
               </w:rPr>
-              <w:t>monitor</w:t>
-            </w:r>
-          </w:p>
-        </w:tc>
-        <w:tc>
-          <w:tcPr>
-            <w:tcW w:type="dxa" w:w="1728"/>
-          </w:tcPr>
-          <w:p>
-            <w:r>
-              <w:rPr>
-                <w:sz w:val="19"/>
-              </w:rPr>
-              <w:t>khóa gắn với mỗi đối tượng Java</w:t>
-            </w:r>
-          </w:p>
-        </w:tc>
-        <w:tc>
-          <w:tcPr>
-            <w:tcW w:type="dxa" w:w="1728"/>
-          </w:tcPr>
-          <w:p>
-            <w:r>
-              <w:rPr>
-                <w:sz w:val="19"/>
-              </w:rPr>
-              <w:t>Khóa kèm tập chờ gắn với mỗi đối tượng, dùng bởi synchronized, wait, notify.</w:t>
+              <w:t>synchronized</w:t>
+            </w:r>
+          </w:p>
+        </w:tc>
+        <w:tc>
+          <w:tcPr>
+            <w:tcW w:type="dxa" w:w="1728"/>
+          </w:tcPr>
+          <w:p>
+            <w:r>
+              <w:rPr>
+                <w:sz w:val="19"/>
+              </w:rPr>
+              <w:t>từ khóa khóa monitor</w:t>
+            </w:r>
+          </w:p>
+        </w:tc>
+        <w:tc>
+          <w:tcPr>
+            <w:tcW w:type="dxa" w:w="1728"/>
+          </w:tcPr>
+          <w:p>
+            <w:r>
+              <w:rPr>
+                <w:sz w:val="19"/>
+              </w:rPr>
+              <w:t>Từ khóa Java giữ khóa monitor của đối tượng khi chạy khối hoặc phương thức.</w:t>
             </w:r>
           </w:p>
         </w:tc>
@@ -17797,33 +17797,33 @@
               <w:rPr>
                 <w:sz w:val="19"/>
               </w:rPr>
-              <w:t>happens-before</w:t>
-            </w:r>
-          </w:p>
-        </w:tc>
-        <w:tc>
-          <w:tcPr>
-            <w:tcW w:type="dxa" w:w="1728"/>
-          </w:tcPr>
-          <w:p>
-            <w:r>
-              <w:rPr>
-                <w:sz w:val="19"/>
-              </w:rPr>
-              <w:t>quan hệ bảo đảm thấy được thay đổi giữa các thread</w:t>
-            </w:r>
-          </w:p>
-        </w:tc>
-        <w:tc>
-          <w:tcPr>
-            <w:tcW w:type="dxa" w:w="1728"/>
-          </w:tcPr>
-          <w:p>
-            <w:r>
-              <w:rPr>
-                <w:sz w:val="19"/>
-              </w:rPr>
-              <w:t>Quan hệ của mô hình bộ nhớ Java: thao tác A happens-before B thì mọi thay đổi của A nhìn thấy được ở B.</w:t>
+              <w:t>monitor</w:t>
+            </w:r>
+          </w:p>
+        </w:tc>
+        <w:tc>
+          <w:tcPr>
+            <w:tcW w:type="dxa" w:w="1728"/>
+          </w:tcPr>
+          <w:p>
+            <w:r>
+              <w:rPr>
+                <w:sz w:val="19"/>
+              </w:rPr>
+              <w:t>khóa gắn với mỗi đối tượng Java</w:t>
+            </w:r>
+          </w:p>
+        </w:tc>
+        <w:tc>
+          <w:tcPr>
+            <w:tcW w:type="dxa" w:w="1728"/>
+          </w:tcPr>
+          <w:p>
+            <w:r>
+              <w:rPr>
+                <w:sz w:val="19"/>
+              </w:rPr>
+              <w:t>Khóa kèm tập chờ gắn với mỗi đối tượng, dùng bởi synchronized, wait, notify.</w:t>
             </w:r>
           </w:p>
         </w:tc>
@@ -17863,33 +17863,33 @@
               <w:rPr>
                 <w:sz w:val="19"/>
               </w:rPr>
-              <w:t>wait/notify</w:t>
-            </w:r>
-          </w:p>
-        </w:tc>
-        <w:tc>
-          <w:tcPr>
-            <w:tcW w:type="dxa" w:w="1728"/>
-          </w:tcPr>
-          <w:p>
-            <w:r>
-              <w:rPr>
-                <w:sz w:val="19"/>
-              </w:rPr>
-              <w:t>cơ chế chờ điều kiện trên monitor</w:t>
-            </w:r>
-          </w:p>
-        </w:tc>
-        <w:tc>
-          <w:tcPr>
-            <w:tcW w:type="dxa" w:w="1728"/>
-          </w:tcPr>
-          <w:p>
-            <w:r>
-              <w:rPr>
-                <w:sz w:val="19"/>
-              </w:rPr>
-              <w:t>wait() nhả khóa và chờ; notify(), notifyAll() đánh thức thread đang chờ trên cùng monitor.</w:t>
+              <w:t>happens-before</w:t>
+            </w:r>
+          </w:p>
+        </w:tc>
+        <w:tc>
+          <w:tcPr>
+            <w:tcW w:type="dxa" w:w="1728"/>
+          </w:tcPr>
+          <w:p>
+            <w:r>
+              <w:rPr>
+                <w:sz w:val="19"/>
+              </w:rPr>
+              <w:t>quan hệ bảo đảm thấy được thay đổi giữa các thread</w:t>
+            </w:r>
+          </w:p>
+        </w:tc>
+        <w:tc>
+          <w:tcPr>
+            <w:tcW w:type="dxa" w:w="1728"/>
+          </w:tcPr>
+          <w:p>
+            <w:r>
+              <w:rPr>
+                <w:sz w:val="19"/>
+              </w:rPr>
+              <w:t>Quan hệ của mô hình bộ nhớ Java: thao tác A happens-before B thì mọi thay đổi của A nhìn thấy được ở B.</w:t>
             </w:r>
           </w:p>
         </w:tc>
@@ -17929,33 +17929,33 @@
               <w:rPr>
                 <w:sz w:val="19"/>
               </w:rPr>
-              <w:t>volatile</w:t>
-            </w:r>
-          </w:p>
-        </w:tc>
-        <w:tc>
-          <w:tcPr>
-            <w:tcW w:type="dxa" w:w="1728"/>
-          </w:tcPr>
-          <w:p>
-            <w:r>
-              <w:rPr>
-                <w:sz w:val="19"/>
-              </w:rPr>
-              <w:t>biến có thay đổi nhìn thấy ngay ở mọi thread</w:t>
-            </w:r>
-          </w:p>
-        </w:tc>
-        <w:tc>
-          <w:tcPr>
-            <w:tcW w:type="dxa" w:w="1728"/>
-          </w:tcPr>
-          <w:p>
-            <w:r>
-              <w:rPr>
-                <w:sz w:val="19"/>
-              </w:rPr>
-              <w:t>Từ khóa bảo đảm ghi vào biến happens-before các lần đọc sau đó; không bảo đảm thao tác nguyên tử.</w:t>
+              <w:t>wait/notify</w:t>
+            </w:r>
+          </w:p>
+        </w:tc>
+        <w:tc>
+          <w:tcPr>
+            <w:tcW w:type="dxa" w:w="1728"/>
+          </w:tcPr>
+          <w:p>
+            <w:r>
+              <w:rPr>
+                <w:sz w:val="19"/>
+              </w:rPr>
+              <w:t>cơ chế chờ điều kiện trên monitor</w:t>
+            </w:r>
+          </w:p>
+        </w:tc>
+        <w:tc>
+          <w:tcPr>
+            <w:tcW w:type="dxa" w:w="1728"/>
+          </w:tcPr>
+          <w:p>
+            <w:r>
+              <w:rPr>
+                <w:sz w:val="19"/>
+              </w:rPr>
+              <w:t>wait() nhả khóa và chờ; notify(), notifyAll() đánh thức thread đang chờ trên cùng monitor.</w:t>
             </w:r>
           </w:p>
         </w:tc>
@@ -17995,33 +17995,33 @@
               <w:rPr>
                 <w:sz w:val="19"/>
               </w:rPr>
-              <w:t>ConcurrentHashMap</w:t>
-            </w:r>
-          </w:p>
-        </w:tc>
-        <w:tc>
-          <w:tcPr>
-            <w:tcW w:type="dxa" w:w="1728"/>
-          </w:tcPr>
-          <w:p>
-            <w:r>
-              <w:rPr>
-                <w:sz w:val="19"/>
-              </w:rPr>
-              <w:t>map an toàn khi truy cập đồng thời</w:t>
-            </w:r>
-          </w:p>
-        </w:tc>
-        <w:tc>
-          <w:tcPr>
-            <w:tcW w:type="dxa" w:w="1728"/>
-          </w:tcPr>
-          <w:p>
-            <w:r>
-              <w:rPr>
-                <w:sz w:val="19"/>
-              </w:rPr>
-              <w:t>Hiện thực Map cho nhiều thread đọc, ghi đồng thời mà không cần khóa toàn bộ.</w:t>
+              <w:t>spurious wakeup</w:t>
+            </w:r>
+          </w:p>
+        </w:tc>
+        <w:tc>
+          <w:tcPr>
+            <w:tcW w:type="dxa" w:w="1728"/>
+          </w:tcPr>
+          <w:p>
+            <w:r>
+              <w:rPr>
+                <w:sz w:val="19"/>
+              </w:rPr>
+              <w:t>đánh thức giả</w:t>
+            </w:r>
+          </w:p>
+        </w:tc>
+        <w:tc>
+          <w:tcPr>
+            <w:tcW w:type="dxa" w:w="1728"/>
+          </w:tcPr>
+          <w:p>
+            <w:r>
+              <w:rPr>
+                <w:sz w:val="19"/>
+              </w:rPr>
+              <w:t>Thread tỉnh dậy khỏi wait() mà không do notify, interrupt hay hết thời gian chờ; Java cho phép điều này, nên wait() phải nằm trong vòng lặp.</w:t>
             </w:r>
           </w:p>
         </w:tc>
@@ -18061,46 +18061,46 @@
               <w:rPr>
                 <w:sz w:val="19"/>
               </w:rPr>
-              <w:t>Executor</w:t>
-            </w:r>
-          </w:p>
-        </w:tc>
-        <w:tc>
-          <w:tcPr>
-            <w:tcW w:type="dxa" w:w="1728"/>
-          </w:tcPr>
-          <w:p>
-            <w:r>
-              <w:rPr>
-                <w:sz w:val="19"/>
-              </w:rPr>
-              <w:t>interface tách gửi tác vụ khỏi chạy tác vụ</w:t>
-            </w:r>
-          </w:p>
-        </w:tc>
-        <w:tc>
-          <w:tcPr>
-            <w:tcW w:type="dxa" w:w="1728"/>
-          </w:tcPr>
-          <w:p>
-            <w:r>
-              <w:rPr>
-                <w:sz w:val="19"/>
-              </w:rPr>
-              <w:t>Interface nhận tác vụ để chạy; cách chạy (thread nào, khi nào) do hiện thực quyết định.</w:t>
-            </w:r>
-          </w:p>
-        </w:tc>
-        <w:tc>
-          <w:tcPr>
-            <w:tcW w:type="dxa" w:w="1728"/>
-          </w:tcPr>
-          <w:p>
-            <w:r>
-              <w:rPr>
-                <w:sz w:val="19"/>
-              </w:rPr>
-              <w:t>V13</w:t>
+              <w:t>volatile</w:t>
+            </w:r>
+          </w:p>
+        </w:tc>
+        <w:tc>
+          <w:tcPr>
+            <w:tcW w:type="dxa" w:w="1728"/>
+          </w:tcPr>
+          <w:p>
+            <w:r>
+              <w:rPr>
+                <w:sz w:val="19"/>
+              </w:rPr>
+              <w:t>biến có thay đổi nhìn thấy ngay ở mọi thread</w:t>
+            </w:r>
+          </w:p>
+        </w:tc>
+        <w:tc>
+          <w:tcPr>
+            <w:tcW w:type="dxa" w:w="1728"/>
+          </w:tcPr>
+          <w:p>
+            <w:r>
+              <w:rPr>
+                <w:sz w:val="19"/>
+              </w:rPr>
+              <w:t>Từ khóa bảo đảm ghi vào biến happens-before các lần đọc sau đó; không bảo đảm thao tác nguyên tử.</w:t>
+            </w:r>
+          </w:p>
+        </w:tc>
+        <w:tc>
+          <w:tcPr>
+            <w:tcW w:type="dxa" w:w="1728"/>
+          </w:tcPr>
+          <w:p>
+            <w:r>
+              <w:rPr>
+                <w:sz w:val="19"/>
+              </w:rPr>
+              <w:t>V12</w:t>
             </w:r>
           </w:p>
         </w:tc>
@@ -18127,46 +18127,46 @@
               <w:rPr>
                 <w:sz w:val="19"/>
               </w:rPr>
-              <w:t>ExecutorService</w:t>
-            </w:r>
-          </w:p>
-        </w:tc>
-        <w:tc>
-          <w:tcPr>
-            <w:tcW w:type="dxa" w:w="1728"/>
-          </w:tcPr>
-          <w:p>
-            <w:r>
-              <w:rPr>
-                <w:sz w:val="19"/>
-              </w:rPr>
-              <w:t>Executor có quản lý vòng đời</w:t>
-            </w:r>
-          </w:p>
-        </w:tc>
-        <w:tc>
-          <w:tcPr>
-            <w:tcW w:type="dxa" w:w="1728"/>
-          </w:tcPr>
-          <w:p>
-            <w:r>
-              <w:rPr>
-                <w:sz w:val="19"/>
-              </w:rPr>
-              <w:t>Executor có thêm submit() trả Future, shutdown() và awaitTermination().</w:t>
-            </w:r>
-          </w:p>
-        </w:tc>
-        <w:tc>
-          <w:tcPr>
-            <w:tcW w:type="dxa" w:w="1728"/>
-          </w:tcPr>
-          <w:p>
-            <w:r>
-              <w:rPr>
-                <w:sz w:val="19"/>
-              </w:rPr>
-              <w:t>V13</w:t>
+              <w:t>ConcurrentHashMap</w:t>
+            </w:r>
+          </w:p>
+        </w:tc>
+        <w:tc>
+          <w:tcPr>
+            <w:tcW w:type="dxa" w:w="1728"/>
+          </w:tcPr>
+          <w:p>
+            <w:r>
+              <w:rPr>
+                <w:sz w:val="19"/>
+              </w:rPr>
+              <w:t>map an toàn khi truy cập đồng thời</w:t>
+            </w:r>
+          </w:p>
+        </w:tc>
+        <w:tc>
+          <w:tcPr>
+            <w:tcW w:type="dxa" w:w="1728"/>
+          </w:tcPr>
+          <w:p>
+            <w:r>
+              <w:rPr>
+                <w:sz w:val="19"/>
+              </w:rPr>
+              <w:t>Hiện thực Map cho nhiều thread đọc, ghi đồng thời mà không cần khóa toàn bộ.</w:t>
+            </w:r>
+          </w:p>
+        </w:tc>
+        <w:tc>
+          <w:tcPr>
+            <w:tcW w:type="dxa" w:w="1728"/>
+          </w:tcPr>
+          <w:p>
+            <w:r>
+              <w:rPr>
+                <w:sz w:val="19"/>
+              </w:rPr>
+              <w:t>V12</w:t>
             </w:r>
           </w:p>
         </w:tc>
@@ -18193,33 +18193,33 @@
               <w:rPr>
                 <w:sz w:val="19"/>
               </w:rPr>
-              <w:t>thread pool</w:t>
-            </w:r>
-          </w:p>
-        </w:tc>
-        <w:tc>
-          <w:tcPr>
-            <w:tcW w:type="dxa" w:w="1728"/>
-          </w:tcPr>
-          <w:p>
-            <w:r>
-              <w:rPr>
-                <w:sz w:val="19"/>
-              </w:rPr>
-              <w:t>tập thread dùng lại</w:t>
-            </w:r>
-          </w:p>
-        </w:tc>
-        <w:tc>
-          <w:tcPr>
-            <w:tcW w:type="dxa" w:w="1728"/>
-          </w:tcPr>
-          <w:p>
-            <w:r>
-              <w:rPr>
-                <w:sz w:val="19"/>
-              </w:rPr>
-              <w:t>Tập thread cố định hoặc có giới hạn lấy tác vụ từ hàng đợi để chạy.</w:t>
+              <w:t>Executor</w:t>
+            </w:r>
+          </w:p>
+        </w:tc>
+        <w:tc>
+          <w:tcPr>
+            <w:tcW w:type="dxa" w:w="1728"/>
+          </w:tcPr>
+          <w:p>
+            <w:r>
+              <w:rPr>
+                <w:sz w:val="19"/>
+              </w:rPr>
+              <w:t>interface tách gửi tác vụ khỏi chạy tác vụ</w:t>
+            </w:r>
+          </w:p>
+        </w:tc>
+        <w:tc>
+          <w:tcPr>
+            <w:tcW w:type="dxa" w:w="1728"/>
+          </w:tcPr>
+          <w:p>
+            <w:r>
+              <w:rPr>
+                <w:sz w:val="19"/>
+              </w:rPr>
+              <w:t>Interface nhận tác vụ để chạy; cách chạy (thread nào, khi nào) do hiện thực quyết định.</w:t>
             </w:r>
           </w:p>
         </w:tc>
@@ -18259,33 +18259,33 @@
               <w:rPr>
                 <w:sz w:val="19"/>
               </w:rPr>
-              <w:t>saturation policy</w:t>
-            </w:r>
-          </w:p>
-        </w:tc>
-        <w:tc>
-          <w:tcPr>
-            <w:tcW w:type="dxa" w:w="1728"/>
-          </w:tcPr>
-          <w:p>
-            <w:r>
-              <w:rPr>
-                <w:sz w:val="19"/>
-              </w:rPr>
-              <w:t>chính sách khi pool và hàng đợi đầy</w:t>
-            </w:r>
-          </w:p>
-        </w:tc>
-        <w:tc>
-          <w:tcPr>
-            <w:tcW w:type="dxa" w:w="1728"/>
-          </w:tcPr>
-          <w:p>
-            <w:r>
-              <w:rPr>
-                <w:sz w:val="19"/>
-              </w:rPr>
-              <w:t>Quy tắc xử lý tác vụ mới khi thread pool và hàng đợi đều đầy (từ chối, chạy trên thread gọi…).</w:t>
+              <w:t>ExecutorService</w:t>
+            </w:r>
+          </w:p>
+        </w:tc>
+        <w:tc>
+          <w:tcPr>
+            <w:tcW w:type="dxa" w:w="1728"/>
+          </w:tcPr>
+          <w:p>
+            <w:r>
+              <w:rPr>
+                <w:sz w:val="19"/>
+              </w:rPr>
+              <w:t>Executor có quản lý vòng đời</w:t>
+            </w:r>
+          </w:p>
+        </w:tc>
+        <w:tc>
+          <w:tcPr>
+            <w:tcW w:type="dxa" w:w="1728"/>
+          </w:tcPr>
+          <w:p>
+            <w:r>
+              <w:rPr>
+                <w:sz w:val="19"/>
+              </w:rPr>
+              <w:t>Executor có thêm submit() trả Future, shutdown() và awaitTermination().</w:t>
             </w:r>
           </w:p>
         </w:tc>
@@ -18325,6 +18325,138 @@
               <w:rPr>
                 <w:sz w:val="19"/>
               </w:rPr>
+              <w:t>thread pool</w:t>
+            </w:r>
+          </w:p>
+        </w:tc>
+        <w:tc>
+          <w:tcPr>
+            <w:tcW w:type="dxa" w:w="1728"/>
+          </w:tcPr>
+          <w:p>
+            <w:r>
+              <w:rPr>
+                <w:sz w:val="19"/>
+              </w:rPr>
+              <w:t>tập thread dùng lại</w:t>
+            </w:r>
+          </w:p>
+        </w:tc>
+        <w:tc>
+          <w:tcPr>
+            <w:tcW w:type="dxa" w:w="1728"/>
+          </w:tcPr>
+          <w:p>
+            <w:r>
+              <w:rPr>
+                <w:sz w:val="19"/>
+              </w:rPr>
+              <w:t>Tập thread cố định hoặc có giới hạn lấy tác vụ từ hàng đợi để chạy.</w:t>
+            </w:r>
+          </w:p>
+        </w:tc>
+        <w:tc>
+          <w:tcPr>
+            <w:tcW w:type="dxa" w:w="1728"/>
+          </w:tcPr>
+          <w:p>
+            <w:r>
+              <w:rPr>
+                <w:sz w:val="19"/>
+              </w:rPr>
+              <w:t>V13</w:t>
+            </w:r>
+          </w:p>
+        </w:tc>
+        <w:tc>
+          <w:tcPr>
+            <w:tcW w:type="dxa" w:w="1728"/>
+          </w:tcPr>
+          <w:p>
+            <w:r>
+              <w:rPr>
+                <w:sz w:val="19"/>
+              </w:rPr>
+            </w:r>
+          </w:p>
+        </w:tc>
+      </w:tr>
+      <w:tr>
+        <w:tc>
+          <w:tcPr>
+            <w:tcW w:type="dxa" w:w="1728"/>
+          </w:tcPr>
+          <w:p>
+            <w:r>
+              <w:rPr>
+                <w:sz w:val="19"/>
+              </w:rPr>
+              <w:t>saturation policy</w:t>
+            </w:r>
+          </w:p>
+        </w:tc>
+        <w:tc>
+          <w:tcPr>
+            <w:tcW w:type="dxa" w:w="1728"/>
+          </w:tcPr>
+          <w:p>
+            <w:r>
+              <w:rPr>
+                <w:sz w:val="19"/>
+              </w:rPr>
+              <w:t>chính sách khi pool và hàng đợi đầy</w:t>
+            </w:r>
+          </w:p>
+        </w:tc>
+        <w:tc>
+          <w:tcPr>
+            <w:tcW w:type="dxa" w:w="1728"/>
+          </w:tcPr>
+          <w:p>
+            <w:r>
+              <w:rPr>
+                <w:sz w:val="19"/>
+              </w:rPr>
+              <w:t>Quy tắc xử lý tác vụ mới khi thread pool và hàng đợi đều đầy (từ chối, chạy trên thread gọi…).</w:t>
+            </w:r>
+          </w:p>
+        </w:tc>
+        <w:tc>
+          <w:tcPr>
+            <w:tcW w:type="dxa" w:w="1728"/>
+          </w:tcPr>
+          <w:p>
+            <w:r>
+              <w:rPr>
+                <w:sz w:val="19"/>
+              </w:rPr>
+              <w:t>V13</w:t>
+            </w:r>
+          </w:p>
+        </w:tc>
+        <w:tc>
+          <w:tcPr>
+            <w:tcW w:type="dxa" w:w="1728"/>
+          </w:tcPr>
+          <w:p>
+            <w:r>
+              <w:rPr>
+                <w:sz w:val="19"/>
+              </w:rPr>
+            </w:r>
+          </w:p>
+        </w:tc>
+      </w:tr>
+      <w:tr>
+        <w:tc>
+          <w:tcPr>
+            <w:tcW w:type="dxa" w:w="1728"/>
+          </w:tcPr>
+          <w:p>
+            <w:r>
+              <w:rPr>
+                <w:sz w:val="19"/>
+              </w:rPr>
               <w:t>virtual thread</w:t>
             </w:r>
           </w:p>
@@ -18352,6 +18484,72 @@
                 <w:sz w:val="19"/>
               </w:rPr>
               <w:t>Thread do JVM lập lịch trên ít carrier thread, nhả carrier khi chờ I/O; có từ Java 21.</w:t>
+            </w:r>
+          </w:p>
+        </w:tc>
+        <w:tc>
+          <w:tcPr>
+            <w:tcW w:type="dxa" w:w="1728"/>
+          </w:tcPr>
+          <w:p>
+            <w:r>
+              <w:rPr>
+                <w:sz w:val="19"/>
+              </w:rPr>
+              <w:t>V13</w:t>
+            </w:r>
+          </w:p>
+        </w:tc>
+        <w:tc>
+          <w:tcPr>
+            <w:tcW w:type="dxa" w:w="1728"/>
+          </w:tcPr>
+          <w:p>
+            <w:r>
+              <w:rPr>
+                <w:sz w:val="19"/>
+              </w:rPr>
+            </w:r>
+          </w:p>
+        </w:tc>
+      </w:tr>
+      <w:tr>
+        <w:tc>
+          <w:tcPr>
+            <w:tcW w:type="dxa" w:w="1728"/>
+          </w:tcPr>
+          <w:p>
+            <w:r>
+              <w:rPr>
+                <w:sz w:val="19"/>
+              </w:rPr>
+              <w:t>platform thread</w:t>
+            </w:r>
+          </w:p>
+        </w:tc>
+        <w:tc>
+          <w:tcPr>
+            <w:tcW w:type="dxa" w:w="1728"/>
+          </w:tcPr>
+          <w:p>
+            <w:r>
+              <w:rPr>
+                <w:sz w:val="19"/>
+              </w:rPr>
+              <w:t>thread Java gắn với một thread hệ điều hành</w:t>
+            </w:r>
+          </w:p>
+        </w:tc>
+        <w:tc>
+          <w:tcPr>
+            <w:tcW w:type="dxa" w:w="1728"/>
+          </w:tcPr>
+          <w:p>
+            <w:r>
+              <w:rPr>
+                <w:sz w:val="19"/>
+              </w:rPr>
+              <w:t>Thread Java truyền thống: mỗi thread Java là một thread của hệ điều hành, kể cả khi chỉ đang chờ.</w:t>
             </w:r>
           </w:p>
         </w:tc>

</xml_diff>

<commit_message>
Publish INT1433 from source 78127a2
</commit_message>
<xml_diff>
--- a/docs/INT1433_Khung-noi-dung.docx
+++ b/docs/INT1433_Khung-noi-dung.docx
@@ -7640,7 +7640,7 @@
         <w:t xml:space="preserve">Mã / demo: </w:t>
       </w:r>
       <w:r>
-        <w:t>UdpLookupServer và UdpLookupClient tra cứu qua datagram; buffer 16 byte làm phản hồi bị cắt; connected UDP socket bỏ qua datagram từ endpoint khác.</w:t>
+        <w:t>UdpLookupServer và UdpLookupClient tra cứu qua datagram; hai lần send liền nhau cho hai lần receive riêng; connect() trên DatagramSocket tới địa chỉ không ai trả lời vẫn trả về ngay, và connected UDP socket bỏ qua datagram từ endpoint khác; buffer 16 byte làm phản hồi bị cắt.</w:t>
       </w:r>
     </w:p>
     <w:p>
@@ -7654,7 +7654,7 @@
         <w:t xml:space="preserve">Lưu ý: </w:t>
       </w:r>
       <w:r>
-        <w:t>receive() không báo khi datagram bị cắt — buffer phải đủ cho datagram lớn nhất mà giao thức cho phép. Khi dùng lại một DatagramPacket trong vòng lặp, receive() đã đặt độ dài bằng datagram trước: phải gọi setLength(buf.length) trước mỗi lần nhận.</w:t>
+        <w:t>receive() không báo khi datagram bị cắt — buffer phải đủ cho datagram lớn nhất mà giao thức cho phép; ký tự UTF-8 bị cắt giữa chừng thành ký tự lỗi. (Bỏ ý setLength của bản khung: với JDK 21, dùng lại một DatagramPacket không làm lần nhận sau bị cắt — đã chạy thử.)</w:t>
       </w:r>
     </w:p>
     <w:p>
@@ -7724,7 +7724,7 @@
         <w:t xml:space="preserve">Hình: </w:t>
       </w:r>
       <w:r>
-        <w:t>infographic: lộ trình chương 3; so-do: header UDP 8 byte; infographic: TCP và UDP — tầng nào chịu trách nhiệm việc gì</w:t>
+        <w:t>infographic: lộ trình chương 3; so-do: datagram và header UDP 8 byte; so-do: cắt ngắn datagram và connected UDP socket</w:t>
       </w:r>
     </w:p>
     <w:p>
@@ -7858,7 +7858,7 @@
         <w:t xml:space="preserve">Mã / demo: </w:t>
       </w:r>
       <w:r>
-        <w:t>MulticastSender gửi tới 239.1.2.3:9300; ba MulticastReceiver cùng nhận; máy nhận chọn network interface theo cấu hình.</w:t>
+        <w:t>MulticastSender gửi tới 239.1.2.3:9300 với TTL 1; ba MulticastReceiver cùng nhận; máy nhận thứ tư tham gia nhóm trên card mạng ảo không nhận gì, không có ngoại lệ.</w:t>
       </w:r>
     </w:p>
     <w:p>
@@ -8076,7 +8076,7 @@
         <w:t xml:space="preserve">Mã / demo: </w:t>
       </w:r>
       <w:r>
-        <w:t>VideoSender phát chuỗi khung hình nhỏ, 10 khung hình mỗi giây; ba VideoReceiver hiển thị và đếm khung hình mất; một máy nhận tham gia sau 5 giây.</w:t>
+        <w:t>VideoSender phát 100 khung hình 1 000 byte, 10 khung hình mỗi giây; r1 nhận đủ 100; r2 chạy với mất gói mô phỏng 5% (máy nhận tự bỏ datagram, seed cố định), phát hiện 6 khoảng trống, 7 khung hình mất; r3 tham gia sau 5 giây, bắt đầu từ khung hình 53.</w:t>
       </w:r>
     </w:p>
     <w:p>
@@ -8104,7 +8104,7 @@
         <w:t xml:space="preserve">Câu hỏi: </w:t>
       </w:r>
       <w:r>
-        <w:t>Số thứ tự nhảy từ 41 lên 44: đã mất bao nhiêu khung hình? | Vì sao truyền video multicast không retry như tra cứu UDP?</w:t>
+        <w:t>Số thứ tự nhảy từ 41 lên 44: đã mất bao nhiêu khung hình? | Vì sao máy nhận video multicast không yêu cầu nguồn gửi lại khung hình mất?</w:t>
       </w:r>
     </w:p>
     <w:p>
@@ -8160,7 +8160,7 @@
         <w:t xml:space="preserve">Hình: </w:t>
       </w:r>
       <w:r>
-        <w:t>so-do: khung hình thành datagram có số thứ tự; anh-chup: ba máy nhận cùng hiển thị</w:t>
+        <w:t>so-do: khung hình thành datagram có số thứ tự; so-do: máy nhận theo dõi số thứ tự, máy nhận vào giữa chừng</w:t>
       </w:r>
     </w:p>
     <w:p>
@@ -8294,7 +8294,7 @@
         <w:t xml:space="preserve">Mã / demo: </w:t>
       </w:r>
       <w:r>
-        <w:t>Gửi request handshake tới một WebSocket server cục bộ bằng curl, quan sát response 101 và các header.</w:t>
+        <w:t>WebSocket server tối giản trên ServerSocket (handshake và frame tự viết, port 9400): curl gửi handshake với khóa mẫu của RFC 6455, nhận 101 và Sec-WebSocket-Accept đúng giá trị mẫu; client java.net.http.WebSocket nhận welcome do server gửi trước, gửi text, ping, close; log server in từng frame.</w:t>
       </w:r>
     </w:p>
     <w:p>
@@ -8512,7 +8512,7 @@
         <w:t xml:space="preserve">Mã / demo: </w:t>
       </w:r>
       <w:r>
-        <w:t>Ba client chat qua một server; một client đóng, server xóa phiên và báo cho các client còn lại.</w:t>
+        <w:t>ChatEndpoint (Jakarta WebSocket) chạy trên Tyrus 2.2.2 + Grizzly 4.0.2, port 9401; ba ChatClient (java.net.http.WebSocket) an, binh, chi trong ba tiến trình; chi đóng, server xóa phiên và báo cho an, binh.</w:t>
       </w:r>
     </w:p>
     <w:p>
@@ -8596,7 +8596,7 @@
         <w:t xml:space="preserve">Hình: </w:t>
       </w:r>
       <w:r>
-        <w:t>so-do: server giữ tập phiên; anh-chup: ba cửa sổ chat</w:t>
+        <w:t>so-do: server giữ tập phiên</w:t>
       </w:r>
     </w:p>
     <w:p>
@@ -8730,7 +8730,7 @@
         <w:t xml:space="preserve">Mã / demo: </w:t>
       </w:r>
       <w:r>
-        <w:t>HttpClient của JDK gửi 20 request song song tới một server HTTP/2; in phiên bản giao thức của response (HTTP_2) và thời gian so với khi ép HTTP/1.1.</w:t>
+        <w:t>Server Jetty 12 (HTTP/1.1 và h2c, port 9402, mỗi tài nguyên 200 ms, đếm kết nối theo port client); HttpClient của JDK gửi 20 request song song: HTTP/2 261 ms trên 1 kết nối; ép HTTP/1.1, tối đa 6 request cùng lúc như trình duyệt: 863 ms trên 6 kết nối; HTTP/1.1 không giới hạn: 267 ms nhưng 20 kết nối.</w:t>
       </w:r>
     </w:p>
     <w:p>
@@ -8814,7 +8814,7 @@
         <w:t xml:space="preserve">Hình: </w:t>
       </w:r>
       <w:r>
-        <w:t>so-do: HTTP/1.1 và HTTP/2 trên trục thời gian; so-do: frame HTTP/2 xen kẽ trên một kết nối; infographic: HTTP/1.1 và HTTP/2</w:t>
+        <w:t>so-do: HTTP/1.1 và HTTP/2 trên trục thời gian; so-do: frame HTTP/2 xen kẽ trên một kết nối; so-do: head-of-line blocking ở tầng TCP</w:t>
       </w:r>
     </w:p>
     <w:p>
@@ -8948,7 +8948,7 @@
         <w:t xml:space="preserve">Mã / demo: </w:t>
       </w:r>
       <w:r>
-        <w:t>HttpClient của JDK 21 chưa hỗ trợ HTTP/3, nên quan sát bằng curl: response HTTP/2 có header Alt-Svc báo server hỗ trợ HTTP/3; curl --http3 -I gửi request qua QUIC (bản curl có hỗ trợ HTTP/3).</w:t>
+        <w:t>HttpClient của JDK 21 chưa hỗ trợ HTTP/3 (có từ JDK 26, JEP 517); curl trên máy biên soạn không có HTTP/2, HTTP/3. AltSvcProbe (JDK 21, HTTPS) tới https://cloudflare-quic.com/: response HTTP_2 kèm alt-svc h3=":443"; Http3Get (Flupke 0.9.4 trên Kwik): status 200 qua HTTP/3, 69 UDP datagram, 2 gói mất QUIC tự gửi lại.</w:t>
       </w:r>
     </w:p>
     <w:p>
@@ -9032,7 +9032,7 @@
         <w:t xml:space="preserve">Hình: </w:t>
       </w:r>
       <w:r>
-        <w:t>so-do: chồng giao thức HTTP/2 và HTTP/3; so-do: connection migration; infographic: HTTP/1.1 → HTTP/2 → HTTP/3; infographic: tổng kết chương 3</w:t>
+        <w:t>so-do: chồng giao thức HTTP/2 và HTTP/3, số vòng thiết lập; so-do: stream độc lập khi mất gói; so-do: connection migration; infographic: tổng kết chương 3</w:t>
       </w:r>
     </w:p>
     <w:p>

</xml_diff>

<commit_message>
Publish INT1433 from source 10289f3
</commit_message>
<xml_diff>
--- a/docs/INT1433_Khung-noi-dung.docx
+++ b/docs/INT1433_Khung-noi-dung.docx
@@ -15,7 +15,7 @@
         <w:rPr>
           <w:color w:val="BC2626"/>
         </w:rPr>
-        <w:t>Bản nội bộ để duyệt · sinh từ plan.yaml và glossary.yaml · 24/10/2026. Nhận xét bằng comment Word trực tiếp lên đoạn cần sửa.</w:t>
+        <w:t>Bản nội bộ để duyệt · sinh từ plan.yaml và glossary.yaml · 25/10/2026. Nhận xét bằng comment Word trực tiếp lên đoạn cần sửa.</w:t>
       </w:r>
     </w:p>
     <w:p>
@@ -9174,7 +9174,7 @@
         <w:t xml:space="preserve">Mã / demo: </w:t>
       </w:r>
       <w:r>
-        <w:t>LookupService (remote interface) và LookupServer đăng ký vào RMI registry; client tra tên và gọi lookup; tắt server giữa chừng → RemoteException.</w:t>
+        <w:t>LookupService (remote interface); LookupServer export đối tượng ở port 9199, đăng ký stub vào RMI registry (port 1099, cùng tiến trình); client tra tên, in lớp stub (proxy do JDK sinh) và endpoint trong stub, gọi lookup. CrashDemo: server trong tiến trình con, lookup mất 2 giây, tắt server sau 500 ms → UnmarshalException (server đã bắt đầu chạy lookup); gọi lại → ConnectException.</w:t>
       </w:r>
     </w:p>
     <w:p>
@@ -9392,7 +9392,7 @@
         <w:t xml:space="preserve">Mã / demo: </w:t>
       </w:r>
       <w:r>
-        <w:t>Client sửa đối tượng sau khi gửi: server không thấy thay đổi (bản sao). Hai client cập nhật cùng một khóa đồng thời; idempotency key chặn cập nhật trùng khi gọi lại.</w:t>
+        <w:t>ParamDemo: server ghi version vào tham số Entry, client vẫn thấy version 0; client sửa value sau khi gửi, server không thấy (bản sao). RetryDemo: server mô phỏng một lần chậm (dừng 1,5 giây sau khi cập nhật), client chờ tối đa 1 giây rồi gọi lại: không có idempotency key → version 2 (áp dụng hai lần), có key → version 1. ConcurrentDemo: hai thread cùng cập nhật một khóa, mỗi thread 1 000 lần: HashMap đọc rồi ghi → version 1938, ConcurrentHashMap.compute → 2000.</w:t>
       </w:r>
     </w:p>
     <w:p>
@@ -9610,7 +9610,7 @@
         <w:t xml:space="preserve">Mã / demo: </w:t>
       </w:r>
       <w:r>
-        <w:t>Dịch vụ tra cứu công bố bằng Jakarta XML Web Services; mở WSDL bằng trình duyệt; gửi request SOAP bằng curl và đọc response XML.</w:t>
+        <w:t>Dịch vụ tra cứu công bố bằng Jakarta XML Web Services (Endpoint.publish, http://127.0.0.1:9199/lookup); lấy WSDL do Metro sinh (?wsdl) bằng curl; gửi request SOAP bằng curl và đọc response XML (đã định dạng bằng xmllint): HTTP 200, request 205 byte, response 250 byte.</w:t>
       </w:r>
     </w:p>
     <w:p>
@@ -9828,7 +9828,7 @@
         <w:t xml:space="preserve">Mã / demo: </w:t>
       </w:r>
       <w:r>
-        <w:t>Server REST tối thiểu bằng HttpServer của JDK; client HttpClient gọi GET và PUT, in mã trạng thái và JSON.</w:t>
+        <w:t>Server REST tối thiểu bằng HttpServer của JDK (port 9199, /entries/{key}, JSON tự viết vì JDK chưa có thư viện JSON); client HttpClient gọi GET hanoi → 200 JSON 53 byte, GET atlantis → 404, PUT sapa hai lần → 201 rồi 200, DELETE hai lần → 204 rồi 404, POST → 405.</w:t>
       </w:r>
     </w:p>
     <w:p>
@@ -10046,7 +10046,7 @@
         <w:t xml:space="preserve">Mã / demo: </w:t>
       </w:r>
       <w:r>
-        <w:t>Client gRPC gọi dịch vụ tra cứu; in kích thước message Protocol Buffers so với JSON cùng nội dung.</w:t>
+        <w:t>Server gRPC (port 9199) và client blocking stub: hanoi → found=true, atlantis → found=false. SizeDemo in byte của LookupRequest (0a 05 68 61 6e 6f 69, 7 byte; JSON 15 byte) và LookupReply (31 so với 52 byte). CompatDemo: client cũ đọc byte của server đổi số trường → found=false, không ngoại lệ; server thêm trường số 3 → client cũ đọc đúng, bỏ qua trường lạ.</w:t>
       </w:r>
     </w:p>
     <w:p>
@@ -10264,7 +10264,7 @@
         <w:t xml:space="preserve">Mã / demo: </w:t>
       </w:r>
       <w:r>
-        <w:t>Tra cứu theo tiền tố trả kết quả dần qua server streaming; lời gọi vượt deadline nhận DEADLINE_EXCEEDED.</w:t>
+        <w:t>Prefix (server streaming) cho tiền tố hanoi.: 5 mục, mỗi mục server mô phỏng tốn 300 ms, client nhận dần qua Iterator; deadline 1 giây: 3 mục rồi DEADLINE_EXCEEDED, server kiểm tra isCancelled và dừng. BidiClient (LookupMany, bidirectional): 3 khóa cách nhau 300 ms, reply xen giữa các lần gửi. StatusDemo: NOT_FOUND (khóa không có), UNAVAILABLE (không có server).</w:t>
       </w:r>
     </w:p>
     <w:p>
@@ -10482,7 +10482,7 @@
         <w:t xml:space="preserve">Mã / demo: </w:t>
       </w:r>
       <w:r>
-        <w:t>Dịch vụ tra cứu gửi sự kiện 'khóa đã cập nhật' tới RabbitMQ (chạy bằng Docker); consumer in sự kiện; tắt consumer rồi bật lại, message vẫn còn trong queue.</w:t>
+        <w:t>UpdatePublisher (dịch vụ tra cứu) gửi sự kiện 'updated &lt;khóa&gt;' tới exchange direct lookup.events, routing key entry.updated, binding vào queue lookup.updates; consumer đang chạy nhận ngay; consumer tắt: rabbitmqctl list_queues cho thấy 2 message chờ, consumer chạy lại nhận đủ. autoAck, consumer chết khi xử lý dalat: queue còn 0, dalat và hue mất; ack thủ công: queue còn 2, giao lại với cờ redelivered.</w:t>
       </w:r>
     </w:p>
     <w:p>
@@ -10552,7 +10552,7 @@
         <w:t xml:space="preserve">Mở rộng — bài tập: </w:t>
       </w:r>
       <w:r>
-        <w:t>Cấu hình queue durable và message persistent; khởi động lại container RabbitMQ và kiểm tra message còn lại.</w:t>
+        <w:t>Gửi message persistent (queue đã durable); khởi động lại RabbitMQ và kiểm tra message nào còn lại trong queue.</w:t>
       </w:r>
     </w:p>
     <w:p>
@@ -10700,7 +10700,7 @@
         <w:t xml:space="preserve">Mã / demo: </w:t>
       </w:r>
       <w:r>
-        <w:t>Một sự kiện cập nhật tới hai nhóm consumer: ghi log (publish/subscribe) và gửi email bằng hai worker (work queue).</w:t>
+        <w:t>Exchange topic lookup.notify, routing key entry.&lt;quốc gia&gt;.&lt;khóa&gt;; 6 sự kiện tới log (notify.log, entry.#: publish/subscribe, nhận 6), hai worker email (notify.email, entry.#: work queue, mỗi email gửi một lần) và vn-audit (notify.vn, entry.vn.*: routing theo topic, nhận 4). Worker email-1 chậm (600 ms), email-2 nhanh (100 ms): prefetch 1 → 1 và 5 email, xong sau 0,6 giây; không giới hạn prefetch → 3 và 3, xong sau 1,8 giây.</w:t>
       </w:r>
     </w:p>
     <w:p>

</xml_diff>

<commit_message>
Publish INT1433 from source bab8dea
</commit_message>
<xml_diff>
--- a/docs/INT1433_Khung-noi-dung.docx
+++ b/docs/INT1433_Khung-noi-dung.docx
@@ -10926,7 +10926,7 @@
         <w:t xml:space="preserve">Mã / demo: </w:t>
       </w:r>
       <w:r>
-        <w:t>NetCat đọc được dữ liệu rõ của bản TCP; bản TLS (SSLServerSocket, chứng chỉ tự ký tạo bằng keytool) chỉ cho thấy byte đã mã hóa; client từ chối khi hostname không khớp.</w:t>
+        <w:t>Tap (chương trình chuyển tiếp byte, đóng vai máy trên đường truyền, port 9200) đọc được nguyên văn "hanoi" và phản hồi của bản TCP; bản TLS (SSLServerSocket, chứng chỉ tự ký tạo bằng keytool trong make-certs.sh) chỉ cho Tap thấy bản ghi TLS (16 handshake dạng rõ, 17 đã mã hóa); client TLSv1.3 nhận đúng kết quả. Client từ chối khi hostname không khớp (127.0.0.1 so với SAN localhost) và khi dùng truststore mặc định; tắt kiểm tra hostname thì kết nối 'thành công'.</w:t>
       </w:r>
     </w:p>
     <w:p>
@@ -11144,7 +11144,7 @@
         <w:t xml:space="preserve">Mã / demo: </w:t>
       </w:r>
       <w:r>
-        <w:t>API REST cập nhật từ chối token hết hạn (401), token sai chữ ký (401), token thiếu scope (403).</w:t>
+        <w:t>JWT ký RS256 bằng JDK (Signature SHA256withRSA, không thư viện); authorization server (giản lược: chỉ cấp token) và API REST chạy trong JwtDemo, API chỉ giữ khóa công khai. PUT /entries/sapa: không token 401, token hợp lệ có entries:write 200, token hết hạn 401, payload bị sửa (giữ chữ ký cũ) 401, token chỉ entries:read 403. PeekPayload giải mã header, payload chỉ bằng Base64URL.</w:t>
       </w:r>
     </w:p>
     <w:p>
@@ -11348,7 +11348,7 @@
         <w:t xml:space="preserve">Cơ chế: </w:t>
       </w:r>
       <w:r>
-        <w:t>Hình trục thời gian: ba lời gọi chặn tuần tự so với ba lời gọi bất đồng bộ song song. Hình chuỗi xử lý: supplyAsync → thenCombine → exceptionally.</w:t>
+        <w:t>Hình trục thời gian: ba lời gọi chặn tuần tự (100, 200, 300 ms nối đuôi, thread bị chặn) so với ba lời gọi không chặn gửi cùng lúc, reply xử lý qua callback, tổng bằng lời gọi chậm nhất. Hình chuỗi xử lý: lookupAsync → thenApply → exceptionally (giá trị mặc định) → thenCombine (allOf cho danh sách) → get có giới hạn thời gian.</w:t>
       </w:r>
     </w:p>
     <w:p>
@@ -11362,7 +11362,7 @@
         <w:t xml:space="preserve">Mã / demo: </w:t>
       </w:r>
       <w:r>
-        <w:t>Gọi song song dịch vụ tra cứu trên ba server; tổng thời gian bằng lời gọi chậm nhất; một server lỗi được thay bằng giá trị mặc định.</w:t>
+        <w:t>Dữ liệu chia trên ba server gRPC (ShardServers, port 9201–9203, trả lời sau 100/200/300 ms). ParallelLookup: blocking stub gọi lần lượt 671 ms, async stub (StreamObserver bọc thành CompletableFuture) gọi song song 307 ms; dừng server thứ ba: bản lần lượt thất bại UNAVAILABLE, bản song song vẫn trả kết quả ghép với giá trị mặc định từ exceptionally (214 ms). CallbackDemo: ba kênh chung một thread callback, mỗi reply một thao tác chặn 500 ms: chạy trong callback 1653 ms, chuyển sang executor riêng bằng thenApplyAsync 807 ms.</w:t>
       </w:r>
     </w:p>
     <w:p>
@@ -11376,7 +11376,7 @@
         <w:t xml:space="preserve">Lưu ý: </w:t>
       </w:r>
       <w:r>
-        <w:t>Callback chạy trên thread của thư viện: thao tác chặn trong callback làm chậm cả thư viện — chuyển việc nặng sang executor riêng.</w:t>
+        <w:t>Callback chạy trên thread của thư viện: thao tác chặn trong callback làm chậm cả thư viện — chuyển tác vụ nặng sang executor riêng.</w:t>
       </w:r>
     </w:p>
     <w:p>
@@ -11566,7 +11566,9 @@
         <w:t xml:space="preserve">Cơ chế: </w:t>
       </w:r>
       <w:r>
-        <w:t>Hình vòng lặp Selector: select() → duyệt selectedKeys (accept, read, write) → xử lý từng key mà không chặn và xóa key khỏi tập bằng iterator.remove() — không xóa thì key cũ được xử lý lại ở vòng sau. Hình ByteBuffer: position, limit, flip. Infographic so sánh thread-per-connection, virtual thread và NIO.</w:t>
+        <w:t>Hình vòng lặp Selector: channel đăng ký sự kiện (OP_ACCEPT, OP_READ) → select() trả selectedKeys → xóa key khỏi tập bằng iterator.remove() (không xóa thì key cũ được xử lý lại ở vòng sau), chuyển cho accept, read, write → quay lại select(). Hình ByteBuffer: hai lần read ghi "han" và "oi</w:t>
+        <w:br/>
+        <w:t>hu" (position 8) → flip() và lấy dòng hanoi (position 6, limit 8) → compact() giữ "hu" (position 2).</w:t>
       </w:r>
     </w:p>
     <w:p>
@@ -11580,7 +11582,11 @@
         <w:t xml:space="preserve">Mã / demo: </w:t>
       </w:r>
       <w:r>
-        <w:t>NioLookupServer một thread phục vụ 5 000 kết nối; số liệu thông lượng và độ trễ so với bản thread-per-connection và bản virtual thread.</w:t>
+        <w:t>LoadClient mở 5 000 kết nối, mỗi kết nối gửi 20 yêu cầu (client, server cùng máy 8 lõi). NioLookupServer (một vòng lặp Selector): 7 platform thread, 18 177 yêu cầu/giây; ThreadLookupServer platform: 5 007 thread, 30 793 yêu cầu/giây; virtual: 19 platform thread, 25 291 yêu cầu/giây; độ trễ p50 110–251 ms do xếp hàng. NIO tiết kiệm thread nhưng một vòng lặp chỉ dùng một lõi. SplitClient gửi "han" | "oi</w:t>
+        <w:br/>
+        <w:t>hu" | "ế</w:t>
+        <w:br/>
+        <w:t>": server chế độ trace đọc 3, 5, 4 byte, ghép đủ hai dòng.</w:t>
       </w:r>
     </w:p>
     <w:p>
@@ -11650,7 +11656,7 @@
         <w:t xml:space="preserve">Mở rộng — bài tập: </w:t>
       </w:r>
       <w:r>
-        <w:t>Thêm giới hạn độ dài dòng cho NioLookupServer: đóng kết nối gửi dòng dài hơn 1 KB.</w:t>
+        <w:t>Chia kết nối cho nhiều Selector, mỗi lõi CPU một vòng lặp, rồi đo lại thông lượng bằng LoadClient.</w:t>
       </w:r>
     </w:p>
     <w:p>
@@ -11664,7 +11670,7 @@
         <w:t xml:space="preserve">Hình: </w:t>
       </w:r>
       <w:r>
-        <w:t>so-do: vòng lặp Selector; so-do: ByteBuffer position và limit; infographic: thread-per-connection, virtual thread và NIO</w:t>
+        <w:t>so-do: vòng lặp Selector; so-do: ByteBuffer position và limit</w:t>
       </w:r>
     </w:p>
     <w:p>
@@ -11784,7 +11790,7 @@
         <w:t xml:space="preserve">Cơ chế: </w:t>
       </w:r>
       <w:r>
-        <w:t>Hình retry trong một deadline: gửi → chờ 300 ms → gửi lại cùng request ID → nhận phản hồi khớp ID. Hình at-least-once: server nhận một yêu cầu hai lần, thao tác idempotent cho kết quả như một lần. Hình phân mảnh IP: datagram lớn hơn MTU bị chia, mất một mảnh là mất cả datagram. Hình toàn vẹn: checksum 16 bit của UDP chỉ phát hiện lỗi đơn giản và có thể tắt ở IPv4; giao thức thêm CRC32 cho mỗi message, bên nhận tính lại, không khớp thì bỏ datagram.</w:t>
+        <w:t>Hình retry trong một deadline: gửi id 7 → mất → chờ 300 ms → gửi lại cùng id 7; phản hồi id 6 đến muộn bị bỏ qua; phản hồi id 7 khớp thì nhận; tối đa 3 lần gửi (0,9 giây). Hình phân mảnh IP: datagram 8 000 byte dữ liệu vượt MTU 1 500 → 6 mảnh; mất một mảnh là mất cả datagram (1% mỗi mảnh → khoảng 5,9%). Toàn vẹn (slide mã): checksum 16 bit của UDP chỉ bắt lỗi đơn giản, có thể tắt ở IPv4; message thêm CRC32, bên nhận tính lại, không khớp thì bỏ datagram. At-least-once (slide lưu ý): log server cho thấy một request ID được xử lý hai lần.</w:t>
       </w:r>
     </w:p>
     <w:p>
@@ -11798,7 +11804,7 @@
         <w:t xml:space="preserve">Mã / demo: </w:t>
       </w:r>
       <w:r>
-        <w:t>Server giả lập mất 30% datagram; client retry tối đa 3 lần với request ID, in số lần gửi của mỗi yêu cầu; phản hồi cũ đến muộn bị bỏ qua nhờ request ID.</w:t>
+        <w:t>LossyUdpServer (seed 5) bỏ 30% yêu cầu, trả lời trễ 450 ms 15%, làm hỏng một bit của phản hồi 10%. ReliableLookupClient gửi 7 yêu cầu, mỗi lần chờ 300 ms, tối đa 3 lần gửi: 13 datagram; id 2 nhận hai phản hồi sai CRC32 rồi báo lỗi sau 3 lần gửi; phản hồi trễ của id 3 bị bỏ qua khi client đang chờ id 4; log server: id 2, id 3 được xử lý hai lần.</w:t>
       </w:r>
     </w:p>
     <w:p>
@@ -11882,7 +11888,7 @@
         <w:t xml:space="preserve">Hình: </w:t>
       </w:r>
       <w:r>
-        <w:t>so-do: retry trong deadline với request ID; so-do: at-least-once và loại bỏ yêu cầu trùng; so-do: phân mảnh IP</w:t>
+        <w:t>so-do: retry trong deadline với request ID; so-do: phân mảnh IP</w:t>
       </w:r>
     </w:p>
     <w:p>
@@ -12002,7 +12008,7 @@
         <w:t xml:space="preserve">Cơ chế: </w:t>
       </w:r>
       <w:r>
-        <w:t>Hình retry với exponential backoff và jitter trên trục thời gian. Hình ba trạng thái circuit breaker: closed → open (sau N lỗi) → half-open (cho một số lời gọi thử) → closed nếu thành công, quay lại open nếu vẫn lỗi. Hình health check: endpoint /health trả trạng thái để bộ cân bằng tải quyết định.</w:t>
+        <w:t>Hình retry của ba client trên trục thời gian (server lỗi đến 1 400 ms): exponential backoff 100, 200, 400, 800 ms; không jitter thì ba client gọi cùng thời điểm, cùng ập tới lúc server hồi phục (thundering herd); full jitter rải các lần gọi. Hình ba trạng thái circuit breaker: CLOSED → OPEN (3 lỗi liên tiếp) → HALF_OPEN (hết 1 giây chờ, một lời gọi thử) → CLOSED nếu thành công, quay lại OPEN nếu vẫn lỗi. Health check (slide mã): /health trả 200 UP hoặc 503 DOWN, kiểm tra cả phần phụ thuộc, để bộ cân bằng tải quyết định.</w:t>
       </w:r>
     </w:p>
     <w:p>
@@ -12016,7 +12022,7 @@
         <w:t xml:space="preserve">Mã / demo: </w:t>
       </w:r>
       <w:r>
-        <w:t>Client tra cứu gọi server lỗi 50%: retry có backoff giảm số request; circuit breaker mở khi lỗi liên tiếp và đóng lại khi server hồi phục.</w:t>
+        <w:t>FlakyServer (REST, HttpServer của JDK) lỗi 503 trong một khoảng thời gian, /health báo UP/DOWN. CircuitBreakerDemo: gọi mỗi 400 ms, server lỗi từ giây 1,0 đến 3,4, breaker ngưỡng 3 lỗi, chờ 1 giây: mở ở giây 2,0, thử lỗi ở 3,2, thử thành công và đóng ở 4,4; 12 lời gọi, 8 request tới server, 4 bị từ chối; cột health cùng lúc. RetryStormDemo: 100 client, server lỗi 1,4 giây: chờ cố định 100 ms 1 261 request, backoff 500, backoff+jitter 647; 100 ms đông nhất sau khi hồi phục: backoff 100 request, jitter 14.</w:t>
       </w:r>
     </w:p>
     <w:p>
@@ -12100,7 +12106,7 @@
         <w:t xml:space="preserve">Hình: </w:t>
       </w:r>
       <w:r>
-        <w:t>so-do: ba trạng thái circuit breaker; so-do: retry có backoff và jitter</w:t>
+        <w:t>so-do: retry có backoff và jitter; so-do: ba trạng thái circuit breaker</w:t>
       </w:r>
     </w:p>
     <w:p>
@@ -12220,7 +12226,7 @@
         <w:t xml:space="preserve">Cơ chế: </w:t>
       </w:r>
       <w:r>
-        <w:t>Hình cảm biến → MQTT broker → dịch vụ giám sát; topic dạng phong/101/nhiet-do, ký tự đại diện + và #. Hình ba mức QoS: 0 (tối đa một lần), 1 (ít nhất một lần), 2 (đúng một lần). Infographic so sánh MQTT, CoAP, HTTP (một slide; CoAP chỉ giới thiệu).</w:t>
+        <w:t>Infographic HTTP, MQTT, CoAP (một slide; CoAP chỉ giới thiệu). Hình cảm biến → MQTT broker → dashboard, dịch vụ cảnh báo; topic phong/101/nhiet-do, ký tự đại diện + và #; retained message và last will do broker giữ và gửi. Hình ba mức QoS: 0 (PUBLISH), 1 (PUBLISH, PUBACK; mất PUBACK thì gửi lại với DUP), 2 (PUBLISH, PUBREC, PUBREL, PUBCOMP).</w:t>
       </w:r>
     </w:p>
     <w:p>
@@ -12234,7 +12240,7 @@
         <w:t xml:space="preserve">Mã / demo: </w:t>
       </w:r>
       <w:r>
-        <w:t>Cảm biến giả lập publish nhiệt độ mỗi giây tới Mosquitto (Docker); dashboard subscribe phong/+/nhiet-do; cảm biến mất kết nối → last will báo trạng thái mất kết nối. Toàn bộ demo dùng MQTT; CoAP không có demo.</w:t>
+        <w:t>Hai cảm biến giả lập (Paho) publish nhiệt độ mỗi giây, QoS 0, retained, last will offline; dashboard subscribe phong/+/nhiet-do và phong/+/trang-thai sau 2,5 giây: nhận ngay bốn message retained, rồi giá trị mới; cảm biến 101 dừng như mất điện → broker publish last will offline. AlertDemo: dịch vụ cảnh báo QoS 1, clean session false, tự gửi PUBACK; xử lý A1 rồi mất kết nối trước PUBACK → kết nối lại, broker giao lại A1 với dup=true, dịch vụ bỏ qua nhờ tập ID. Toàn bộ demo dùng MQTT; CoAP không có demo.</w:t>
       </w:r>
     </w:p>
     <w:p>
@@ -12318,7 +12324,7 @@
         <w:t xml:space="preserve">Hình: </w:t>
       </w:r>
       <w:r>
-        <w:t>so-do: thiết bị → broker → dịch vụ; so-do: ba mức QoS; infographic: MQTT, CoAP và HTTP; infographic: tổng kết chương 5</w:t>
+        <w:t>infographic: MQTT, CoAP và HTTP; so-do: thiết bị → broker → dịch vụ; so-do: ba mức QoS; infographic: tổng kết chương 5</w:t>
       </w:r>
     </w:p>
     <w:p>
@@ -28384,7 +28390,7 @@
               <w:rPr>
                 <w:sz w:val="19"/>
               </w:rPr>
-              <w:t>MQTT broker mã nguồn mở của Eclipse, dùng trong demo qua Docker.</w:t>
+              <w:t>MQTT broker mã nguồn mở của Eclipse; người học chạy bằng Docker.</w:t>
             </w:r>
           </w:p>
         </w:tc>

</xml_diff>

<commit_message>
Publish INT1433 from source e881338
</commit_message>
<xml_diff>
--- a/docs/INT1433_Khung-noi-dung.docx
+++ b/docs/INT1433_Khung-noi-dung.docx
@@ -15,7 +15,7 @@
         <w:rPr>
           <w:color w:val="BC2626"/>
         </w:rPr>
-        <w:t>Bản nội bộ để duyệt · sinh từ plan.yaml và glossary.yaml · 25/10/2026. Nhận xét bằng comment Word trực tiếp lên đoạn cần sửa.</w:t>
+        <w:t>Bản nội bộ để duyệt · sinh từ plan.yaml và glossary.yaml · 26/10/2026. Nhận xét bằng comment Word trực tiếp lên đoạn cần sửa.</w:t>
       </w:r>
     </w:p>
     <w:p>
@@ -93,7 +93,7 @@
         <w:t xml:space="preserve">Case xuyên suốt — Dịch vụ tra cứu một dòng (port 9199). </w:t>
       </w:r>
       <w:r>
-        <w:t>Client gửi một dòng là khóa cần tra, server trả một dòng là kết quả. Cùng một dịch vụ được dựng lại và nâng cấp qua các chương: socket TCP, đa luồng, UDP; lần lượt đưa ra ngoài bằng RMI, SOAP, REST, gRPC; phát sự kiện qua message broker; bảo vệ bằng TLS, JWT; tối ưu bằng lời gọi không chặn và NIO; bản UDP được bổ sung độ tin cậy.</w:t>
+        <w:t>Client gửi một dòng là khóa cần tra, server trả một dòng là kết quả. Cùng một dịch vụ được dựng lại và nâng cấp qua các chương: socket TCP, đa luồng, UDP; bảo vệ bằng TLS, JWT; tối ưu bằng lời gọi không chặn và NIO; bản UDP được bổ sung độ tin cậy. Đang thay bằng ví dụ mẫu theo từng chủ đề (quyết định 26, classic-examples.md); Chương 4 đã thay, xem case_khac.</w:t>
       </w:r>
     </w:p>
     <w:p>
@@ -969,7 +969,7 @@
               <w:rPr>
                 <w:sz w:val="19"/>
               </w:rPr>
-              <w:t>dịch vụ tra cứu qua TCP; server tra cứu phục vụ nhiều client</w:t>
+              <w:t>web server tối giản trên TCP; web server phục vụ nhiều client</w:t>
             </w:r>
           </w:p>
         </w:tc>
@@ -1129,7 +1129,7 @@
               <w:rPr>
                 <w:sz w:val="19"/>
               </w:rPr>
-              <w:t>thông báo bất đồng bộ qua message broker</w:t>
+              <w:t>xử lý đơn hàng qua message broker</w:t>
             </w:r>
           </w:p>
         </w:tc>
@@ -2198,7 +2198,7 @@
               <w:rPr>
                 <w:sz w:val="19"/>
               </w:rPr>
-              <w:t>Bài toán ứng dụng: dịch vụ tra cứu qua TCP</w:t>
+              <w:t>Bài toán ứng dụng: web server tối giản trên TCP</w:t>
             </w:r>
           </w:p>
         </w:tc>
@@ -2466,7 +2466,7 @@
               <w:rPr>
                 <w:sz w:val="19"/>
               </w:rPr>
-              <w:t>Bài toán ứng dụng: server tra cứu phục vụ nhiều client</w:t>
+              <w:t>Bài toán ứng dụng: web server phục vụ nhiều client</w:t>
             </w:r>
           </w:p>
         </w:tc>
@@ -3711,7 +3711,7 @@
               <w:rPr>
                 <w:sz w:val="19"/>
               </w:rPr>
-              <w:t>Bài toán ứng dụng: thông báo bất đồng bộ qua message broker</w:t>
+              <w:t>Bài toán ứng dụng: xử lý đơn hàng qua message broker</w:t>
             </w:r>
           </w:p>
         </w:tc>
@@ -6008,7 +6008,7 @@
         <w:t xml:space="preserve">Vấn đề: </w:t>
       </w:r>
       <w:r>
-        <w:t>Ở bài toán ứng dụng cuối Chương 1, giao thức tra cứu được thử bằng NetCat: công cụ tự mở port, chờ và thiết lập kết nối. Server Java phải tự mở port và chờ kết nối; client Java phải tự kết nối tới endpoint của server.</w:t>
+        <w:t>Ở bài toán ứng dụng cuối Chương 1, HTTP được nói bằng tay qua NetCat: công cụ tự mở port, chờ và thiết lập kết nối. Server Java phải tự mở port và chờ kết nối; client Java phải tự kết nối tới endpoint của server.</w:t>
       </w:r>
     </w:p>
     <w:p>
@@ -6022,7 +6022,7 @@
         <w:t xml:space="preserve">Mục tiêu: </w:t>
       </w:r>
       <w:r>
-        <w:t>Giải thích bắt tay ba bước qua active open và passive open; viết server và client Java tối thiểu trao đổi một dòng; chẩn đoán lỗi connection refused.</w:t>
+        <w:t>Giải thích bắt tay ba bước qua active open và passive open; viết echo server và client Java tối thiểu trao đổi một dòng; chẩn đoán lỗi connection refused.</w:t>
       </w:r>
     </w:p>
     <w:p>
@@ -6078,7 +6078,7 @@
         <w:t xml:space="preserve">Bài toán / case: </w:t>
       </w:r>
       <w:r>
-        <w:t>Dịch vụ tra cứu, bản đầu tiên: server trả lại đúng dòng nhận được</w:t>
+        <w:t>Echo server và client (dịch vụ Echo, RFC 862; chương trình đầu tiên của Stevens, Unix Network Programming)</w:t>
       </w:r>
     </w:p>
     <w:p>
@@ -6106,7 +6106,7 @@
         <w:t xml:space="preserve">Mã / demo: </w:t>
       </w:r>
       <w:r>
-        <w:t>FirstServer và FirstClient ở hai terminal trao đổi một dòng; hai đầu in local port và remote port đổi chỗ cho nhau. Chạy client khi chưa có server: ConnectException, Connection refused.</w:t>
+        <w:t>EchoServer và EchoClient ở hai terminal: client gửi hello, server gửi lại đúng dòng đó; hai đầu in local port và remote port đổi chỗ cho nhau. Chạy client khi chưa có server: ConnectException, Connection refused.</w:t>
       </w:r>
     </w:p>
     <w:p>
@@ -6176,7 +6176,7 @@
         <w:t xml:space="preserve">Mở rộng — bài tập: </w:t>
       </w:r>
       <w:r>
-        <w:t>Sửa FirstServer để in endpoint hai đầu của mỗi kết nối và phục vụ đúng ba client lần lượt rồi dừng.</w:t>
+        <w:t>Sửa EchoServer để in endpoint hai đầu của mỗi kết nối và phục vụ đúng ba client lần lượt rồi dừng.</w:t>
       </w:r>
     </w:p>
     <w:p>
@@ -6296,7 +6296,7 @@
         <w:t xml:space="preserve">Bài toán / case: </w:t>
       </w:r>
       <w:r>
-        <w:t>Client tra cứu khi server không phản hồi</w:t>
+        <w:t>Echo client có timeout khi server không phản hồi hoặc phản hồi chậm; echo client chế độ batch với half-close (Stevens, UNP mục 6.6)</w:t>
       </w:r>
     </w:p>
     <w:p>
@@ -6324,7 +6324,7 @@
         <w:t xml:space="preserve">Mã / demo: </w:t>
       </w:r>
       <w:r>
-        <w:t>TimeoutDemo: server nhận kết nối nhưng không trả lời → SocketTimeoutException đúng sau read timeout; kết nối tới địa chỉ không phản hồi → hết connect timeout. HalfCloseDemo: client gửi dữ liệu, flush, gọi shutdownOutput (shutdownOutput không flush buffer của ứng dụng), vẫn nhận được phản hồi.</w:t>
+        <w:t>TimeoutDemo: server nhận kết nối nhưng không trả lời → SocketTimeoutException đúng sau read timeout; kết nối tới địa chỉ không phản hồi → hết connect timeout. HalfCloseClient (echo client chế độ batch): gửi ba dòng, flush, gọi shutdownOutput (shutdownOutput không flush buffer của ứng dụng), vẫn nhận đủ ba dòng được gửi lại; BatchEchoServer đóng kết nối khi readLine trả null. SlowServer gửi lại mỗi giây một byte: read timeout 2 giây không hết hạn, dòng hello về sau khoảng 5 giây.</w:t>
       </w:r>
     </w:p>
     <w:p>
@@ -6394,7 +6394,7 @@
         <w:t xml:space="preserve">Mở rộng — bài tập: </w:t>
       </w:r>
       <w:r>
-        <w:t>Thêm deadline 5 giây cho mỗi yêu cầu của client tra cứu: hết hạn thì đóng kết nối và báo lỗi theo giai đoạn (kết nối, gửi, chờ phản hồi).</w:t>
+        <w:t>Thêm deadline 5 giây cho mỗi lần gọi của echo client: hết hạn thì đóng kết nối và báo lỗi theo giai đoạn (kết nối, gửi, chờ phản hồi).</w:t>
       </w:r>
     </w:p>
     <w:p>
@@ -6430,7 +6430,7 @@
         <w:pStyle w:val="Heading3"/>
       </w:pPr>
       <w:r>
-        <w:t>V10 — Bài toán ứng dụng: dịch vụ tra cứu qua TCP (8′)</w:t>
+        <w:t>V10 — Bài toán ứng dụng: web server tối giản trên TCP (8′)</w:t>
       </w:r>
     </w:p>
     <w:p>
@@ -6444,7 +6444,7 @@
         <w:t xml:space="preserve">Vấn đề: </w:t>
       </w:r>
       <w:r>
-        <w:t>Đã có kết nối, timeout và giao thức theo dòng. Ghép lại thành dịch vụ tra cứu hoàn chỉnh: server phục vụ nhiều yêu cầu liên tiếp, xử lý dòng sai định dạng và đóng kết nối đúng cách.</w:t>
+        <w:t>Đã có kết nối, timeout và HTTP nói bằng tay ở Chương 1. Ghép lại thành một web server thật: trả file theo request GET với mã trạng thái đúng, phục vụ nhiều request liên tiếp, xử lý request sai và đóng kết nối đúng cách.</w:t>
       </w:r>
     </w:p>
     <w:p>
@@ -6458,7 +6458,7 @@
         <w:t xml:space="preserve">Mục tiêu: </w:t>
       </w:r>
       <w:r>
-        <w:t>Viết trọn client và server tra cứu theo đặc tả giao thức; kiểm thử tích hợp với port 0; chỉ ra giới hạn của server tuần tự khi có client chậm.</w:t>
+        <w:t>Viết web server tối giản tuần tự (GET, 200, 404, 400, 501, persistent connection); kiểm thử tích hợp với port 0; chỉ ra giới hạn của server tuần tự khi có client chậm.</w:t>
       </w:r>
     </w:p>
     <w:p>
@@ -6500,7 +6500,7 @@
         <w:t xml:space="preserve">Dùng lại: </w:t>
       </w:r>
       <w:r>
-        <w:t>giao thức theo dòng (V06), đặc tả giao thức (V07), read timeout (V09), half-close (V09), listening socket (V08), connected socket (V08), loopback (V07)</w:t>
+        <w:t>giao thức theo dòng (V06), read timeout (V09), half-close (V09), listening socket (V08), connected socket (V08), loopback (V07)</w:t>
       </w:r>
     </w:p>
     <w:p>
@@ -6514,7 +6514,7 @@
         <w:t xml:space="preserve">Bài toán / case: </w:t>
       </w:r>
       <w:r>
-        <w:t>Dịch vụ tra cứu, bản TCP đầy đủ</w:t>
+        <w:t>Web server tối giản (Kurose &amp; Ross, Socket Programming Assignment 1 "Web Server"; Harold, Java Network Programming, ch. 9)</w:t>
       </w:r>
     </w:p>
     <w:p>
@@ -6528,7 +6528,7 @@
         <w:t xml:space="preserve">Cơ chế: </w:t>
       </w:r>
       <w:r>
-        <w:t>Sơ đồ vòng lặp server tuần tự: accept → (đọc một dòng → tra cứu → trả một dòng) lặp đến khi client đóng chiều gửi hoặc hết read timeout → đóng kết nối → accept tiếp; kết nối sau chờ trong backlog. Hình một listening socket, nhiều connected socket lần lượt: mọi kết nối cùng local port 9199, phân biệt bằng 4-tuple (địa chỉ và port hai đầu). Integration test (trên slide mã): test mở server ở 127.0.0.1 port 0, hệ điều hành cấp ephemeral port, test đọc lại số port rồi kết nối.</w:t>
+        <w:t>Sơ đồ vòng lặp server tuần tự: accept → (đọc request line và header → tìm file trong www/ → gửi status line, header, file) lặp đến khi client đóng kết nối hoặc hết read timeout → đóng kết nối → accept tiếp; kết nối sau chờ trong backlog. Hình một listening socket, nhiều connected socket lần lượt: mọi kết nối cùng local port 9199, phân biệt bằng 4-tuple (địa chỉ và port hai đầu). Integration test (trên slide mã): test mở server ở 127.0.0.1 port 0, hệ điều hành cấp ephemeral port, test đọc lại số port rồi kết nối.</w:t>
       </w:r>
     </w:p>
     <w:p>
@@ -6542,7 +6542,7 @@
         <w:t xml:space="preserve">Mã / demo: </w:t>
       </w:r>
       <w:r>
-        <w:t>LookupServer (tuần tự) và LookupClient phục vụ ba client lần lượt; integration test với port 0. Một client mở kết nối nhưng không gửi dòng: các client sau chờ đến khi read timeout của server hết hạn.</w:t>
+        <w:t>WebServer (tuần tự) phục vụ ba request curl lần lượt: / → 200 kèm HTML, /nothing.html → 404, /hello.txt → 200 (Content-Length 6); log in 4-tuple. Integration test JUnit 5 với port 0, sáu test (port 0, 200, 200 cho /, 404, 400 cho đường dẫn chứa .., 501). IdleClient mở kết nối nhưng không gửi request: curl đến sau 1 giây chờ khoảng 4 giây, đến khi read timeout của server hết hạn.</w:t>
       </w:r>
     </w:p>
     <w:p>
@@ -6598,7 +6598,7 @@
         <w:t xml:space="preserve">Mở rộng — nâng cao: </w:t>
       </w:r>
       <w:r>
-        <w:t>Đọc dòng có giới hạn: dừng ở byte thứ 257 thay vì giữ cả dòng trong bộ nhớ; Integration test cho lỗi mạng: client đóng giữa chừng, kết nối bị reset</w:t>
+        <w:t>Giới hạn độ dài request line và số header; Integration test cho lỗi mạng: client đóng giữa chừng, kết nối bị reset</w:t>
       </w:r>
     </w:p>
     <w:p>
@@ -6612,7 +6612,7 @@
         <w:t xml:space="preserve">Mở rộng — bài tập: </w:t>
       </w:r>
       <w:r>
-        <w:t>Hiện thực lệnh STATS theo đặc tả đã bổ sung ở Chương 1; viết integration test cho lệnh mới.</w:t>
+        <w:t>Thêm phương thức HEAD (status line và header như GET, không có body); viết integration test cho phương thức mới.</w:t>
       </w:r>
     </w:p>
     <w:p>
@@ -6626,7 +6626,7 @@
         <w:t xml:space="preserve">Hình: </w:t>
       </w:r>
       <w:r>
-        <w:t>so-do: vòng lặp server tuần tự; so-do: một listening socket, nhiều connected socket; anh-chup: ba terminal chạy dịch vụ</w:t>
+        <w:t>so-do: vòng lặp server tuần tự; so-do: một listening socket, nhiều connected socket</w:t>
       </w:r>
     </w:p>
     <w:p>
@@ -6732,7 +6732,7 @@
         <w:t xml:space="preserve">Bài toán / case: </w:t>
       </w:r>
       <w:r>
-        <w:t>Bộ đếm số yêu cầu của server tra cứu</w:t>
+        <w:t>Bộ đếm số request của web server (race condition theo Goetz et al., Java Concurrency in Practice, ch. 2)</w:t>
       </w:r>
     </w:p>
     <w:p>
@@ -6950,7 +6950,7 @@
         <w:t xml:space="preserve">Bài toán / case: </w:t>
       </w:r>
       <w:r>
-        <w:t>Bộ đếm an toàn; hàng đợi có giới hạn giữa thread nhận kết nối và thread xử lý</w:t>
+        <w:t>Bộ đếm an toàn; hàng đợi có giới hạn giữa thread nhận kết nối và thread xử lý (BoundedBuffer: Goetz et al., Java Concurrency in Practice, ch. 14)</w:t>
       </w:r>
     </w:p>
     <w:p>
@@ -7168,7 +7168,7 @@
         <w:t xml:space="preserve">Bài toán / case: </w:t>
       </w:r>
       <w:r>
-        <w:t>Phục vụ nhiều kết nối tra cứu với tài nguyên có giới hạn</w:t>
+        <w:t>Web server phục vụ nhiều kết nối với tài nguyên có giới hạn (Goetz et al., Java Concurrency in Practice, ch. 6, 8; JEP 444)</w:t>
       </w:r>
     </w:p>
     <w:p>
@@ -7302,7 +7302,7 @@
         <w:pStyle w:val="Heading3"/>
       </w:pPr>
       <w:r>
-        <w:t>V14 — Bài toán ứng dụng: server tra cứu phục vụ nhiều client (8′ · kết chương)</w:t>
+        <w:t>V14 — Bài toán ứng dụng: web server phục vụ nhiều client (8′ · kết chương)</w:t>
       </w:r>
     </w:p>
     <w:p>
@@ -7330,7 +7330,7 @@
         <w:t xml:space="preserve">Mục tiêu: </w:t>
       </w:r>
       <w:r>
-        <w:t>Viết server tra cứu đồng thời theo mô hình thread-per-connection; xử lý quá tải và dừng server theo graceful shutdown.</w:t>
+        <w:t>Viết web server phục vụ nhiều client theo mô hình thread-per-connection; xử lý quá tải và dừng server theo graceful shutdown.</w:t>
       </w:r>
     </w:p>
     <w:p>
@@ -7386,7 +7386,7 @@
         <w:t xml:space="preserve">Bài toán / case: </w:t>
       </w:r>
       <w:r>
-        <w:t>Dịch vụ tra cứu phục vụ nhiều client đồng thời</w:t>
+        <w:t>Web server đa luồng, nối tiếp web server tối giản (Kurose &amp; Ross, Socket Programming Assignment 1, phần đa luồng; Harold, Java Network Programming, ch. 9)</w:t>
       </w:r>
     </w:p>
     <w:p>
@@ -7414,7 +7414,7 @@
         <w:t xml:space="preserve">Mã / demo: </w:t>
       </w:r>
       <w:r>
-        <w:t>ConcurrentLookupServer: client chậm không còn chặn client khác; tạo tải 200 kết nối với pool giới hạn và với virtual thread; dừng server khi đang có kết nối chờ.</w:t>
+        <w:t>ConcurrentWebServer: client chậm không còn chặn client khác (curl đến sau nhận response sau khoảng 24 ms); tạo tải 200 kết nối, mỗi kết nối giữ 1 giây: pool 8 thread xong sau khoảng 25 giây, virtual thread sau gần 1,4 giây; dừng server khi đang có kết nối mở.</w:t>
       </w:r>
     </w:p>
     <w:p>
@@ -7484,7 +7484,7 @@
         <w:t xml:space="preserve">Mở rộng — bài tập: </w:t>
       </w:r>
       <w:r>
-        <w:t>Thêm giới hạn 100 kết nối đồng thời: kết nối thứ 101 nhận phản hồi BUSY rồi bị đóng.</w:t>
+        <w:t>Thêm giới hạn 100 kết nối đồng thời: kết nối thứ 101 nhận response 503 Service Unavailable rồi bị đóng.</w:t>
       </w:r>
     </w:p>
     <w:p>
@@ -9090,7 +9090,7 @@
         <w:t xml:space="preserve">Mục tiêu: </w:t>
       </w:r>
       <w:r>
-        <w:t>Giải thích cơ chế stub trong RPC; viết dịch vụ tra cứu bằng Java RMI và chỉ ra ranh giới lỗi của lời gọi từ xa.</w:t>
+        <w:t>Giải thích cơ chế stub trong RPC; viết ngân hàng (xem số dư) bằng Java RMI, phân biệt lỗi nghiệp vụ với lỗi mạng và chỉ ra ranh giới lỗi của lời gọi từ xa.</w:t>
       </w:r>
     </w:p>
     <w:p>
@@ -9146,7 +9146,7 @@
         <w:t xml:space="preserve">Bài toán / case: </w:t>
       </w:r>
       <w:r>
-        <w:t>Dịch vụ tra cứu qua RMI</w:t>
+        <w:t>Ngân hàng qua RMI: xem số dư tài khoản (ví dụ trong Coulouris et al., Distributed Systems)</w:t>
       </w:r>
     </w:p>
     <w:p>
@@ -9174,7 +9174,7 @@
         <w:t xml:space="preserve">Mã / demo: </w:t>
       </w:r>
       <w:r>
-        <w:t>LookupService (remote interface); LookupServer export đối tượng ở port 9199, đăng ký stub vào RMI registry (port 1099, cùng tiến trình); client tra tên, in lớp stub (proxy do JDK sinh) và endpoint trong stub, gọi lookup. CrashDemo: server trong tiến trình con, lookup mất 2 giây, tắt server sau 500 ms → UnmarshalException (server đã bắt đầu chạy lookup); gọi lại → ConnectException.</w:t>
+        <w:t>Bank (remote interface, balance ném AccountNotFoundException khi không có tài khoản); BankServer export đối tượng ở port 9199, đăng ký stub vào RMI registry (port 1099, cùng tiến trình) dưới tên Bank; BankClient tra tên, in lớp stub (proxy do JDK sinh) và endpoint trong stub; balance(1001) = 5000000, balance(9999) → AccountNotFoundException. CrashDemo: server trong tiến trình con, balance mất 2 giây, tắt server sau 500 ms → UnmarshalException (server đã bắt đầu chạy balance); gọi lại → ConnectException.</w:t>
       </w:r>
     </w:p>
     <w:p>
@@ -9244,7 +9244,7 @@
         <w:t xml:space="preserve">Mở rộng — bài tập: </w:t>
       </w:r>
       <w:r>
-        <w:t>Thêm phương thức lookupAll(List&lt;String&gt; keys) vào dịch vụ RMI; so sánh thời gian một lời gọi với nhiều lời gọi lookup.</w:t>
+        <w:t>Thêm phương thức balances(List&lt;String&gt; accountNos) vào ngân hàng RMI; so sánh thời gian một lời gọi với nhiều lời gọi balance.</w:t>
       </w:r>
     </w:p>
     <w:p>
@@ -9294,7 +9294,7 @@
         <w:t xml:space="preserve">Vấn đề: </w:t>
       </w:r>
       <w:r>
-        <w:t>Thêm thao tác cập nhật vào dịch vụ tra cứu làm phát sinh ba vấn đề: tham số được truyền thế nào, gọi lại sau lỗi mạng có làm cập nhật hai lần không, nhiều client cập nhật cùng lúc thì sao.</w:t>
+        <w:t>Thêm lệnh chuyển tiền và rút tiền vào ngân hàng làm phát sinh ba vấn đề: tham số được truyền thế nào, gọi lại sau lỗi mạng có làm tài khoản bị trừ hai lần không, nhiều client rút tiền cùng lúc thì sao.</w:t>
       </w:r>
     </w:p>
     <w:p>
@@ -9364,7 +9364,7 @@
         <w:t xml:space="preserve">Bài toán / case: </w:t>
       </w:r>
       <w:r>
-        <w:t>Dịch vụ tra cứu có thao tác cập nhật</w:t>
+        <w:t>Ngân hàng qua RMI: chuyển tiền và rút tiền (tiếp ví dụ của phần trước)</w:t>
       </w:r>
     </w:p>
     <w:p>
@@ -9378,7 +9378,7 @@
         <w:t xml:space="preserve">Cơ chế: </w:t>
       </w:r>
       <w:r>
-        <w:t>Hình truyền tham số: đối tượng Serializable được sao chép sang server; đối tượng Remote được truyền dưới dạng stub. Hình idempotency: thao tác cho cùng kết quả dù thực hiện một hay nhiều lần (tra cứu có, cộng thêm không). Hình gọi lại an toàn: client gửi update kèm idempotency key, server lưu key đã xử lý, lần gọi lại trả kết quả cũ. Hình nhiều thread của RMI cùng gọi một remote object.</w:t>
+        <w:t>Hình truyền tham số: đối tượng Serializable được sao chép sang server; đối tượng Remote được truyền dưới dạng stub. Hình idempotency: thao tác cho cùng kết quả dù thực hiện một hay nhiều lần (xem số dư, đặt hạn mức có; chuyển tiền không). Hình gọi lại an toàn: client gửi lệnh chuyển tiền kèm idempotency key, server lưu key đã xử lý, lần gọi lại trả kết quả cũ. Hình nhiều thread của RMI cùng gọi một remote object.</w:t>
       </w:r>
     </w:p>
     <w:p>
@@ -9392,7 +9392,7 @@
         <w:t xml:space="preserve">Mã / demo: </w:t>
       </w:r>
       <w:r>
-        <w:t>ParamDemo: server ghi version vào tham số Entry, client vẫn thấy version 0; client sửa value sau khi gửi, server không thấy (bản sao). RetryDemo: server mô phỏng một lần chậm (dừng 1,5 giây sau khi cập nhật), client chờ tối đa 1 giây rồi gọi lại: không có idempotency key → version 2 (áp dụng hai lần), có key → version 1. ConcurrentDemo: hai thread cùng cập nhật một khóa, mỗi thread 1 000 lần: HashMap đọc rồi ghi → version 1938, ConcurrentHashMap.compute → 2000.</w:t>
+        <w:t>ParamDemo: server ghi trạng thái DONE vào tham số Transfer, client vẫn thấy PENDING; client sửa số tiền sau khi gửi, server không thấy (bản sao). RetryDemo: server mô phỏng một lần chậm (dừng 1,5 giây sau khi chuyển tiền), client chờ tối đa 1 giây rồi gọi lại: không có idempotency key → tài khoản 1001 từ 5 000 000 còn 3 000 000 (chuyển hai lần), có key → tài khoản 1003 từ 2 000 000 còn 1 000 000. ConcurrentDemo: hai thread cùng rút tiền tài khoản 1004 (2 000 000), mỗi thread 1 000 lần × 1 000 đồng: HashMap đọc rồi ghi → còn 41 000 (mất 41 lần rút), ConcurrentHashMap.compute → 0.</w:t>
       </w:r>
     </w:p>
     <w:p>
@@ -9462,7 +9462,7 @@
         <w:t xml:space="preserve">Mở rộng — bài tập: </w:t>
       </w:r>
       <w:r>
-        <w:t>Viết test gọi update 100 lần đồng thời từ 10 client với cùng bộ idempotency key; kiểm tra mỗi key chỉ được áp dụng một lần.</w:t>
+        <w:t>Viết test gửi cùng một lệnh chuyển tiền 100 lần đồng thời từ 10 client với cùng idempotency key; kiểm tra tài khoản chỉ bị trừ một lần.</w:t>
       </w:r>
     </w:p>
     <w:p>
@@ -9512,7 +9512,7 @@
         <w:t xml:space="preserve">Vấn đề: </w:t>
       </w:r>
       <w:r>
-        <w:t>RMI chỉ dùng được khi hai đầu đều là Java. Để hệ thống viết bằng ngôn ngữ khác gọi được dịch vụ tra cứu, lời gọi cần một hợp đồng và định dạng message không phụ thuộc ngôn ngữ, truyền qua HTTP.</w:t>
+        <w:t>RMI chỉ dùng được khi hai đầu đều là Java. Để hệ thống viết bằng ngôn ngữ khác gọi được dịch vụ, lời gọi cần một hợp đồng và định dạng message không phụ thuộc ngôn ngữ, truyền qua HTTP.</w:t>
       </w:r>
     </w:p>
     <w:p>
@@ -9526,7 +9526,7 @@
         <w:t xml:space="preserve">Mục tiêu: </w:t>
       </w:r>
       <w:r>
-        <w:t>Mô tả cấu trúc SOAP message và vai trò của WSDL; gọi dịch vụ tra cứu qua SOAP và đọc request, response XML.</w:t>
+        <w:t>Mô tả cấu trúc SOAP message và vai trò của WSDL; gọi dịch vụ TempConvert qua SOAP và đọc request, response XML.</w:t>
       </w:r>
     </w:p>
     <w:p>
@@ -9582,7 +9582,7 @@
         <w:t xml:space="preserve">Bài toán / case: </w:t>
       </w:r>
       <w:r>
-        <w:t>Dịch vụ tra cứu qua SOAP</w:t>
+        <w:t>Dịch vụ đổi nhiệt độ TempConvert qua SOAP (ví dụ quen dùng trong tài liệu về web service); dịch vụ Calculator công khai viết bằng ASP.NET ở bài tập</w:t>
       </w:r>
     </w:p>
     <w:p>
@@ -9596,7 +9596,7 @@
         <w:t xml:space="preserve">Cơ chế: </w:t>
       </w:r>
       <w:r>
-        <w:t>Hình SOAP message: Envelope chứa Header và Body; Body chứa phần tử lookup với tham số key. Hình hợp đồng: WSDL mô tả thao tác, kiểu dữ liệu, endpoint; công cụ sinh stub từ WSDL cho từng ngôn ngữ.</w:t>
+        <w:t>Hình SOAP message: Envelope chứa Header và Body; Body chứa phần tử celsiusToFahrenheit với tham số celsius. Hình hợp đồng: WSDL mô tả thao tác, kiểu dữ liệu, endpoint; công cụ sinh stub từ WSDL cho từng ngôn ngữ.</w:t>
       </w:r>
     </w:p>
     <w:p>
@@ -9610,7 +9610,7 @@
         <w:t xml:space="preserve">Mã / demo: </w:t>
       </w:r>
       <w:r>
-        <w:t>Dịch vụ tra cứu công bố bằng Jakarta XML Web Services (Endpoint.publish, http://127.0.0.1:9199/lookup); lấy WSDL do Metro sinh (?wsdl) bằng curl; gửi request SOAP bằng curl và đọc response XML (đã định dạng bằng xmllint): HTTP 200, request 205 byte, response 250 byte.</w:t>
+        <w:t>Dịch vụ TempConvert (celsiusToFahrenheit, fahrenheitToCelsius) công bố bằng Jakarta XML Web Services (Endpoint.publish, http://127.0.0.1:9199/tempconvert); lấy WSDL do Metro sinh (?wsdl) bằng curl; gửi request SOAP bằng curl và đọc response XML (đã định dạng bằng xmllint): 100 độ C → 212.0, HTTP 200, request 242 byte, response 259 byte.</w:t>
       </w:r>
     </w:p>
     <w:p>
@@ -9680,7 +9680,7 @@
         <w:t xml:space="preserve">Mở rộng — bài tập: </w:t>
       </w:r>
       <w:r>
-        <w:t>Sinh client từ WSDL của dịch vụ tra cứu (wsimport hoặc công cụ tương đương) và gọi thao tác lookup.</w:t>
+        <w:t>Gọi thao tác Add của dịch vụ Calculator công khai viết bằng ASP.NET (http://www.dneonline.com/calculator.asmx) bằng curl; sinh client Java từ WSDL của dịch vụ bằng wsimport và gọi lại.</w:t>
       </w:r>
     </w:p>
     <w:p>
@@ -9744,7 +9744,7 @@
         <w:t xml:space="preserve">Mục tiêu: </w:t>
       </w:r>
       <w:r>
-        <w:t>Thiết kế API REST cho dịch vụ tra cứu; gọi API bằng HttpClient của JDK và xử lý mã trạng thái.</w:t>
+        <w:t>Thiết kế API REST theo tài nguyên (Petstore); gọi API bằng HttpClient của JDK và xử lý mã trạng thái.</w:t>
       </w:r>
     </w:p>
     <w:p>
@@ -9800,7 +9800,7 @@
         <w:t xml:space="preserve">Bài toán / case: </w:t>
       </w:r>
       <w:r>
-        <w:t>Dịch vụ tra cứu qua REST</w:t>
+        <w:t>Petstore qua REST (Swagger Petstore, ví dụ mẫu của đặc tả OpenAPI)</w:t>
       </w:r>
     </w:p>
     <w:p>
@@ -9814,7 +9814,7 @@
         <w:t xml:space="preserve">Cơ chế: </w:t>
       </w:r>
       <w:r>
-        <w:t>Bảng ánh xạ: GET /entries/{key} (tra cứu), PUT /entries/{key} (cập nhật, idempotent), DELETE /entries/{key}; mã 200, 404, 400. Hình so sánh cùng một lời gọi tra cứu bằng SOAP và bằng REST.</w:t>
+        <w:t>Bảng ánh xạ: GET /pet/{petId} (đọc), POST /pet (thêm, server cấp id, 201 kèm Location, không idempotent), PUT /pet/{petId} (thay toàn bộ, idempotent), DELETE /pet/{petId}; mã 200, 201, 204, 400, 404, 405. Hình hai cách thiết kế: SOAP quanh thao tác (TempConvert), REST quanh tài nguyên (Petstore).</w:t>
       </w:r>
     </w:p>
     <w:p>
@@ -9828,7 +9828,7 @@
         <w:t xml:space="preserve">Mã / demo: </w:t>
       </w:r>
       <w:r>
-        <w:t>Server REST tối thiểu bằng HttpServer của JDK (port 9199, /entries/{key}, JSON tự viết vì JDK chưa có thư viện JSON); client HttpClient gọi GET hanoi → 200 JSON 53 byte, GET atlantis → 404, PUT sapa hai lần → 201 rồi 200, DELETE hai lần → 204 rồi 404, POST → 405.</w:t>
+        <w:t>Server Petstore tối thiểu bằng HttpServer của JDK (port 9199, /pet và /pet/{petId}, ba trường id, name, status; JSON tự viết vì JDK chưa có thư viện JSON); client HttpClient: GET /pet/10 → 200 JSON 46 byte, /pet/99 → 404, /pet/abc → 400; POST /pet hai lần → 201 với id 11 rồi 12 (không idempotent); PUT /pet/11 hai lần → 200, 200; DELETE /pet/12 hai lần → 204 rồi 404; PATCH → 405.</w:t>
       </w:r>
     </w:p>
     <w:p>
@@ -9856,7 +9856,7 @@
         <w:t xml:space="preserve">Câu hỏi: </w:t>
       </w:r>
       <w:r>
-        <w:t>Server trả 200 kèm thân {"error": "not found"} cho khóa không tồn tại: client và cache hiểu sai điều gì? | Phương thức nào an toàn để client tự gọi lại?</w:t>
+        <w:t>Server trả 200 kèm thân {"message": "Pet not found"} cho con vật không tồn tại: client và cache hiểu sai điều gì? | Phương thức nào an toàn để client tự gọi lại?</w:t>
       </w:r>
     </w:p>
     <w:p>
@@ -9898,7 +9898,7 @@
         <w:t xml:space="preserve">Mở rộng — bài tập: </w:t>
       </w:r>
       <w:r>
-        <w:t>Thêm GET /entries?prefix=ab trả danh sách khóa có tiền tố; mô tả API bằng một tệp OpenAPI ngắn.</w:t>
+        <w:t>Thêm GET /pet/findByStatus?status=available như đặc tả Petstore (tham số truy vấn, trả mảng JSON); đối chiếu API với tệp OpenAPI của Petstore công khai (https://petstore3.swagger.io).</w:t>
       </w:r>
     </w:p>
     <w:p>
@@ -9912,7 +9912,7 @@
         <w:t xml:space="preserve">Hình: </w:t>
       </w:r>
       <w:r>
-        <w:t>so-do: ánh xạ thao tác tra cứu sang REST; infographic: SOAP và REST</w:t>
+        <w:t>so-do: ánh xạ thao tác Petstore sang REST; infographic: SOAP quanh thao tác, REST quanh tài nguyên</w:t>
       </w:r>
     </w:p>
     <w:p>
@@ -9962,7 +9962,7 @@
         <w:t xml:space="preserve">Mục tiêu: </w:t>
       </w:r>
       <w:r>
-        <w:t>Định nghĩa dịch vụ tra cứu bằng file .proto, sinh mã và gọi một RPC unary.</w:t>
+        <w:t>Đọc hợp đồng RouteGuide trong file .proto, sinh mã và gọi một RPC unary; giải thích cách Protocol Buffers mã hóa theo số trường.</w:t>
       </w:r>
     </w:p>
     <w:p>
@@ -10018,7 +10018,7 @@
         <w:t xml:space="preserve">Bài toán / case: </w:t>
       </w:r>
       <w:r>
-        <w:t>Dịch vụ tra cứu qua gRPC</w:t>
+        <w:t>RouteGuide, ví dụ mẫu của gRPC: GetFeature trả địa danh tại một điểm (tám địa danh ở Hà Nội thay dữ liệu New Jersey của bản gốc)</w:t>
       </w:r>
     </w:p>
     <w:p>
@@ -10032,7 +10032,7 @@
         <w:t xml:space="preserve">Cơ chế: </w:t>
       </w:r>
       <w:r>
-        <w:t>Hình từ hợp đồng đến lời gọi: lookup.proto → protoc sinh lớp message và stub → client gọi stub → HTTP/2 → server hiện thực dịch vụ. Hình mã hóa Protocol Buffers: trường số 1 kiểu chuỗi → tag, độ dài, byte; so sánh kích thước với JSON.</w:t>
+        <w:t>Hình từ hợp đồng đến lời gọi: route_guide.proto → protoc sinh lớp message và stub → client gọi stub → HTTP/2 → server hiện thực dịch vụ. Hình mã hóa Protocol Buffers: Point có hai trường số nguyên → tag, varint; so sánh kích thước với JSON.</w:t>
       </w:r>
     </w:p>
     <w:p>
@@ -10046,7 +10046,7 @@
         <w:t xml:space="preserve">Mã / demo: </w:t>
       </w:r>
       <w:r>
-        <w:t>Server gRPC (port 9199) và client blocking stub: hanoi → found=true, atlantis → found=false. SizeDemo in byte của LookupRequest (0a 05 68 61 6e 6f 69, 7 byte; JSON 15 byte) và LookupReply (31 so với 52 byte). CompatDemo: client cũ đọc byte của server đổi số trường → found=false, không ngoại lệ; server thêm trường số 3 → client cũ đọc đúng, bỏ qua trường lạ.</w:t>
+        <w:t>Server gRPC (port 9199) và client blocking stub: tọa độ Học viện → Feature "Học viện Công nghệ Bưu chính Viễn thông", điểm (0, 0) → name rỗng. SizeDemo in byte của Point (08 e8 dc 85 64 10 98 a9 b7 f8 03, 11 byte; JSON 45 byte) và Feature (66 so với 119 byte). CompatDemo: client cũ đọc byte của server đổi số latitude, longitude → vĩ độ 105.7871, không ngoại lệ; server thêm trường số 3 → client cũ đọc đúng, bỏ qua trường lạ.</w:t>
       </w:r>
     </w:p>
     <w:p>
@@ -10116,7 +10116,7 @@
         <w:t xml:space="preserve">Mở rộng — bài tập: </w:t>
       </w:r>
       <w:r>
-        <w:t>Thêm RPC Update(key, value) vào lookup.proto, sinh lại mã và viết test gọi Lookup sau Update.</w:t>
+        <w:t>Sinh client từ route_guide.proto bằng một ngôn ngữ khác (Python hoặc Go) và gọi GetFeature tới server Java.</w:t>
       </w:r>
     </w:p>
     <w:p>
@@ -10180,7 +10180,7 @@
         <w:t xml:space="preserve">Mục tiêu: </w:t>
       </w:r>
       <w:r>
-        <w:t>Dùng server streaming và bidirectional streaming; đặt deadline cho lời gọi và xử lý mã trạng thái gRPC.</w:t>
+        <w:t>Phân biệt bốn kiểu RPC qua RouteGuide; dùng server streaming, client streaming và bidirectional streaming; đặt deadline cho lời gọi và xử lý mã trạng thái gRPC.</w:t>
       </w:r>
     </w:p>
     <w:p>
@@ -10236,7 +10236,7 @@
         <w:t xml:space="preserve">Bài toán / case: </w:t>
       </w:r>
       <w:r>
-        <w:t>Tra cứu theo tiền tố trả kết quả dần</w:t>
+        <w:t>RouteGuide đầy đủ (ví dụ mẫu của gRPC): ListFeatures trả địa danh dần, RecordRoute nhận lộ trình, RouteChat trao đổi ghi chú</w:t>
       </w:r>
     </w:p>
     <w:p>
@@ -10264,7 +10264,7 @@
         <w:t xml:space="preserve">Mã / demo: </w:t>
       </w:r>
       <w:r>
-        <w:t>Prefix (server streaming) cho tiền tố hanoi.: 5 mục, mỗi mục server mô phỏng tốn 300 ms, client nhận dần qua Iterator; deadline 1 giây: 3 mục rồi DEADLINE_EXCEEDED, server kiểm tra isCancelled và dừng. BidiClient (LookupMany, bidirectional): 3 khóa cách nhau 300 ms, reply xen giữa các lần gửi. StatusDemo: NOT_FOUND (khóa không có), UNAVAILABLE (không có server).</w:t>
+        <w:t>ListFeatures (server streaming) cho hình chữ nhật trung tâm Hà Nội: 6 địa danh, mỗi địa danh server mô phỏng tốn 300 ms, client nhận dần qua Iterator; deadline 1 giây: 3 địa danh rồi DEADLINE_EXCEEDED, server kiểm tra isCancelled và dừng. RouteClient (async stub): RecordRoute gửi 4 điểm cách nhau 400 ms, nhận tổng kết 4 điểm, 4 địa danh, 4415 m sau khi gửi xong; RouteChat gửi 4 ghi chú, ghi chú cũ ở cùng điểm đến xen giữa các lần gửi. StatusDemo: INVALID_ARGUMENT (vĩ độ 105.7871), UNAVAILABLE (không có server).</w:t>
       </w:r>
     </w:p>
     <w:p>
@@ -10292,7 +10292,7 @@
         <w:t xml:space="preserve">Câu hỏi: </w:t>
       </w:r>
       <w:r>
-        <w:t>Tra cứu theo tiền tố trả 10 000 khóa: chọn kiểu RPC nào? | Client hết deadline và hủy lời gọi: phía server có biết để dừng xử lý không?</w:t>
+        <w:t>Liệt kê địa danh trong một vùng trả 10 000 kết quả: chọn kiểu RPC nào? | Client hết deadline và hủy lời gọi: phía server có biết để dừng xử lý không?</w:t>
       </w:r>
     </w:p>
     <w:p>
@@ -10334,7 +10334,7 @@
         <w:t xml:space="preserve">Mở rộng — bài tập: </w:t>
       </w:r>
       <w:r>
-        <w:t>Viết RPC Watch(prefix) dạng server streaming: gửi sự kiện mỗi khi một khóa có tiền tố được cập nhật.</w:t>
+        <w:t>Đặt deadline cho RecordRoute ngắn hơn thời gian gửi cả lộ trình; quan sát mã trạng thái phía client và onError phía server.</w:t>
       </w:r>
     </w:p>
     <w:p>
@@ -10384,7 +10384,7 @@
         <w:t xml:space="preserve">Vấn đề: </w:t>
       </w:r>
       <w:r>
-        <w:t>RMI, SOAP, REST, gRPC đều để bên gọi chờ bên nhận trả lời, và cần bên nhận đang chạy. Khi dịch vụ tra cứu báo cho các hệ thống khác mỗi lần dữ liệu thay đổi, bên gửi không nên chờ, cũng không nên phụ thuộc vào trạng thái của bên nhận.</w:t>
+        <w:t>RMI, SOAP, REST, gRPC đều để bên gọi chờ bên nhận trả lời, và cần bên nhận đang chạy. Khi giao một việc tốn thời gian (gửi email, xử lý ảnh), bên giao việc không nên chờ, cũng không nên phụ thuộc vào trạng thái của bên làm.</w:t>
       </w:r>
     </w:p>
     <w:p>
@@ -10454,7 +10454,7 @@
         <w:t xml:space="preserve">Bài toán / case: </w:t>
       </w:r>
       <w:r>
-        <w:t>Dịch vụ tra cứu phát sự kiện cập nhật</w:t>
+        <w:t>Work queue theo hướng dẫn chính thức của RabbitMQ (Tutorial 2: NewTask, Worker); ba loại exchange theo các ví dụ log của Tutorial 3–5</w:t>
       </w:r>
     </w:p>
     <w:p>
@@ -10468,7 +10468,7 @@
         <w:t xml:space="preserve">Cơ chế: </w:t>
       </w:r>
       <w:r>
-        <w:t>Hình producer → exchange → (binding) → queue → consumer; message nằm trong queue đến khi consumer gửi ack. Infographic ba loại exchange thường dùng: direct, fanout, topic (headers exchange ở Mở rộng).</w:t>
+        <w:t>Hình producer → exchange → (binding) → queue → consumer; message nằm trong queue đến khi consumer gửi ack. Infographic ba loại exchange thường dùng: direct (direct_logs: error, info), fanout (logs), topic (topic_logs: kern.critical khớp *.critical, kern.#, không khớp auth.*); headers exchange ở Mở rộng.</w:t>
       </w:r>
     </w:p>
     <w:p>
@@ -10482,7 +10482,7 @@
         <w:t xml:space="preserve">Mã / demo: </w:t>
       </w:r>
       <w:r>
-        <w:t>UpdatePublisher (dịch vụ tra cứu) gửi sự kiện 'updated &lt;khóa&gt;' tới exchange direct lookup.events, routing key entry.updated, binding vào queue lookup.updates; consumer đang chạy nhận ngay; consumer tắt: rabbitmqctl list_queues cho thấy 2 message chờ, consumer chạy lại nhận đủ. autoAck, consumer chết khi xử lý dalat: queue còn 0, dalat và hue mất; ack thủ công: queue còn 2, giao lại với cờ redelivered.</w:t>
+        <w:t>NewTask gửi việc (mỗi dấu chấm một giây) vào queue durable task_queue qua exchange mặc định, message persistent; Worker basicQos(1), làm xong mới ack. Worker tắt: rabbitmqctl list_queues cho thấy 2 message chờ, Worker chạy lại nhận đủ. autoAck, Worker chết khi làm việc thứ hai: queue còn 0, việc thứ hai và thứ ba mất; ack thủ công: queue còn 2, việc thứ hai giao lại với cờ redelivered, việc thứ ba chưa từng được giao.</w:t>
       </w:r>
     </w:p>
     <w:p>
@@ -10538,7 +10538,7 @@
         <w:t xml:space="preserve">Mở rộng — nâng cao: </w:t>
       </w:r>
       <w:r>
-        <w:t>Durable queue và persistent message; Dead letter exchange; Headers exchange: định tuyến theo header của message</w:t>
+        <w:t>Publisher confirm; Dead letter exchange; Headers exchange: định tuyến theo header của message</w:t>
       </w:r>
     </w:p>
     <w:p>
@@ -10552,7 +10552,7 @@
         <w:t xml:space="preserve">Mở rộng — bài tập: </w:t>
       </w:r>
       <w:r>
-        <w:t>Gửi message persistent (queue đã durable); khởi động lại RabbitMQ và kiểm tra message nào còn lại trong queue.</w:t>
+        <w:t>Chạy hai Worker cùng lúc, giao sáu việc dài ngắn khác nhau; so sánh cách broker chia việc khi có và không có basicQos(1).</w:t>
       </w:r>
     </w:p>
     <w:p>
@@ -10588,7 +10588,7 @@
         <w:pStyle w:val="Heading3"/>
       </w:pPr>
       <w:r>
-        <w:t>V29 — Bài toán ứng dụng: thông báo bất đồng bộ qua message broker (8′ · kết chương)</w:t>
+        <w:t>V29 — Bài toán ứng dụng: xử lý đơn hàng qua message broker (8′ · kết chương)</w:t>
       </w:r>
     </w:p>
     <w:p>
@@ -10602,7 +10602,7 @@
         <w:t xml:space="preserve">Vấn đề: </w:t>
       </w:r>
       <w:r>
-        <w:t>Sự kiện cập nhật của dịch vụ tra cứu cần đến nhiều hệ thống theo các cách khác nhau: chia việc cho nhiều worker, gửi cho mọi bên quan tâm, chỉ gửi theo loại khóa.</w:t>
+        <w:t>Sự kiện đặt hàng cần đến nhiều hệ thống theo các cách khác nhau: thống kê nhận mọi đơn, gửi email chia việc cho nhiều worker, kho theo vùng chỉ nhận đơn của vùng mình.</w:t>
       </w:r>
     </w:p>
     <w:p>
@@ -10672,7 +10672,7 @@
         <w:t xml:space="preserve">Bài toán / case: </w:t>
       </w:r>
       <w:r>
-        <w:t>Thông báo cập nhật của dịch vụ tra cứu</w:t>
+        <w:t>Xử lý đơn hàng hướng sự kiện (event-driven): thống kê, email xác nhận, kho Hà Nội; mẫu theo Enterprise Integration Patterns và RabbitMQ Tutorials</w:t>
       </w:r>
     </w:p>
     <w:p>
@@ -10686,7 +10686,7 @@
         <w:t xml:space="preserve">Cơ chế: </w:t>
       </w:r>
       <w:r>
-        <w:t>Hình ba mẫu giao tiếp: work queue (một queue, nhiều consumer chia việc), publish/subscribe (fanout, mỗi consumer một queue), routing theo topic (routing key dạng entry.vn.*). RPC qua AMQP chỉ nêu tên, giới thiệu ở Mở rộng.</w:t>
+        <w:t>Hình ba mẫu giao tiếp: work queue (một queue, nhiều consumer chia việc), publish/subscribe (fanout, mỗi consumer một queue), routing theo topic (routing key dạng order.hn.*). RPC qua AMQP chỉ nêu tên, giới thiệu ở Mở rộng.</w:t>
       </w:r>
     </w:p>
     <w:p>
@@ -10700,7 +10700,7 @@
         <w:t xml:space="preserve">Mã / demo: </w:t>
       </w:r>
       <w:r>
-        <w:t>Exchange topic lookup.notify, routing key entry.&lt;quốc gia&gt;.&lt;khóa&gt;; 6 sự kiện tới log (notify.log, entry.#: publish/subscribe, nhận 6), hai worker email (notify.email, entry.#: work queue, mỗi email gửi một lần) và vn-audit (notify.vn, entry.vn.*: routing theo topic, nhận 4). Worker email-1 chậm (600 ms), email-2 nhanh (100 ms): prefetch 1 → 1 và 5 email, xong sau 0,6 giây; không giới hạn prefetch → 3 và 3, xong sau 1,8 giây.</w:t>
+        <w:t>Exchange topic orders, routing key order.&lt;vùng&gt;.&lt;mã đơn&gt;; 6 đơn hàng (4 ở Hà Nội, 2 ở TP.HCM) tới analytics (orders.analytics, order.#: publish/subscribe, nhận 6), hai worker email (orders.email, order.#: work queue, mỗi email gửi một lần) và warehouse (orders.hanoi, order.hn.*: routing theo topic, nhận 4). Worker email-1 chậm (600 ms), email-2 nhanh (100 ms): prefetch 1 → 1 và 5 email, xong sau 0,6 giây; không giới hạn prefetch → 3 và 3, xong sau 1,9 giây.</w:t>
       </w:r>
     </w:p>
     <w:p>
@@ -10770,7 +10770,7 @@
         <w:t xml:space="preserve">Mở rộng — bài tập: </w:t>
       </w:r>
       <w:r>
-        <w:t>Dựng RPC qua AMQP cho thao tác tra cứu: client gửi khóa vào queue, nhận kết quả ở queue reply-to, ghép bằng correlation ID.</w:t>
+        <w:t>Dựng RPC qua AMQP theo RabbitMQ Tutorial 6: server tính số Fibonacci, client nhận kết quả ở queue reply-to, ghép bằng correlation ID.</w:t>
       </w:r>
     </w:p>
     <w:p>
@@ -10828,7 +10828,7 @@
         <w:t xml:space="preserve">Vấn đề: </w:t>
       </w:r>
       <w:r>
-        <w:t>Dữ liệu của dịch vụ tra cứu đang truyền dạng rõ: mọi máy trên đường truyền đều đọc và sửa được. Cần mã hóa đường truyền và xác thực server trước khi trao đổi.</w:t>
+        <w:t>Các chương trình ở các chương trước, từ echo server tới web server, đều truyền dữ liệu dạng rõ: mọi máy trên đường truyền đều đọc và sửa được. Cần mã hóa đường truyền và xác thực server trước khi trao đổi.</w:t>
       </w:r>
     </w:p>
     <w:p>
@@ -10842,7 +10842,7 @@
         <w:t xml:space="preserve">Mục tiêu: </w:t>
       </w:r>
       <w:r>
-        <w:t>Bật TLS cho dịch vụ tra cứu bằng keystore và truststore; giải thích handshake TLS và kiểm tra hostname.</w:t>
+        <w:t>Bật TLS cho echo server bằng keystore và truststore; giải thích handshake TLS và kiểm tra hostname; nhận ra các lỗi chứng chỉ thường gặp trên server HTTPS thật.</w:t>
       </w:r>
     </w:p>
     <w:p>
@@ -10898,7 +10898,7 @@
         <w:t xml:space="preserve">Bài toán / case: </w:t>
       </w:r>
       <w:r>
-        <w:t>Dịch vụ tra cứu qua TLS</w:t>
+        <w:t>Echo server qua TLS (chứng chỉ tự ký); chứng chỉ HTTPS thật của ptit.edu.vn và các lỗi chứng chỉ cố ý của badssl.com</w:t>
       </w:r>
     </w:p>
     <w:p>
@@ -10912,7 +10912,7 @@
         <w:t xml:space="preserve">Cơ chế: </w:t>
       </w:r>
       <w:r>
-        <w:t>Hình handshake TLS 1.3 rút gọn: ClientHello → ServerHello (thỏa thuận khóa) → server gửi chứng chỉ và Finished, đã mã hóa → client kiểm tra chuỗi tin cậy và hostname → dữ liệu ứng dụng mã hóa. Hình chuỗi tin cậy: chứng chỉ server → CA trung gian → CA gốc trong truststore.</w:t>
+        <w:t>Hình handshake TLS 1.3 rút gọn: ClientHello → ServerHello (thỏa thuận khóa) → server gửi chứng chỉ và Finished, đã mã hóa → client kiểm tra chuỗi tin cậy và hostname → dữ liệu ứng dụng mã hóa. Hình chuỗi tin cậy thật của ptit.edu.vn: *.ptit.edu.vn → GlobalSign GCC R46 AlphaSSL CA 2025 → GlobalSign Root R46 trong truststore.</w:t>
       </w:r>
     </w:p>
     <w:p>
@@ -10926,7 +10926,7 @@
         <w:t xml:space="preserve">Mã / demo: </w:t>
       </w:r>
       <w:r>
-        <w:t>Tap (chương trình chuyển tiếp byte, đóng vai máy trên đường truyền, port 9200) đọc được nguyên văn "hanoi" và phản hồi của bản TCP; bản TLS (SSLServerSocket, chứng chỉ tự ký tạo bằng keytool trong make-certs.sh) chỉ cho Tap thấy bản ghi TLS (16 handshake dạng rõ, 17 đã mã hóa); client TLSv1.3 nhận đúng kết quả. Client từ chối khi hostname không khớp (127.0.0.1 so với SAN localhost) và khi dùng truststore mặc định; tắt kiểm tra hostname thì kết nối 'thành công'.</w:t>
+        <w:t>Tap (chương trình chuyển tiếp byte, đóng vai máy trên đường truyền, port 9200) đọc được nguyên văn dòng "hello" của echo server bản rõ; bản TLS (SSLServerSocket, chứng chỉ tự ký tạo bằng keytool trong make-certs.sh) chỉ cho Tap thấy bản ghi TLS (16 handshake dạng rõ, 17 đã mã hóa); echo client TLSv1.3 nhận lại đúng dòng. TlsCheck với truststore mặc định của JDK (chạy 2026-10-26): ptit.edu.vn thành công, in chuỗi ba chứng chỉ; expired, wrong.host, self-signed, untrusted-root của badssl.com thất bại đúng nguyên nhân; tắt kiểm tra hostname thì wrong.host 'thành công'.</w:t>
       </w:r>
     </w:p>
     <w:p>
@@ -11046,7 +11046,7 @@
         <w:t xml:space="preserve">Vấn đề: </w:t>
       </w:r>
       <w:r>
-        <w:t>TLS bảo vệ đường truyền nhưng không cho biết ai đang gọi dịch vụ và người đó được làm gì. Thao tác cập nhật của dịch vụ tra cứu chỉ dành cho người có quyền.</w:t>
+        <w:t>TLS bảo vệ đường truyền nhưng không cho biết ai đang gọi dịch vụ và người đó được làm gì. Thao tác sửa dữ liệu của API, như đổi trạng thái một con vật trong Petstore, chỉ dành cho người có quyền.</w:t>
       </w:r>
     </w:p>
     <w:p>
@@ -11116,7 +11116,7 @@
         <w:t xml:space="preserve">Bài toán / case: </w:t>
       </w:r>
       <w:r>
-        <w:t>Bảo vệ API cập nhật của dịch vụ tra cứu</w:t>
+        <w:t>Petstore của phần REST với scope read:pets, write:pets theo đặc tả OpenAPI của Swagger Petstore; quy trình authorization code như nút đăng nhập bằng Google, GitHub</w:t>
       </w:r>
     </w:p>
     <w:p>
@@ -11144,7 +11144,7 @@
         <w:t xml:space="preserve">Mã / demo: </w:t>
       </w:r>
       <w:r>
-        <w:t>JWT ký RS256 bằng JDK (Signature SHA256withRSA, không thư viện); authorization server (giản lược: chỉ cấp token) và API REST chạy trong JwtDemo, API chỉ giữ khóa công khai. PUT /entries/sapa: không token 401, token hợp lệ có entries:write 200, token hết hạn 401, payload bị sửa (giữ chữ ký cũ) 401, token chỉ entries:read 403. PeekPayload giải mã header, payload chỉ bằng Base64URL.</w:t>
+        <w:t>JWT ký RS256 bằng JDK (Signature SHA256withRSA, không thư viện); authorization server (giản lược: chỉ cấp token) và API REST chạy trong JwtDemo, API chỉ giữ khóa công khai. PUT /pet/10 đổi status thành sold: không token 401, token hợp lệ có write:pets 200, token hết hạn 401, payload bị sửa (giữ chữ ký cũ) 401, token chỉ read:pets 403. PeekPayload giải mã header, payload chỉ bằng Base64URL.</w:t>
       </w:r>
     </w:p>
     <w:p>
@@ -11214,7 +11214,7 @@
         <w:t xml:space="preserve">Mở rộng — bài tập: </w:t>
       </w:r>
       <w:r>
-        <w:t>Thêm kiểm tra scope entries:write cho PUT và entries:read cho GET trong API REST.</w:t>
+        <w:t>Thêm kiểm tra scope read:pets cho request GET, như đặc tả OpenAPI của Petstore quy định.</w:t>
       </w:r>
     </w:p>
     <w:p>
@@ -11264,7 +11264,7 @@
         <w:t xml:space="preserve">Vấn đề: </w:t>
       </w:r>
       <w:r>
-        <w:t>Server tra cứu cần gọi ba dịch vụ khác cho mỗi yêu cầu; gọi tuần tự thì thời gian là tổng ba lời gọi và thread chờ suốt thời gian đó. Bài toán hiệu năng bắt đầu từ việc không để thread chờ.</w:t>
+        <w:t>Trang so sánh giá cần hỏi giá ở ba cửa hàng cho mỗi yêu cầu; gọi tuần tự thì thời gian là tổng ba lời gọi và thread chờ suốt thời gian đó. Bài toán hiệu năng bắt đầu từ việc không để thread chờ.</w:t>
       </w:r>
     </w:p>
     <w:p>
@@ -11334,7 +11334,7 @@
         <w:t xml:space="preserve">Bài toán / case: </w:t>
       </w:r>
       <w:r>
-        <w:t>Tra cứu song song trên ba server</w:t>
+        <w:t>Best price finder (Modern Java in Action, ch. 16): hỏi giá một sản phẩm ở ba cửa hàng song song, lấy giá tốt nhất, cửa hàng lỗi thì bỏ qua</w:t>
       </w:r>
     </w:p>
     <w:p>
@@ -11362,7 +11362,7 @@
         <w:t xml:space="preserve">Mã / demo: </w:t>
       </w:r>
       <w:r>
-        <w:t>Dữ liệu chia trên ba server gRPC (ShardServers, port 9201–9203, trả lời sau 100/200/300 ms). ParallelLookup: blocking stub gọi lần lượt 671 ms, async stub (StreamObserver bọc thành CompletableFuture) gọi song song 307 ms; dừng server thứ ba: bản lần lượt thất bại UNAVAILABLE, bản song song vẫn trả kết quả ghép với giá trị mặc định từ exceptionally (214 ms). CallbackDemo: ba kênh chung một thread callback, mỗi reply một thao tác chặn 500 ms: chạy trong callback 1653 ms, chuyển sang executor riêng bằng thenApplyAsync 807 ms.</w:t>
+        <w:t>Ba cửa hàng là ba server gRPC (ShopServers: BestPrice, LetsSaveBig, MyFavoriteShop ở port 9201–9203, báo giá sau 100/200/300 ms; cửa hàng chậm nhất có giá thấp nhất). BestPriceFinder với sản phẩm myPhone27S: blocking stub hỏi lần lượt 663 ms, async stub (StreamObserver bọc thành CompletableFuture) hỏi song song 324 ms, cùng chọn MyFavoriteShop 124,99; dừng cửa hàng thứ ba: bản lần lượt thất bại UNAVAILABLE, bản song song bỏ qua cửa hàng đó nhờ exceptionally và chọn LetsSaveBig 129,99 (222 ms). CallbackDemo: ba kênh chung một thread callback, mỗi báo giá một thao tác chặn 500 ms (dịch vụ giảm giá): chạy trong callback 1632 ms, chuyển sang executor riêng bằng thenApplyAsync 817 ms.</w:t>
       </w:r>
     </w:p>
     <w:p>
@@ -11432,7 +11432,7 @@
         <w:t xml:space="preserve">Mở rộng — bài tập: </w:t>
       </w:r>
       <w:r>
-        <w:t>Viết client tra cứu 100 khóa bằng async stub, giới hạn tối đa 10 lời gọi đang chạy.</w:t>
+        <w:t>Hỏi giá ở 100 cửa hàng bằng async stub, giới hạn tối đa 10 lời gọi đang chạy.</w:t>
       </w:r>
     </w:p>
     <w:p>
@@ -11496,7 +11496,7 @@
         <w:t xml:space="preserve">Mục tiêu: </w:t>
       </w:r>
       <w:r>
-        <w:t>Viết server tra cứu một thread phục vụ nhiều kết nối bằng Selector; đo thông lượng và độ trễ so với bản thread-per-connection.</w:t>
+        <w:t>Viết echo server một thread phục vụ nhiều kết nối bằng Selector; đo thông lượng và độ trễ so với bản thread-per-connection.</w:t>
       </w:r>
     </w:p>
     <w:p>
@@ -11552,7 +11552,7 @@
         <w:t xml:space="preserve">Bài toán / case: </w:t>
       </w:r>
       <w:r>
-        <w:t>Server tra cứu bằng NIO</w:t>
+        <w:t>Echo server NIO dưới tải hàng nghìn kết nối (bài toán C10K, Kegel); chargen (RFC 864) là ví dụ phụ trong README</w:t>
       </w:r>
     </w:p>
     <w:p>
@@ -11566,9 +11566,9 @@
         <w:t xml:space="preserve">Cơ chế: </w:t>
       </w:r>
       <w:r>
-        <w:t>Hình vòng lặp Selector: channel đăng ký sự kiện (OP_ACCEPT, OP_READ) → select() trả selectedKeys → xóa key khỏi tập bằng iterator.remove() (không xóa thì key cũ được xử lý lại ở vòng sau), chuyển cho accept, read, write → quay lại select(). Hình ByteBuffer: hai lần read ghi "han" và "oi</w:t>
+        <w:t>Hình vòng lặp Selector: channel đăng ký sự kiện (OP_ACCEPT, OP_READ) → select() trả selectedKeys → xóa key khỏi tập bằng iterator.remove() (không xóa thì key cũ được xử lý lại ở vòng sau), chuyển cho accept, read, write → quay lại select(). Hình ByteBuffer: hai lần read ghi "hel" và "lo</w:t>
         <w:br/>
-        <w:t>hu" (position 8) → flip() và lấy dòng hanoi (position 6, limit 8) → compact() giữ "hu" (position 2).</w:t>
+        <w:t>xi" (position 8) → flip() và lấy dòng hello (position 6, limit 8) → compact() giữ "xi" (position 2).</w:t>
       </w:r>
     </w:p>
     <w:p>
@@ -11582,11 +11582,11 @@
         <w:t xml:space="preserve">Mã / demo: </w:t>
       </w:r>
       <w:r>
-        <w:t>LoadClient mở 5 000 kết nối, mỗi kết nối gửi 20 yêu cầu (client, server cùng máy 8 lõi). NioLookupServer (một vòng lặp Selector): 7 platform thread, 18 177 yêu cầu/giây; ThreadLookupServer platform: 5 007 thread, 30 793 yêu cầu/giây; virtual: 19 platform thread, 25 291 yêu cầu/giây; độ trễ p50 110–251 ms do xếp hàng. NIO tiết kiệm thread nhưng một vòng lặp chỉ dùng một lõi. SplitClient gửi "han" | "oi</w:t>
+        <w:t>LoadClient mở 5 000 kết nối, mỗi kết nối gửi lần lượt 20 dòng và chờ dòng được gửi lại (client, server cùng máy 8 lõi). NioEchoServer (một vòng lặp Selector): 7 platform thread, 18 705 yêu cầu/giây; ThreadEchoServer platform: 5 007 thread, 34 084 yêu cầu/giây; virtual: 19 platform thread, 27 988 yêu cầu/giây; độ trễ p50 108–239 ms do xếp hàng. NIO tiết kiệm thread nhưng một vòng lặp chỉ dùng một lõi. SplitClient gửi "hel" | "lo</w:t>
         <w:br/>
-        <w:t>hu" | "ế</w:t>
+        <w:t>xi" | "n chào</w:t>
         <w:br/>
-        <w:t>": server chế độ trace đọc 3, 5, 4 byte, ghép đủ hai dòng.</w:t>
+        <w:t>": server chế độ trace đọc 3, 5, 8 byte, ghép đủ hai dòng.</w:t>
       </w:r>
     </w:p>
     <w:p>
@@ -11706,7 +11706,7 @@
         <w:t xml:space="preserve">Vấn đề: </w:t>
       </w:r>
       <w:r>
-        <w:t>Bản UDP của dịch vụ tra cứu ở Chương 3 gửi một datagram chứa khóa và chờ một datagram kết quả, giả định datagram luôn đến. Trên mạng thật, datagram có thể mất, lặp, sai thứ tự hoặc hỏng. QUIC giải quyết việc này ở tầng giao vận; giao thức tự định nghĩa trên UDP phải tự bảo đảm ở tầng ứng dụng.</w:t>
+        <w:t>Truy vấn DNS gửi tên miền trong một datagram và chờ một datagram trả lời, không có kết nối nào bảo đảm datagram đến. Trên mạng thật, datagram có thể mất, lặp, sai thứ tự hoặc hỏng. QUIC giải quyết việc này ở tầng giao vận; giao thức tự định nghĩa trên UDP phải tự bảo đảm ở tầng ứng dụng.</w:t>
       </w:r>
     </w:p>
     <w:p>
@@ -11720,7 +11720,7 @@
         <w:t xml:space="preserve">Mục tiêu: </w:t>
       </w:r>
       <w:r>
-        <w:t>Thêm timeout, retry có request ID, kiểm tra toàn vẹn bằng checksum cho tra cứu qua UDP; giải thích vì sao datagram lớn dễ mất hơn.</w:t>
+        <w:t>Thêm timeout, retry có request ID, kiểm tra toàn vẹn bằng checksum cho truy vấn kiểu DNS qua UDP; giải thích vì sao datagram lớn dễ mất hơn.</w:t>
       </w:r>
     </w:p>
     <w:p>
@@ -11776,7 +11776,7 @@
         <w:t xml:space="preserve">Bài toán / case: </w:t>
       </w:r>
       <w:r>
-        <w:t>Tra cứu UDP trên mạng mất gói</w:t>
+        <w:t>Truy vấn kiểu DNS qua UDP (ID giao dịch 16 bit, gửi lại khi hết thời gian chờ như resolver) trên server mô phỏng mất gói</w:t>
       </w:r>
     </w:p>
     <w:p>
@@ -11804,7 +11804,7 @@
         <w:t xml:space="preserve">Mã / demo: </w:t>
       </w:r>
       <w:r>
-        <w:t>LossyUdpServer (seed 5) bỏ 30% yêu cầu, trả lời trễ 450 ms 15%, làm hỏng một bit của phản hồi 10%. ReliableLookupClient gửi 7 yêu cầu, mỗi lần chờ 300 ms, tối đa 3 lần gửi: 13 datagram; id 2 nhận hai phản hồi sai CRC32 rồi báo lỗi sau 3 lần gửi; phản hồi trễ của id 3 bị bỏ qua khi client đang chờ id 4; log server: id 2, id 3 được xử lý hai lần.</w:t>
+        <w:t>LossyUdpServer (seed 5) bỏ 30% yêu cầu, trả lời trễ 450 ms 15%, làm hỏng một bit của phản hồi 10%. RetryResolver hỏi 7 tên miền (web.example, mail.example, nothing.example; trả A hoặc NXDOMAIN), mỗi lần chờ 300 ms, tối đa 3 lần gửi: 13 datagram; id 2 nhận hai phản hồi sai CRC32 rồi báo lỗi sau 3 lần gửi; phản hồi trễ của id 3 bị bỏ qua khi client đang chờ id 4; log server: id 2, id 3 được xử lý hai lần.</w:t>
       </w:r>
     </w:p>
     <w:p>
@@ -11818,7 +11818,7 @@
         <w:t xml:space="preserve">Lưu ý: </w:t>
       </w:r>
       <w:r>
-        <w:t>Retry chỉ an toàn với thao tác idempotent: tra cứu thì được, tăng bộ đếm thì server phải nhớ request ID đã xử lý.</w:t>
+        <w:t>Retry chỉ an toàn với thao tác idempotent: truy vấn tên miền thì được, tăng bộ đếm thì server phải nhớ request ID đã xử lý.</w:t>
       </w:r>
     </w:p>
     <w:p>
@@ -11874,7 +11874,7 @@
         <w:t xml:space="preserve">Mở rộng — bài tập: </w:t>
       </w:r>
       <w:r>
-        <w:t>Thêm lệnh INCR (không idempotent) vào dịch vụ UDP; server lưu request ID đã xử lý trong 30 giây để không tăng hai lần.</w:t>
+        <w:t>Thêm lệnh INCR (không idempotent, tăng bộ đếm truy vấn của một tên miền) vào server UDP; server lưu request ID đã xử lý trong 30 giây để không tăng hai lần.</w:t>
       </w:r>
     </w:p>
     <w:p>
@@ -11924,7 +11924,7 @@
         <w:t xml:space="preserve">Vấn đề: </w:t>
       </w:r>
       <w:r>
-        <w:t>Khi server tra cứu hoạt động không ổn định, client gọi lại liên tục làm server quá tải thêm. Client cần biết khi nào gọi lại, khi nào tạm ngừng gọi; server cần báo trạng thái của mình.</w:t>
+        <w:t>Khi dịch vụ phía sau (ví dụ dịch vụ thanh toán) hoạt động không ổn định, client gọi lại liên tục làm dịch vụ quá tải thêm. Client cần biết khi nào gọi lại, khi nào tạm ngừng gọi; server cần báo trạng thái của mình.</w:t>
       </w:r>
     </w:p>
     <w:p>
@@ -11938,7 +11938,7 @@
         <w:t xml:space="preserve">Mục tiêu: </w:t>
       </w:r>
       <w:r>
-        <w:t>Thêm retry có backoff và jitter, circuit breaker và health check cho client và server tra cứu.</w:t>
+        <w:t>Thêm retry có backoff và jitter, circuit breaker và health check cho client và dịch vụ thanh toán.</w:t>
       </w:r>
     </w:p>
     <w:p>
@@ -11980,7 +11980,7 @@
         <w:t xml:space="preserve">Dùng lại: </w:t>
       </w:r>
       <w:r>
-        <w:t>retry (V34), request ID (V34), idempotency (V23), deadline (V09)</w:t>
+        <w:t>retry (V34), request ID (V34), idempotency (V23), idempotency key (V23), deadline (V09)</w:t>
       </w:r>
     </w:p>
     <w:p>
@@ -11994,7 +11994,7 @@
         <w:t xml:space="preserve">Bài toán / case: </w:t>
       </w:r>
       <w:r>
-        <w:t>Client tra cứu khi server hoạt động không ổn định</w:t>
+        <w:t>Cửa hàng trực tuyến gọi dịch vụ thanh toán phía sau không ổn định; thí nghiệm thundering herd như bài Exponential Backoff And Jitter của AWS</w:t>
       </w:r>
     </w:p>
     <w:p>
@@ -12022,7 +12022,7 @@
         <w:t xml:space="preserve">Mã / demo: </w:t>
       </w:r>
       <w:r>
-        <w:t>FlakyServer (REST, HttpServer của JDK) lỗi 503 trong một khoảng thời gian, /health báo UP/DOWN. CircuitBreakerDemo: gọi mỗi 400 ms, server lỗi từ giây 1,0 đến 3,4, breaker ngưỡng 3 lỗi, chờ 1 giây: mở ở giây 2,0, thử lỗi ở 3,2, thử thành công và đóng ở 4,4; 12 lời gọi, 8 request tới server, 4 bị từ chối; cột health cùng lúc. RetryStormDemo: 100 client, server lỗi 1,4 giây: chờ cố định 100 ms 1 261 request, backoff 500, backoff+jitter 647; 100 ms đông nhất sau khi hồi phục: backoff 100 request, jitter 14.</w:t>
+        <w:t>PaymentService (POST /payments kèm Idempotency-Key, HttpServer của JDK) lỗi 503 trong một khoảng thời gian như khi hệ thống ngân hàng phía sau lỗi, /health báo UP/DOWN. CircuitBreakerDemo: gửi một thanh toán mỗi 400 ms, dịch vụ lỗi từ giây 1,0 đến 3,4, breaker ngưỡng 3 lỗi, chờ 1 giây: mở ở giây 2,0, thử lỗi ở 3,2, thử thành công và đóng ở 4,4; 12 lời gọi, 8 request tới server, 4 bị từ chối; cột health cùng lúc. RetryStormDemo: 100 client, dịch vụ lỗi 1,4 giây: chờ cố định 100 ms 1 203 request, backoff 500, backoff+jitter 646; 100 ms đông nhất sau khi hồi phục: backoff 100 request, jitter 16; cả ba lần đều tạo đúng 100 khoản thanh toán nhờ idempotency key.</w:t>
       </w:r>
     </w:p>
     <w:p>
@@ -12036,7 +12036,7 @@
         <w:t xml:space="preserve">Lưu ý: </w:t>
       </w:r>
       <w:r>
-        <w:t>Retry không có jitter làm nhiều client gọi lại cùng thời điểm (thundering herd); retry thao tác không idempotent cần request ID.</w:t>
+        <w:t>Retry không có jitter làm nhiều client gọi lại cùng thời điểm (thundering herd); retry thao tác không idempotent như thanh toán cần idempotency key.</w:t>
       </w:r>
     </w:p>
     <w:p>
@@ -15386,7 +15386,7 @@
               <w:rPr>
                 <w:sz w:val="19"/>
               </w:rPr>
-              <w:t>Cặp ký tự kết thúc dòng dùng trong HTTP/1.1 và nhiều giao thức Internet; giao thức tra cứu dùng LF.</w:t>
+              <w:t>Cặp ký tự kết thúc dòng dùng trong HTTP/1.1 và nhiều giao thức Internet; echo server theo dòng của Chương 2 dùng LF.</w:t>
             </w:r>
           </w:p>
         </w:tc>
@@ -22912,7 +22912,7 @@
               <w:rPr>
                 <w:sz w:val="19"/>
               </w:rPr>
-              <w:t>Chuỗi định danh tài nguyên, ví dụ /entries/abc.</w:t>
+              <w:t>Chuỗi định danh tài nguyên, ví dụ /pet/10.</w:t>
             </w:r>
           </w:p>
         </w:tc>

</xml_diff>

<commit_message>
Publish INT1433 from source 079a0c1
</commit_message>
<xml_diff>
--- a/docs/INT1433_Khung-noi-dung.docx
+++ b/docs/INT1433_Khung-noi-dung.docx
@@ -90,10 +90,10 @@
         <w:rPr>
           <w:b/>
         </w:rPr>
-        <w:t xml:space="preserve">Case xuyên suốt — Dịch vụ tra cứu một dòng (port 9199). </w:t>
-      </w:r>
-      <w:r>
-        <w:t>Client gửi một dòng là khóa cần tra, server trả một dòng là kết quả. Cùng một dịch vụ được dựng lại và nâng cấp qua các chương: socket TCP, đa luồng, UDP; bảo vệ bằng TLS, JWT; tối ưu bằng lời gọi không chặn và NIO; bản UDP được bổ sung độ tin cậy. Đang thay bằng ví dụ mẫu theo từng chủ đề (quyết định 26, classic-examples.md); Chương 4 đã thay, xem case_khac.</w:t>
+        <w:t xml:space="preserve">Ví dụ mẫu theo chủ đề. </w:t>
+      </w:r>
+      <w:r>
+        <w:t>Mỗi chủ đề một ví dụ kinh điển theo nguồn chuẩn (sách, RFC, hướng dẫn chính thức), không ép một ví dụ xuyên suốt (quyết định 26, classic-examples.md). Ưu tiên dịch vụ công khai thật, ptit.edu.vn khi không cần dịch vụ đặc biệt; kết quả ghi ngày chạy. Ví dụ và nguồn của từng phần ở trường case.</w:t>
       </w:r>
     </w:p>
     <w:p>
@@ -889,7 +889,7 @@
               <w:rPr>
                 <w:sz w:val="19"/>
               </w:rPr>
-              <w:t>đặc tả và thử giao thức tra cứu</w:t>
+              <w:t>nói HTTP bằng tay với NetCat</w:t>
             </w:r>
           </w:p>
         </w:tc>
@@ -1877,7 +1877,7 @@
               <w:rPr>
                 <w:sz w:val="19"/>
               </w:rPr>
-              <w:t>Bài toán ứng dụng: đặc tả và thử giao thức tra cứu</w:t>
+              <w:t>Bài toán ứng dụng: nói HTTP bằng tay với NetCat</w:t>
             </w:r>
           </w:p>
         </w:tc>
@@ -4762,7 +4762,7 @@
         <w:t xml:space="preserve">Bài toán / case: </w:t>
       </w:r>
       <w:r>
-        <w:t>Đích đến của dịch vụ tra cứu: tên miền của server và port 9199</w:t>
+        <w:t>Trình duyệt mở https://ptit.edu.vn: máy nào, chương trình nào; phân giải tên kiểu nslookup (Harold, Java Network Programming, ch. 4)</w:t>
       </w:r>
     </w:p>
     <w:p>
@@ -4776,7 +4776,7 @@
         <w:t xml:space="preserve">Cơ chế: </w:t>
       </w:r>
       <w:r>
-        <w:t>Hình phân lớp rút gọn, dưới 1 phút (đã học ở Mạng máy tính): chương trình ở tầng ứng dụng dùng dịch vụ của tầng giao vận. Hình từ tên miền đến endpoint (4 bước): chương trình có tên miền và port → resolver của hệ điều hành tra DNS → nhận danh sách địa chỉ IPv4, IPv6 → chọn một địa chỉ, ghép với port thành endpoint.</w:t>
+        <w:t>Hình phân lớp rút gọn, dưới 1 phút (đã học ở Mạng máy tính): trình duyệt và web server ở tầng ứng dụng dùng dịch vụ của tầng giao vận; port quen biết 80, 443, 53. Hình từ tên miền đến endpoint (4 bước, www.example.com port 443): chương trình có tên miền và port → resolver của hệ điều hành tra DNS → nhận danh sách địa chỉ IPv4, IPv6 → chọn một địa chỉ, ghép với port thành endpoint.</w:t>
       </w:r>
     </w:p>
     <w:p>
@@ -4790,7 +4790,7 @@
         <w:t xml:space="preserve">Mã / demo: </w:t>
       </w:r>
       <w:r>
-        <w:t>ResolveDemo: InetAddress.getAllByName("localhost") trả hai địa chỉ (IPv4, IPv6); InetSocketAddress tạo từ tên không tồn tại vẫn tạo được, isUnresolved() trả true.</w:t>
+        <w:t>ResolveDemo, bản nslookup tối giản: getAllByName cho localhost (IPv4, IPv6), ptit.edu.vn (một địa chỉ), www.google.com (nhiều địa chỉ IPv4); EndpointDemo: InetSocketAddress cho ptit.edu.vn:443, localhost:9199 (không có chương trình chờ), ptit.invalid:443 vẫn tạo được, isUnresolved() trả true.</w:t>
       </w:r>
     </w:p>
     <w:p>
@@ -4818,7 +4818,7 @@
         <w:t xml:space="preserve">Câu hỏi: </w:t>
       </w:r>
       <w:r>
-        <w:t>Phân giải tên của server thành công: điều đó có cho biết đang có chương trình chờ ở port 9199 không? | getAllByName trả về nhiều địa chỉ cho một tên: chương trình xử lý thế nào?</w:t>
+        <w:t>Phân giải tên của server thành công: điều đó có cho biết đang có chương trình chờ ở port 443 không? | getAllByName trả về nhiều địa chỉ cho một tên: chương trình xử lý thế nào?</w:t>
       </w:r>
     </w:p>
     <w:p>
@@ -4860,7 +4860,7 @@
         <w:t xml:space="preserve">Mở rộng — bài tập: </w:t>
       </w:r>
       <w:r>
-        <w:t>Viết chương trình nhận tên miền từ dòng lệnh, in mọi địa chỉ phân giải được và loại của từng địa chỉ (IPv4 hay IPv6, loopback hay không).</w:t>
+        <w:t>Hoàn thiện bản nslookup tối giản: tên không phân giải được thì in thông báo và xét tiếp tên sau; đối số là địa chỉ IP thì tra ngược ra tên bằng getCanonicalHostName.</w:t>
       </w:r>
     </w:p>
     <w:p>
@@ -5416,7 +5416,7 @@
         <w:t xml:space="preserve">Bài toán / case: </w:t>
       </w:r>
       <w:r>
-        <w:t>Yêu cầu tra cứu dạng nhị phân và dạng đối tượng</w:t>
+        <w:t>Bản ghi đo của một cảm biến (mã cảm biến, nhiệt độ, tên phòng) dạng nhị phân và dạng đối tượng (Harold, Java Network Programming, ch. 2; Java Object Serialization Specification)</w:t>
       </w:r>
     </w:p>
     <w:p>
@@ -5430,7 +5430,7 @@
         <w:t xml:space="preserve">Cơ chế: </w:t>
       </w:r>
       <w:r>
-        <w:t>Hình writeInt(9199): bốn byte theo thứ tự big-endian 00 00 23 EF; readInt đọc đúng bốn byte và ghép lại. Hình serialization: đối tượng → ObjectOutputStream (tên lớp, serialVersionUID, giá trị các trường) → byte stream → ObjectInputStream dựng một đối tượng mới.</w:t>
+        <w:t>Hình writeInt(1001): mã cảm biến thành bốn byte theo thứ tự big-endian 00 00 03 E9; readInt đọc đúng bốn byte và ghép lại. Hình serialization: đối tượng → ObjectOutputStream (tên lớp, serialVersionUID, giá trị các trường) → byte stream → ObjectInputStream dựng một đối tượng mới.</w:t>
       </w:r>
     </w:p>
     <w:p>
@@ -5444,7 +5444,7 @@
         <w:t xml:space="preserve">Mã / demo: </w:t>
       </w:r>
       <w:r>
-        <w:t>DataStreamDemo: ghi int, double, chuỗi UTF rồi đọc lại đúng thứ tự, in dãy byte dạng hex. ObjectStreamDemo: gửi một LookupRequest qua ObjectOutputStream, đọc lại; equals trả true, == trả false.</w:t>
+        <w:t>DataStreamDemo: ghi bản ghi đo 1001, 27.5, "P301" (int, double, chuỗi UTF; 18 byte) rồi đọc lại đúng thứ tự, in dãy byte dạng hex. ObjectStreamDemo: gửi một SensorReading qua ObjectOutputStream (137 byte), đọc lại; equals trả true, == trả false. WrongOrderDemo: đọc double trước int.</w:t>
       </w:r>
     </w:p>
     <w:p>
@@ -5472,7 +5472,7 @@
         <w:t xml:space="preserve">Câu hỏi: </w:t>
       </w:r>
       <w:r>
-        <w:t>writeInt(9199) ghi bao nhiêu byte, theo thứ tự nào? | Đối tượng đọc từ ObjectInputStream có phải chính đối tượng đã gửi không?</w:t>
+        <w:t>writeInt(1001) ghi bao nhiêu byte, theo thứ tự nào? | Đối tượng đọc từ ObjectInputStream có phải chính đối tượng đã gửi không?</w:t>
       </w:r>
     </w:p>
     <w:p>
@@ -5514,7 +5514,7 @@
         <w:t xml:space="preserve">Mở rộng — bài tập: </w:t>
       </w:r>
       <w:r>
-        <w:t>Thiết kế message nhị phân cho yêu cầu tra cứu (mã lệnh 1 byte, độ dài 2 byte, khóa UTF-8) bằng DataOutputStream; viết hàm đọc tương ứng và kiểm thử ghi rồi đọc lại.</w:t>
+        <w:t>Thêm thời điểm đo (long, mili giây) vào message nhị phân của bản ghi đo bằng DataOutputStream; viết hàm đọc tương ứng và kiểm thử ghi rồi đọc lại.</w:t>
       </w:r>
     </w:p>
     <w:p>
@@ -5634,7 +5634,7 @@
         <w:t xml:space="preserve">Bài toán / case: </w:t>
       </w:r>
       <w:r>
-        <w:t>Giao thức tra cứu một dòng: mỗi yêu cầu, mỗi phản hồi là một dòng UTF-8 kết thúc bằng LF</w:t>
+        <w:t>Framing theo dòng của giao thức văn bản thật: phần header của request HTTP/1.1, mỗi dòng kết thúc bằng CRLF (RFC 9112; cùng cách với SMTP, RFC 5321); tiền tố độ dài để so sánh, cùng ý với Content-Length (Kurose và Ross, mục 2.2.3)</w:t>
       </w:r>
     </w:p>
     <w:p>
@@ -5648,7 +5648,7 @@
         <w:t xml:space="preserve">Cơ chế: </w:t>
       </w:r>
       <w:r>
-        <w:t>Hình ranh giới byte và ký tự: chữ 'ổ' chiếm 3 byte UTF-8; InputStreamReader ghép byte thành ký tự theo charset. Hình hai cách framing: ký tự phân cách LF (readLine) và tiền tố độ dài (writeInt độ dài, rồi dữ liệu).</w:t>
+        <w:t>Hình ranh giới byte và ký tự: chữ 'ộ' chiếm 3 byte UTF-8; InputStreamReader ghép byte thành ký tự theo charset. Hình hai cách framing: ký tự phân cách CRLF của HTTP/1.1 (readLine) và tiền tố độ dài (writeInt độ dài, rồi dữ liệu).</w:t>
       </w:r>
     </w:p>
     <w:p>
@@ -5662,7 +5662,7 @@
         <w:t xml:space="preserve">Mã / demo: </w:t>
       </w:r>
       <w:r>
-        <w:t>Gửi chuỗi tiếng Việt qua stream: đúng khi hai đầu cùng UTF-8, sai khi một đầu dùng charset mặc định khác; đối chiếu dãy byte hai đầu. Trình bày đặc tả giao thức tra cứu.</w:t>
+        <w:t>CharsetDemo: Hà Nội qua stream đúng khi hai đầu cùng UTF-8, sai với windows-1252; LineFramingDemo: phần header của request HTTP/1.1 liền trong một khối byte, readLine tách tại CRLF đến dòng trống; LengthPrefixDemo: chữ chào, 4 ký tự, 5 byte.</w:t>
       </w:r>
     </w:p>
     <w:p>
@@ -5676,7 +5676,7 @@
         <w:t xml:space="preserve">Lưu ý: </w:t>
       </w:r>
       <w:r>
-        <w:t>Không dùng charset mặc định của hệ điều hành (Windows và Linux khác nhau); luôn chỉ định UTF-8. readLine() không giới hạn độ dài dòng — server phải tự giới hạn (bài toán ứng dụng ở Chương 2).</w:t>
+        <w:t>Không dùng charset mặc định của hệ điều hành; luôn chỉ định charset (UTF-8 cho văn bản, header HTTP chỉ dùng ASCII). readLine() không giới hạn độ dài dòng — server phải tự giới hạn, như web server trả 414 khi request line quá dài (RFC 9112; mã kiểm tra ở web server Chương 2).</w:t>
       </w:r>
     </w:p>
     <w:p>
@@ -5768,7 +5768,7 @@
         <w:pStyle w:val="Heading3"/>
       </w:pPr>
       <w:r>
-        <w:t>V07 — Bài toán ứng dụng: đặc tả và thử giao thức tra cứu (8′ · kết chương)</w:t>
+        <w:t>V07 — Bài toán ứng dụng: nói HTTP bằng tay với NetCat (8′ · kết chương)</w:t>
       </w:r>
     </w:p>
     <w:p>
@@ -5782,7 +5782,7 @@
         <w:t xml:space="preserve">Vấn đề: </w:t>
       </w:r>
       <w:r>
-        <w:t>Giao thức tra cứu mới có định dạng dòng. Để hai bên trao đổi đúng, cần đặc tả đủ: yêu cầu, phản hồi, mã lỗi, giới hạn độ dài; và cần thử trên dữ liệu thật trước khi viết chương trình.</w:t>
+        <w:t>Trình duyệt, curl và web server do những người khác nhau viết vẫn trao đổi được, vì cùng theo đặc tả HTTP/1.1 (RFC 9110, RFC 9112). Cách hiểu nhanh nhất một giao thức theo dòng là nói nó bằng tay, trước khi viết chương trình.</w:t>
       </w:r>
     </w:p>
     <w:p>
@@ -5796,7 +5796,7 @@
         <w:t xml:space="preserve">Mục tiêu: </w:t>
       </w:r>
       <w:r>
-        <w:t>Viết đặc tả giao thức tra cứu (định dạng yêu cầu, phản hồi, mã lỗi, giới hạn); thử bằng NetCat trên loopback ở cả hai vai; đọc một trao đổi HTTP/1.1 bằng curl -v như một giao thức theo dòng có thật.</w:t>
+        <w:t>Đọc định dạng message HTTP/1.1 theo RFC 9112 (request line, status line, header, dòng trống, body theo Content-Length, CRLF); nói HTTP bằng tay với NetCat ở vai client (web server thật) và vai server (curl trên loopback); đối chiếu với curl -v; nhận ra lỗi thiếu header Host.</w:t>
       </w:r>
     </w:p>
     <w:p>
@@ -5824,7 +5824,7 @@
         <w:t xml:space="preserve">Thuật ngữ: </w:t>
       </w:r>
       <w:r>
-        <w:t>CRLF, mã lỗi</w:t>
+        <w:t>CRLF, request line, status line, header Host, Content-Length</w:t>
       </w:r>
     </w:p>
     <w:p>
@@ -5852,7 +5852,7 @@
         <w:t xml:space="preserve">Bài toán / case: </w:t>
       </w:r>
       <w:r>
-        <w:t>Đặc tả và thử giao thức tra cứu khi chưa có server</w:t>
+        <w:t>Nói HTTP/1.1 bằng tay với web server ptit.edu.vn và với curl (Kurose và Ross, mục 2.2, "trying out HTTP for yourself")</w:t>
       </w:r>
     </w:p>
     <w:p>
@@ -5866,7 +5866,7 @@
         <w:t xml:space="preserve">Cơ chế: </w:t>
       </w:r>
       <w:r>
-        <w:t>Hình đặc tả: yêu cầu là một dòng chứa khóa; phản hồi là một dòng OK &lt;giá trị&gt;, NOTFOUND hoặc ERR &lt;lý do&gt;; mỗi dòng tối đa 256 byte, kết thúc bằng LF. Hình bố trí thử: hai NetCat trên loopback, một bên lắng nghe ở port 9199, bên kia gửi dòng. Hình đối chiếu: request và response HTTP/1.1 do curl -v in ra — mỗi header là một dòng kết thúc bằng CRLF; chỉ để thấy một giao thức theo dòng có thật, HTTP học ở các chương sau.</w:t>
+        <w:t>Hình đặc tả: request và response HTTP/1.1 thật của ptit.edu.vn — request line, header, dòng trống; status line 301, header, dòng trống, body 178 byte theo Content-Length; mỗi dòng kết thúc bằng CRLF; HTTP/1.1 bắt buộc header Host. Hình bố trí thử: vai client (NetCat tới ptit.edu.vn:80), vai server (curl tới NetCat lắng nghe ở 127.0.0.1:9199, loopback).</w:t>
       </w:r>
     </w:p>
     <w:p>
@@ -5880,7 +5880,7 @@
         <w:t xml:space="preserve">Mã / demo: </w:t>
       </w:r>
       <w:r>
-        <w:t>Công cụ NetCat (bản Java cung cấp sẵn, chạy trên mọi hệ điều hành) ở hai terminal: một bên lắng nghe ở 127.0.0.1:9199, bên kia gửi các dòng theo đặc tả, kể cả dòng rỗng và dòng quá dài; curl -v http://example.com in một trao đổi HTTP/1.1 (http, không phải https: không có TLS, không thương lượng HTTP/2).</w:t>
+        <w:t>Công cụ NetCat (bản Java cung cấp sẵn, có tùy chọn --crlf): vai client gõ GET tới ptit.edu.vn port 80, nhận 301 kèm Location; vai server đọc request của curl -i và gõ response 200 OK, Content-Length 7; curl -v http://ptit.edu.vn in cùng trao đổi (http, không phải https: không có TLS); request thiếu Host nhận 400 Bad Request.</w:t>
       </w:r>
     </w:p>
     <w:p>
@@ -5894,7 +5894,7 @@
         <w:t xml:space="preserve">Lưu ý: </w:t>
       </w:r>
       <w:r>
-        <w:t>HTTP/1.1 kết thúc dòng bằng CRLF, giao thức tra cứu dùng LF: đặc tả phải nói rõ ký tự kết thúc dòng, và bên nhận chấp nhận cả hai hay chỉ một.</w:t>
+        <w:t>HTTP/1.1 bắt buộc header Host, thiếu thì server trả 400. Bên gửi gửi đúng CRLF; RFC 9112 cho phép bên nhận chấp nhận cả LF, nhưng chương trình tự tách dòng chỉ theo CRLF thì không. Content-Length đếm byte, kể cả CRLF trong body.</w:t>
       </w:r>
     </w:p>
     <w:p>
@@ -5908,7 +5908,7 @@
         <w:t xml:space="preserve">Câu hỏi: </w:t>
       </w:r>
       <w:r>
-        <w:t>Dòng gửi tới dài hơn giới hạn trong đặc tả: server phản hồi thế nào? | Mỗi header trong output của curl -v kết thúc bằng ký tự nào?</w:t>
+        <w:t>Request HTTP/1.1 thiếu header Host: server trả lời thế nào? | Theo đặc tả HTTP/1.1, mỗi dòng header kết thúc bằng gì?</w:t>
       </w:r>
     </w:p>
     <w:p>
@@ -5936,7 +5936,7 @@
         <w:t xml:space="preserve">Mở rộng — nâng cao: </w:t>
       </w:r>
       <w:r>
-        <w:t>RFC: cách các giao thức Internet được đặc tả (ví dụ RFC 9112 cho HTTP/1.1); Kiểm thử giao thức bằng bộ dữ liệu mẫu</w:t>
+        <w:t>RFC 9112: cách HTTP/1.1 được đặc tả; Nói một giao thức theo dòng khác bằng NetCat: SMTP với HELO, MAIL FROM (RFC 5321)</w:t>
       </w:r>
     </w:p>
     <w:p>
@@ -5950,7 +5950,7 @@
         <w:t xml:space="preserve">Mở rộng — bài tập: </w:t>
       </w:r>
       <w:r>
-        <w:t>Bổ sung lệnh STATS vào đặc tả: cú pháp, phản hồi, mã lỗi; thử bằng NetCat.</w:t>
+        <w:t>Gửi request HEAD bằng NetCat tới một web server, đối chiếu response với request GET theo RFC 9110.</w:t>
       </w:r>
     </w:p>
     <w:p>
@@ -5964,7 +5964,7 @@
         <w:t xml:space="preserve">Hình: </w:t>
       </w:r>
       <w:r>
-        <w:t>so-do: đặc tả giao thức tra cứu; anh-chup: hai terminal NetCat; anh-chup: curl -v; infographic: tổng kết chương 1</w:t>
+        <w:t>so-do: message HTTP/1.1 theo RFC 9112; so-do: hai vai của NetCat; anh-chup: NetCat vai client và vai server; anh-chup: curl -v; infographic: tổng kết chương 1</w:t>
       </w:r>
     </w:p>
     <w:p>
@@ -7542,7 +7542,7 @@
         <w:t xml:space="preserve">Vấn đề: </w:t>
       </w:r>
       <w:r>
-        <w:t>Chương 2 dùng TCP: thiết lập kết nối trước, rồi trao đổi byte tin cậy. Tra cứu chỉ gồm một yêu cầu ngắn và một phản hồi ngắn; UDP gửi ngay datagram mà không thiết lập kết nối, đổi lại không bảo đảm datagram đến nơi.</w:t>
+        <w:t>Chương 2 dùng TCP: thiết lập kết nối trước, rồi trao đổi byte tin cậy. Đo độ trễ bằng ping, hỏi giờ, truy vấn DNS chỉ gồm một gói nhỏ đi và về; UDP gửi ngay datagram mà không thiết lập kết nối, đổi lại không bảo đảm datagram đến nơi.</w:t>
       </w:r>
     </w:p>
     <w:p>
@@ -7612,7 +7612,7 @@
         <w:t xml:space="preserve">Bài toán / case: </w:t>
       </w:r>
       <w:r>
-        <w:t>Dịch vụ tra cứu, bản UDP</w:t>
+        <w:t>UDP Pinger (Kurose và Ross, Socket Programming Assignment 2); một truy vấn SNTP 48 byte tới time server thật (RFC 4330)</w:t>
       </w:r>
     </w:p>
     <w:p>
@@ -7626,7 +7626,7 @@
         <w:t xml:space="preserve">Cơ chế: </w:t>
       </w:r>
       <w:r>
-        <w:t>Hình datagram: mỗi lần send là một datagram độc lập, giữ ranh giới; header UDP 8 byte (port nguồn, port đích, độ dài, checksum). Hình cắt ngắn: buffer nhận 16 byte, datagram 40 byte → phần dư bị bỏ, không có lỗi. Hình connected UDP socket: connect() trên DatagramSocket chỉ đặt bộ lọc endpoint ở hệ điều hành — không gửi gói nào, không có bắt tay; UDP vẫn không kết nối.</w:t>
+        <w:t>Hình datagram: mỗi lần send là một datagram độc lập, giữ ranh giới; header UDP 8 byte (port nguồn, port đích, độ dài, checksum). Hình cắt ngắn: reply SNTP 48 byte, buffer nhận 16 byte → 32 byte bị bỏ, kể cả thời gian ở byte 40–47, không có lỗi. Hình connected UDP socket: connect() trên DatagramSocket chỉ đặt bộ lọc endpoint ở hệ điều hành — không gửi gói nào, không có bắt tay; UDP vẫn không kết nối.</w:t>
       </w:r>
     </w:p>
     <w:p>
@@ -7640,7 +7640,7 @@
         <w:t xml:space="preserve">Mã / demo: </w:t>
       </w:r>
       <w:r>
-        <w:t>UdpLookupServer và UdpLookupClient tra cứu qua datagram; hai lần send liền nhau cho hai lần receive riêng; connect() trên DatagramSocket tới địa chỉ không ai trả lời vẫn trả về ngay, và connected UDP socket bỏ qua datagram từ endpoint khác; buffer 16 byte làm phản hồi bị cắt.</w:t>
+        <w:t>PingServer (port 12000, mô phỏng mất datagram như bài gốc, seed cố định) và PingClient (10 ping, timeout 1 giây, in RTT hoặc request timed out); hai lần send liền nhau cho hai lần receive riêng; connect() trên DatagramSocket tới địa chỉ không ai trả lời vẫn trả về ngay, và connected UDP socket bỏ qua datagram từ endpoint khác; SntpClient tới time.google.com: buffer 48 byte đọc được thời gian, buffer 16 byte mất phần thời gian.</w:t>
       </w:r>
     </w:p>
     <w:p>
@@ -7654,7 +7654,7 @@
         <w:t xml:space="preserve">Lưu ý: </w:t>
       </w:r>
       <w:r>
-        <w:t>receive() không báo khi datagram bị cắt — buffer phải đủ cho datagram lớn nhất mà giao thức cho phép; ký tự UTF-8 bị cắt giữa chừng thành ký tự lỗi. (Bỏ ý setLength của bản khung: với JDK 21, dùng lại một DatagramPacket không làm lần nhận sau bị cắt — đã chạy thử.)</w:t>
+        <w:t>receive() không báo khi datagram bị cắt — buffer phải đủ cho datagram mà giao thức quy định (SNTP: 48 byte); chương trình chỉ biết reply thiếu nhờ đặc tả. (Bỏ ý setLength của bản khung: với JDK 21, dùng lại một DatagramPacket không làm lần nhận sau bị cắt — đã chạy thử.)</w:t>
       </w:r>
     </w:p>
     <w:p>
@@ -7696,7 +7696,7 @@
         <w:t xml:space="preserve">Mở rộng — nâng cao: </w:t>
       </w:r>
       <w:r>
-        <w:t>Kích thước datagram an toàn và MTU; Độ tin cậy ở tầng ứng dụng cho bản UDP (Chương 5)</w:t>
+        <w:t>Kích thước datagram an toàn và MTU; Độ tin cậy ở tầng ứng dụng trên UDP (Chương 5)</w:t>
       </w:r>
     </w:p>
     <w:p>
@@ -7710,7 +7710,7 @@
         <w:t xml:space="preserve">Mở rộng — bài tập: </w:t>
       </w:r>
       <w:r>
-        <w:t>Thêm trường phiên bản 1 byte vào giao thức tra cứu UDP; server từ chối datagram sai phiên bản bằng phản hồi lỗi.</w:t>
+        <w:t>Bổ sung cho client ping phần thống kê như lệnh ping: RTT nhỏ nhất, lớn nhất, trung bình và tỉ lệ mất gói (bài tập tùy chọn của UDP Pinger).</w:t>
       </w:r>
     </w:p>
     <w:p>
@@ -15254,7 +15254,7 @@
               <w:rPr>
                 <w:sz w:val="19"/>
               </w:rPr>
-              <w:t>Giao thức ứng dụng trong đó mỗi message là một dòng văn bản kết thúc bằng LF.</w:t>
+              <w:t>Giao thức ứng dụng trao đổi dữ liệu thành các dòng văn bản, mỗi dòng kết thúc bằng ký tự quy ước (CRLF trong HTTP/1.1 và SMTP).</w:t>
             </w:r>
           </w:p>
         </w:tc>
@@ -15320,7 +15320,7 @@
               <w:rPr>
                 <w:sz w:val="19"/>
               </w:rPr>
-              <w:t>Tài liệu quy định định dạng yêu cầu, phản hồi, mã lỗi và giới hạn của một giao thức, đủ để hai bên hiện thực độc lập.</w:t>
+              <w:t>Tài liệu quy định định dạng message, ký tự kết thúc dòng, quy tắc bắt buộc và mã lỗi của một giao thức, đủ để hai bên hiện thực độc lập (như RFC 9112 cho HTTP/1.1).</w:t>
             </w:r>
           </w:p>
         </w:tc>

</xml_diff>

<commit_message>
Publish INT1433 from source 81d58de
</commit_message>
<xml_diff>
--- a/docs/INT1433_Khung-noi-dung.docx
+++ b/docs/INT1433_Khung-noi-dung.docx
@@ -4662,7 +4662,7 @@
         <w:t xml:space="preserve">Mục tiêu: </w:t>
       </w:r>
       <w:r>
-        <w:t>Nêu được bài toán học phần giải quyết, năm chương và năng lực mỗi chương, case xuyên suốt, cách học và đánh giá.</w:t>
+        <w:t>Nêu được luận điểm của môn (mọi hệ thống là các tiến trình trao đổi dữ liệu theo giao thức), đóng góp của môn cho bốn vai trò nghề, năm chương, cách học và cách đánh giá qua dự án cá nhân.</w:t>
       </w:r>
     </w:p>
     <w:p>
@@ -4676,7 +4676,7 @@
         <w:t xml:space="preserve">Hình: </w:t>
       </w:r>
       <w:r>
-        <w:t>infographic: năm chương và case xuyên suốt</w:t>
+        <w:t>so-do: các hệ thống thật là tiến trình trao đổi dữ liệu theo giao thức; infographic: đóng góp cho bốn vai trò nghề; infographic: năm chương của học phần; so-do: cách học và dự án cá nhân</w:t>
       </w:r>
     </w:p>
     <w:p>
@@ -12368,7 +12368,7 @@
         <w:t xml:space="preserve">Mục tiêu: </w:t>
       </w:r>
       <w:r>
-        <w:t>Nêu được các phiên bản của dịch vụ tra cứu qua năm chương, hướng học tiếp và yêu cầu dự án cá nhân.</w:t>
+        <w:t>Nêu được năng lực đạt được sau năm chương, theo chương và theo vai trò nghề, và các hướng chuyên sâu theo thực tế nghề.</w:t>
       </w:r>
     </w:p>
     <w:p>
@@ -12382,7 +12382,7 @@
         <w:t xml:space="preserve">Hình: </w:t>
       </w:r>
       <w:r>
-        <w:t>infographic: các phiên bản của dịch vụ tra cứu</w:t>
+        <w:t>infographic: năng lực sau năm chương; infographic: năng lực theo bốn vai trò nghề; infographic: hướng chuyên sâu theo thực tế nghề</w:t>
       </w:r>
     </w:p>
     <w:p>

</xml_diff>